<commit_message>
Updated project document again.
</commit_message>
<xml_diff>
--- a/ProjectDocumentRubric.docx
+++ b/ProjectDocumentRubric.docx
@@ -1,17 +1,18 @@
 
 <file path=word/document.xml><?xml version="1.0" encoding="utf-8"?>
-<w:document xmlns:wpc="http://schemas.microsoft.com/office/word/2010/wordprocessingCanvas" xmlns:cx="http://schemas.microsoft.com/office/drawing/2014/chartex" xmlns:cx1="http://schemas.microsoft.com/office/drawing/2015/9/8/chartex" xmlns:cx2="http://schemas.microsoft.com/office/drawing/2015/10/21/chartex" xmlns:cx3="http://schemas.microsoft.com/office/drawing/2016/5/9/chartex" xmlns:cx4="http://schemas.microsoft.com/office/drawing/2016/5/10/chartex" xmlns:cx5="http://schemas.microsoft.com/office/drawing/2016/5/11/chartex" xmlns:cx6="http://schemas.microsoft.com/office/drawing/2016/5/12/chartex" xmlns:cx7="http://schemas.microsoft.com/office/drawing/2016/5/13/chartex" xmlns:cx8="http://schemas.microsoft.com/office/drawing/2016/5/14/chartex" xmlns:mc="http://schemas.openxmlformats.org/markup-compatibility/2006" xmlns:aink="http://schemas.microsoft.com/office/drawing/2016/ink" xmlns:am3d="http://schemas.microsoft.com/office/drawing/2017/model3d" xmlns:o="urn:schemas-microsoft-com:office:office" xmlns:oel="http://schemas.microsoft.com/office/2019/extlst" xmlns:r="http://schemas.openxmlformats.org/officeDocument/2006/relationships" xmlns:m="http://schemas.openxmlformats.org/officeDocument/2006/math" xmlns:v="urn:schemas-microsoft-com:vml" xmlns:wp14="http://schemas.microsoft.com/office/word/2010/wordprocessingDrawing" xmlns:wp="http://schemas.openxmlformats.org/drawingml/2006/wordprocessingDrawing" xmlns:w10="urn:schemas-microsoft-com:office:word" xmlns:w="http://schemas.openxmlformats.org/wordprocessingml/2006/main" xmlns:w14="http://schemas.microsoft.com/office/word/2010/wordml" xmlns:w15="http://schemas.microsoft.com/office/word/2012/wordml" xmlns:w16cex="http://schemas.microsoft.com/office/word/2018/wordml/cex" xmlns:w16cid="http://schemas.microsoft.com/office/word/2016/wordml/cid" xmlns:w16="http://schemas.microsoft.com/office/word/2018/wordml" xmlns:w16du="http://schemas.microsoft.com/office/word/2023/wordml/word16du" xmlns:w16sdtdh="http://schemas.microsoft.com/office/word/2020/wordml/sdtdatahash" xmlns:w16sdtfl="http://schemas.microsoft.com/office/word/2024/wordml/sdtformatlock" xmlns:w16se="http://schemas.microsoft.com/office/word/2015/wordml/symex" xmlns:wpg="http://schemas.microsoft.com/office/word/2010/wordprocessingGroup" xmlns:wpi="http://schemas.microsoft.com/office/word/2010/wordprocessingInk" xmlns:wne="http://schemas.microsoft.com/office/word/2006/wordml" xmlns:wps="http://schemas.microsoft.com/office/word/2010/wordprocessingShape" mc:Ignorable="w14 w15 w16se w16cid w16 w16cex w16sdtdh w16sdtfl w16du wp14">
+<w:document xmlns:o="urn:schemas-microsoft-com:office:office" xmlns:r="http://schemas.openxmlformats.org/officeDocument/2006/relationships" xmlns:v="urn:schemas-microsoft-com:vml" xmlns:w="http://schemas.openxmlformats.org/wordprocessingml/2006/main" xmlns:w10="urn:schemas-microsoft-com:office:word" xmlns:wp="http://schemas.openxmlformats.org/drawingml/2006/wordprocessingDrawing" xmlns:wps="http://schemas.microsoft.com/office/word/2010/wordprocessingShape" xmlns:wpg="http://schemas.microsoft.com/office/word/2010/wordprocessingGroup" xmlns:mc="http://schemas.openxmlformats.org/markup-compatibility/2006" xmlns:wp14="http://schemas.microsoft.com/office/word/2010/wordprocessingDrawing" xmlns:w14="http://schemas.microsoft.com/office/word/2010/wordml" xmlns:w15="http://schemas.microsoft.com/office/word/2012/wordml" mc:Ignorable="w14 wp14 w15">
   <w:body>
     <w:p>
       <w:pPr>
-        <w:spacing w:line="240" w:lineRule="auto"/>
-        <w:rPr>
-          <w:rFonts w:ascii="Times New Roman" w:hAnsi="Times New Roman" w:cs="Times New Roman"/>
-        </w:rPr>
-      </w:pPr>
-      <w:r>
-        <w:rPr>
-          <w:rFonts w:ascii="Times New Roman" w:hAnsi="Times New Roman" w:cs="Times New Roman"/>
+        <w:pStyle w:val="Normal"/>
+        <w:spacing w:lineRule="auto" w:line="240"/>
+        <w:rPr>
+          <w:rFonts w:ascii="Times New Roman" w:hAnsi="Times New Roman"/>
+        </w:rPr>
+      </w:pPr>
+      <w:r>
+        <w:rPr>
+          <w:rFonts w:cs="Times New Roman" w:ascii="Times New Roman" w:hAnsi="Times New Roman"/>
           <w:b/>
           <w:bCs/>
         </w:rPr>
@@ -19,21 +20,22 @@
       </w:r>
       <w:r>
         <w:rPr>
-          <w:rFonts w:ascii="Times New Roman" w:hAnsi="Times New Roman" w:cs="Times New Roman"/>
+          <w:rFonts w:cs="Times New Roman" w:ascii="Times New Roman" w:hAnsi="Times New Roman"/>
         </w:rPr>
         <w:t xml:space="preserve"> Syntax Error</w:t>
       </w:r>
     </w:p>
     <w:p>
       <w:pPr>
-        <w:spacing w:line="240" w:lineRule="auto"/>
-        <w:rPr>
-          <w:rFonts w:ascii="Times New Roman" w:hAnsi="Times New Roman" w:cs="Times New Roman"/>
-        </w:rPr>
-      </w:pPr>
-      <w:r>
-        <w:rPr>
-          <w:rFonts w:ascii="Times New Roman" w:hAnsi="Times New Roman" w:cs="Times New Roman"/>
+        <w:pStyle w:val="Normal"/>
+        <w:spacing w:lineRule="auto" w:line="240"/>
+        <w:rPr>
+          <w:rFonts w:ascii="Times New Roman" w:hAnsi="Times New Roman"/>
+        </w:rPr>
+      </w:pPr>
+      <w:r>
+        <w:rPr>
+          <w:rFonts w:cs="Times New Roman" w:ascii="Times New Roman" w:hAnsi="Times New Roman"/>
           <w:b/>
           <w:bCs/>
         </w:rPr>
@@ -41,21 +43,22 @@
       </w:r>
       <w:r>
         <w:rPr>
-          <w:rFonts w:ascii="Times New Roman" w:hAnsi="Times New Roman" w:cs="Times New Roman"/>
+          <w:rFonts w:cs="Times New Roman" w:ascii="Times New Roman" w:hAnsi="Times New Roman"/>
         </w:rPr>
         <w:t xml:space="preserve"> Austin Chart, Seth Cooper</w:t>
       </w:r>
     </w:p>
     <w:p>
       <w:pPr>
-        <w:spacing w:line="240" w:lineRule="auto"/>
-        <w:rPr>
-          <w:rFonts w:ascii="Times New Roman" w:hAnsi="Times New Roman" w:cs="Times New Roman"/>
-        </w:rPr>
-      </w:pPr>
-      <w:r>
-        <w:rPr>
-          <w:rFonts w:ascii="Times New Roman" w:hAnsi="Times New Roman" w:cs="Times New Roman"/>
+        <w:pStyle w:val="Normal"/>
+        <w:spacing w:lineRule="auto" w:line="240"/>
+        <w:rPr>
+          <w:rFonts w:ascii="Times New Roman" w:hAnsi="Times New Roman"/>
+        </w:rPr>
+      </w:pPr>
+      <w:r>
+        <w:rPr>
+          <w:rFonts w:cs="Times New Roman" w:ascii="Times New Roman" w:hAnsi="Times New Roman"/>
           <w:b/>
           <w:bCs/>
         </w:rPr>
@@ -63,21 +66,22 @@
       </w:r>
       <w:r>
         <w:rPr>
-          <w:rFonts w:ascii="Times New Roman" w:hAnsi="Times New Roman" w:cs="Times New Roman"/>
+          <w:rFonts w:cs="Times New Roman" w:ascii="Times New Roman" w:hAnsi="Times New Roman"/>
         </w:rPr>
         <w:t xml:space="preserve"> Lost &amp; Alone</w:t>
       </w:r>
     </w:p>
     <w:p>
       <w:pPr>
-        <w:spacing w:line="240" w:lineRule="auto"/>
-        <w:rPr>
-          <w:rFonts w:ascii="Times New Roman" w:hAnsi="Times New Roman" w:cs="Times New Roman"/>
-        </w:rPr>
-      </w:pPr>
-      <w:r>
-        <w:rPr>
-          <w:rFonts w:ascii="Times New Roman" w:hAnsi="Times New Roman" w:cs="Times New Roman"/>
+        <w:pStyle w:val="Normal"/>
+        <w:spacing w:lineRule="auto" w:line="240"/>
+        <w:rPr>
+          <w:rFonts w:ascii="Times New Roman" w:hAnsi="Times New Roman"/>
+        </w:rPr>
+      </w:pPr>
+      <w:r>
+        <w:rPr>
+          <w:rFonts w:cs="Times New Roman" w:ascii="Times New Roman" w:hAnsi="Times New Roman"/>
           <w:b/>
           <w:bCs/>
         </w:rPr>
@@ -85,27 +89,76 @@
       </w:r>
       <w:r>
         <w:rPr>
-          <w:rFonts w:ascii="Times New Roman" w:hAnsi="Times New Roman" w:cs="Times New Roman"/>
-        </w:rPr>
-        <w:t xml:space="preserve"> Lost &amp; Alone is a survival game with light horror elements. It is a single player experience in which the player is tasked with surviving the wilderness of a dark forest. The core theme of this game is survival and the prospect of loneliness and feeling stranded with minimal hope of rescue. The player must manage his hunger, thirst, energy, and fear factors of which impact the player’s ability to survive and perform basic functions. There is an inventory management component of which the player has a limit</w:t>
-      </w:r>
-      <w:r>
-        <w:rPr>
-          <w:rFonts w:ascii="Times New Roman" w:hAnsi="Times New Roman" w:cs="Times New Roman"/>
-        </w:rPr>
-        <w:t>ed capacity to store and collect items. The purpose or goal of the player is to survive and travel to a rescue point. The player starts with minimal supplies and must establish themselves with shelter and necessities first, to progress towards the rescue point. The rescue point itself is located across a vast map and requires the player to traverse and hike dangerous terrain and conditions to reach.</w:t>
+          <w:rFonts w:cs="Times New Roman" w:ascii="Times New Roman" w:hAnsi="Times New Roman"/>
+        </w:rPr>
+        <w:t xml:space="preserve"> Lost &amp; Alone is a survival game with light horror elements. It is a single player experience in which the player is tasked with surviving the wilderness of a dark forest. The core theme of this game is survival and the prospect of loneliness and feeling stranded with minimal hope of rescue. The player must manage his </w:t>
+      </w:r>
+      <w:r>
+        <w:rPr>
+          <w:rFonts w:cs="Times New Roman" w:ascii="Times New Roman" w:hAnsi="Times New Roman"/>
+        </w:rPr>
+        <w:t xml:space="preserve">health, </w:t>
+      </w:r>
+      <w:r>
+        <w:rPr>
+          <w:rFonts w:cs="Times New Roman" w:ascii="Times New Roman" w:hAnsi="Times New Roman"/>
+        </w:rPr>
+        <w:t xml:space="preserve">hunger, thirst, energy, </w:t>
+      </w:r>
+      <w:r>
+        <w:rPr>
+          <w:rFonts w:cs="Times New Roman" w:ascii="Times New Roman" w:hAnsi="Times New Roman"/>
+        </w:rPr>
+        <w:t xml:space="preserve">comfort and focus, all </w:t>
+      </w:r>
+      <w:r>
+        <w:rPr>
+          <w:rFonts w:cs="Times New Roman" w:ascii="Times New Roman" w:hAnsi="Times New Roman"/>
+        </w:rPr>
+        <w:t xml:space="preserve">of which impact the player’s ability to survive and perform basic functions. There is an inventory management component of which the player has </w:t>
+      </w:r>
+      <w:r>
+        <w:rPr>
+          <w:rFonts w:cs="Times New Roman" w:ascii="Times New Roman" w:hAnsi="Times New Roman"/>
+        </w:rPr>
+        <w:t xml:space="preserve">the ability to </w:t>
+      </w:r>
+      <w:r>
+        <w:rPr>
+          <w:rFonts w:cs="Times New Roman" w:ascii="Times New Roman" w:hAnsi="Times New Roman"/>
+        </w:rPr>
+        <w:t xml:space="preserve">collect items. The purpose or goal of the player is to survive and travel to a rescue </w:t>
+      </w:r>
+      <w:r>
+        <w:rPr>
+          <w:rFonts w:cs="Times New Roman" w:ascii="Times New Roman" w:hAnsi="Times New Roman"/>
+        </w:rPr>
+        <w:t>point</w:t>
+      </w:r>
+      <w:r>
+        <w:rPr>
+          <w:rFonts w:cs="Times New Roman" w:ascii="Times New Roman" w:hAnsi="Times New Roman"/>
+        </w:rPr>
+        <w:t xml:space="preserve">. </w:t>
+      </w:r>
+      <w:r>
+        <w:rPr>
+          <w:rFonts w:cs="Times New Roman" w:ascii="Times New Roman" w:hAnsi="Times New Roman"/>
+        </w:rPr>
+        <w:t>The player starts without anything and must find care packages to get items. Some of these items include sleeping bags, water, knives, spears, and food. Some items are useless and some damage the player. The player can hide out in shelters as they progress towards the rescue point. The rescue point itself is located across a vast map and requires the player to traverse and hike dangerous terrain and conditions to reach.</w:t>
       </w:r>
     </w:p>
     <w:p>
       <w:pPr>
-        <w:spacing w:line="240" w:lineRule="auto"/>
-        <w:rPr>
-          <w:rFonts w:ascii="Times New Roman" w:hAnsi="Times New Roman" w:cs="Times New Roman"/>
-        </w:rPr>
-      </w:pPr>
-      <w:r>
-        <w:rPr>
-          <w:rFonts w:ascii="Times New Roman" w:hAnsi="Times New Roman" w:cs="Times New Roman"/>
+        <w:pStyle w:val="Normal"/>
+        <w:spacing w:lineRule="auto" w:line="240"/>
+        <w:rPr>
+          <w:rFonts w:ascii="Times New Roman" w:hAnsi="Times New Roman"/>
+        </w:rPr>
+      </w:pPr>
+      <w:r>
+        <w:rPr>
+          <w:rFonts w:cs="Times New Roman" w:ascii="Times New Roman" w:hAnsi="Times New Roman"/>
           <w:b/>
           <w:bCs/>
         </w:rPr>
@@ -113,21 +166,22 @@
       </w:r>
       <w:r>
         <w:rPr>
-          <w:rFonts w:ascii="Times New Roman" w:hAnsi="Times New Roman" w:cs="Times New Roman"/>
+          <w:rFonts w:cs="Times New Roman" w:ascii="Times New Roman" w:hAnsi="Times New Roman"/>
         </w:rPr>
         <w:t>This game is designed to force players to think and act in a survival situation for the purpose of self-preservation. Although this is a game, it contains many elements of survival and acts as a survival simulation for survival enthusiasts as well as individuals interested in survival education. The core elements of this game are designed to be engaging for people who enjoy survival games, as well as the topic of survival situations and how to overcome them.</w:t>
       </w:r>
     </w:p>
     <w:p>
       <w:pPr>
-        <w:spacing w:line="240" w:lineRule="auto"/>
-        <w:rPr>
-          <w:rFonts w:ascii="Times New Roman" w:hAnsi="Times New Roman" w:cs="Times New Roman"/>
-        </w:rPr>
-      </w:pPr>
-      <w:r>
-        <w:rPr>
-          <w:rFonts w:ascii="Times New Roman" w:hAnsi="Times New Roman" w:cs="Times New Roman"/>
+        <w:pStyle w:val="Normal"/>
+        <w:spacing w:lineRule="auto" w:line="240"/>
+        <w:rPr>
+          <w:rFonts w:ascii="Times New Roman" w:hAnsi="Times New Roman"/>
+        </w:rPr>
+      </w:pPr>
+      <w:r>
+        <w:rPr>
+          <w:rFonts w:cs="Times New Roman" w:ascii="Times New Roman" w:hAnsi="Times New Roman"/>
           <w:b/>
           <w:bCs/>
         </w:rPr>
@@ -135,21 +189,28 @@
       </w:r>
       <w:r>
         <w:rPr>
-          <w:rFonts w:ascii="Times New Roman" w:hAnsi="Times New Roman" w:cs="Times New Roman"/>
-        </w:rPr>
-        <w:t>Survival of the various elements of the dark forest such as storms, day/night cycle, extreme temperatures, and wild animals.</w:t>
+          <w:rFonts w:cs="Times New Roman" w:ascii="Times New Roman" w:hAnsi="Times New Roman"/>
+        </w:rPr>
+        <w:t xml:space="preserve">Survival of the various elements of the dark forest such as </w:t>
+      </w:r>
+      <w:r>
+        <w:rPr>
+          <w:rFonts w:cs="Times New Roman" w:ascii="Times New Roman" w:hAnsi="Times New Roman"/>
+        </w:rPr>
+        <w:t>crossing deep lakes and the player’s energy and health meters.</w:t>
       </w:r>
     </w:p>
     <w:p>
       <w:pPr>
-        <w:spacing w:line="240" w:lineRule="auto"/>
-        <w:rPr>
-          <w:rFonts w:ascii="Times New Roman" w:hAnsi="Times New Roman" w:cs="Times New Roman"/>
-        </w:rPr>
-      </w:pPr>
-      <w:r>
-        <w:rPr>
-          <w:rFonts w:ascii="Times New Roman" w:hAnsi="Times New Roman" w:cs="Times New Roman"/>
+        <w:pStyle w:val="Normal"/>
+        <w:spacing w:lineRule="auto" w:line="240"/>
+        <w:rPr>
+          <w:rFonts w:ascii="Times New Roman" w:hAnsi="Times New Roman"/>
+        </w:rPr>
+      </w:pPr>
+      <w:r>
+        <w:rPr>
+          <w:rFonts w:cs="Times New Roman" w:ascii="Times New Roman" w:hAnsi="Times New Roman"/>
           <w:b/>
           <w:bCs/>
         </w:rPr>
@@ -157,37 +218,34 @@
       </w:r>
       <w:r>
         <w:rPr>
-          <w:rFonts w:ascii="Times New Roman" w:hAnsi="Times New Roman" w:cs="Times New Roman"/>
-        </w:rPr>
-        <w:t xml:space="preserve">Maintaining the player’s physical and psychological preservation in the form of hunger, thirst, energy, and fear components of health and </w:t>
-      </w:r>
-      <w:proofErr w:type="spellStart"/>
-      <w:proofErr w:type="gramStart"/>
-      <w:r>
-        <w:rPr>
-          <w:rFonts w:ascii="Times New Roman" w:hAnsi="Times New Roman" w:cs="Times New Roman"/>
-        </w:rPr>
-        <w:t>well being</w:t>
-      </w:r>
-      <w:proofErr w:type="spellEnd"/>
-      <w:proofErr w:type="gramEnd"/>
-      <w:r>
-        <w:rPr>
-          <w:rFonts w:ascii="Times New Roman" w:hAnsi="Times New Roman" w:cs="Times New Roman"/>
-        </w:rPr>
-        <w:t>.</w:t>
+          <w:rFonts w:cs="Times New Roman" w:ascii="Times New Roman" w:hAnsi="Times New Roman"/>
+        </w:rPr>
+        <w:t xml:space="preserve">Maintaining the player’s physical and psychological preservation in the form of hunger, thirst, energy, </w:t>
+      </w:r>
+      <w:r>
+        <w:rPr>
+          <w:rFonts w:cs="Times New Roman" w:ascii="Times New Roman" w:hAnsi="Times New Roman"/>
+        </w:rPr>
+        <w:t xml:space="preserve">comfort and focus </w:t>
+      </w:r>
+      <w:r>
+        <w:rPr>
+          <w:rFonts w:cs="Times New Roman" w:ascii="Times New Roman" w:hAnsi="Times New Roman"/>
+        </w:rPr>
+        <w:t>components of health and well being.</w:t>
       </w:r>
     </w:p>
     <w:p>
       <w:pPr>
-        <w:spacing w:line="240" w:lineRule="auto"/>
-        <w:rPr>
-          <w:rFonts w:ascii="Times New Roman" w:hAnsi="Times New Roman" w:cs="Times New Roman"/>
-        </w:rPr>
-      </w:pPr>
-      <w:r>
-        <w:rPr>
-          <w:rFonts w:ascii="Times New Roman" w:hAnsi="Times New Roman" w:cs="Times New Roman"/>
+        <w:pStyle w:val="Normal"/>
+        <w:spacing w:lineRule="auto" w:line="240"/>
+        <w:rPr>
+          <w:rFonts w:ascii="Times New Roman" w:hAnsi="Times New Roman"/>
+        </w:rPr>
+      </w:pPr>
+      <w:r>
+        <w:rPr>
+          <w:rFonts w:cs="Times New Roman" w:ascii="Times New Roman" w:hAnsi="Times New Roman"/>
           <w:b/>
           <w:bCs/>
         </w:rPr>
@@ -195,21 +253,22 @@
       </w:r>
       <w:r>
         <w:rPr>
-          <w:rFonts w:ascii="Times New Roman" w:hAnsi="Times New Roman" w:cs="Times New Roman"/>
+          <w:rFonts w:cs="Times New Roman" w:ascii="Times New Roman" w:hAnsi="Times New Roman"/>
         </w:rPr>
         <w:t>Creation of the vast dark forest environment and the goal of the player traveling to the rescue point</w:t>
       </w:r>
     </w:p>
     <w:p>
       <w:pPr>
-        <w:spacing w:line="240" w:lineRule="auto"/>
-        <w:rPr>
-          <w:rFonts w:ascii="Times New Roman" w:hAnsi="Times New Roman" w:cs="Times New Roman"/>
-        </w:rPr>
-      </w:pPr>
-      <w:r>
-        <w:rPr>
-          <w:rFonts w:ascii="Times New Roman" w:hAnsi="Times New Roman" w:cs="Times New Roman"/>
+        <w:pStyle w:val="Normal"/>
+        <w:spacing w:lineRule="auto" w:line="240"/>
+        <w:rPr>
+          <w:rFonts w:ascii="Times New Roman" w:hAnsi="Times New Roman"/>
+        </w:rPr>
+      </w:pPr>
+      <w:r>
+        <w:rPr>
+          <w:rFonts w:cs="Times New Roman" w:ascii="Times New Roman" w:hAnsi="Times New Roman"/>
           <w:b/>
           <w:bCs/>
         </w:rPr>
@@ -217,21 +276,28 @@
       </w:r>
       <w:r>
         <w:rPr>
-          <w:rFonts w:ascii="Times New Roman" w:hAnsi="Times New Roman" w:cs="Times New Roman"/>
-        </w:rPr>
-        <w:t>Inventory management &amp; building with crafting components. The player will make primitive tools and basic shelters.</w:t>
+          <w:rFonts w:cs="Times New Roman" w:ascii="Times New Roman" w:hAnsi="Times New Roman"/>
+        </w:rPr>
+        <w:t xml:space="preserve">Inventory management &amp; </w:t>
+      </w:r>
+      <w:r>
+        <w:rPr>
+          <w:rFonts w:cs="Times New Roman" w:ascii="Times New Roman" w:hAnsi="Times New Roman"/>
+        </w:rPr>
+        <w:t>use of those items.</w:t>
       </w:r>
     </w:p>
     <w:p>
       <w:pPr>
-        <w:spacing w:line="240" w:lineRule="auto"/>
-        <w:rPr>
-          <w:rFonts w:ascii="Times New Roman" w:hAnsi="Times New Roman" w:cs="Times New Roman"/>
-        </w:rPr>
-      </w:pPr>
-      <w:r>
-        <w:rPr>
-          <w:rFonts w:ascii="Times New Roman" w:hAnsi="Times New Roman" w:cs="Times New Roman"/>
+        <w:pStyle w:val="Normal"/>
+        <w:spacing w:lineRule="auto" w:line="240"/>
+        <w:rPr>
+          <w:rFonts w:ascii="Times New Roman" w:hAnsi="Times New Roman"/>
+        </w:rPr>
+      </w:pPr>
+      <w:r>
+        <w:rPr>
+          <w:rFonts w:cs="Times New Roman" w:ascii="Times New Roman" w:hAnsi="Times New Roman"/>
           <w:b/>
           <w:bCs/>
         </w:rPr>
@@ -239,21 +305,22 @@
       </w:r>
       <w:r>
         <w:rPr>
-          <w:rFonts w:ascii="Times New Roman" w:hAnsi="Times New Roman" w:cs="Times New Roman"/>
+          <w:rFonts w:cs="Times New Roman" w:ascii="Times New Roman" w:hAnsi="Times New Roman"/>
         </w:rPr>
         <w:t xml:space="preserve">Unreal Engine 5 – version 5.4. Windows-based machines, preferably windows 11. Visual Studio / Visual Studio Code with g++ compiler. GitHub as the coding platform for collaboration and version control. </w:t>
       </w:r>
     </w:p>
     <w:p>
       <w:pPr>
-        <w:spacing w:line="240" w:lineRule="auto"/>
-        <w:rPr>
-          <w:rFonts w:ascii="Times New Roman" w:hAnsi="Times New Roman" w:cs="Times New Roman"/>
-        </w:rPr>
-      </w:pPr>
-      <w:r>
-        <w:rPr>
-          <w:rFonts w:ascii="Times New Roman" w:hAnsi="Times New Roman" w:cs="Times New Roman"/>
+        <w:pStyle w:val="Normal"/>
+        <w:spacing w:lineRule="auto" w:line="240"/>
+        <w:rPr>
+          <w:rFonts w:ascii="Times New Roman" w:hAnsi="Times New Roman"/>
+        </w:rPr>
+      </w:pPr>
+      <w:r>
+        <w:rPr>
+          <w:rFonts w:cs="Times New Roman" w:ascii="Times New Roman" w:hAnsi="Times New Roman"/>
           <w:b/>
           <w:bCs/>
         </w:rPr>
@@ -261,21 +328,22 @@
       </w:r>
       <w:r>
         <w:rPr>
-          <w:rFonts w:ascii="Times New Roman" w:hAnsi="Times New Roman" w:cs="Times New Roman"/>
+          <w:rFonts w:cs="Times New Roman" w:ascii="Times New Roman" w:hAnsi="Times New Roman"/>
         </w:rPr>
         <w:t xml:space="preserve"> This project seeks to deliver a fully functional, immersive single-player survival game that simulates real-world survival challenges in a dark and isolating forest environment. It is important because it brings together game design, psychological immersion, and practical survival simulation in an innovative way.</w:t>
       </w:r>
     </w:p>
     <w:p>
       <w:pPr>
+        <w:pStyle w:val="Normal"/>
         <w:spacing w:beforeAutospacing="1" w:afterAutospacing="1"/>
         <w:rPr>
-          <w:rFonts w:ascii="Times New Roman" w:hAnsi="Times New Roman" w:cs="Times New Roman"/>
-        </w:rPr>
-      </w:pPr>
-      <w:r>
-        <w:rPr>
-          <w:rFonts w:ascii="Times New Roman" w:hAnsi="Times New Roman" w:cs="Times New Roman"/>
+          <w:rFonts w:ascii="Times New Roman" w:hAnsi="Times New Roman"/>
+        </w:rPr>
+      </w:pPr>
+      <w:r>
+        <w:rPr>
+          <w:rFonts w:cs="Times New Roman" w:ascii="Times New Roman" w:hAnsi="Times New Roman"/>
           <w:b/>
           <w:bCs/>
         </w:rPr>
@@ -283,7 +351,7 @@
       </w:r>
       <w:r>
         <w:rPr>
-          <w:rFonts w:ascii="Times New Roman" w:hAnsi="Times New Roman" w:cs="Times New Roman"/>
+          <w:rFonts w:cs="Times New Roman" w:ascii="Times New Roman" w:hAnsi="Times New Roman"/>
         </w:rPr>
         <w:t xml:space="preserve"> </w:t>
       </w:r>
@@ -296,15 +364,12 @@
           <w:numId w:val="1"/>
         </w:numPr>
         <w:spacing w:beforeAutospacing="1" w:after="0"/>
-        <w:rPr>
-          <w:rFonts w:ascii="Times New Roman" w:eastAsia="Times New Roman" w:hAnsi="Times New Roman" w:cs="Times New Roman"/>
-          <w:kern w:val="0"/>
-          <w14:ligatures w14:val="none"/>
-        </w:rPr>
-      </w:pPr>
-      <w:r>
-        <w:rPr>
-          <w:rFonts w:ascii="Times New Roman" w:eastAsia="Times New Roman" w:hAnsi="Times New Roman" w:cs="Times New Roman"/>
+        <w:contextualSpacing/>
+        <w:rPr/>
+      </w:pPr>
+      <w:r>
+        <w:rPr>
+          <w:rFonts w:eastAsia="Times New Roman" w:cs="Times New Roman" w:ascii="Times New Roman" w:hAnsi="Times New Roman"/>
           <w:b/>
           <w:bCs/>
           <w:kern w:val="0"/>
@@ -314,7 +379,7 @@
       </w:r>
       <w:r>
         <w:rPr>
-          <w:rFonts w:ascii="Times New Roman" w:eastAsia="Times New Roman" w:hAnsi="Times New Roman" w:cs="Times New Roman"/>
+          <w:rFonts w:eastAsia="Times New Roman" w:cs="Times New Roman" w:ascii="Times New Roman" w:hAnsi="Times New Roman"/>
           <w:kern w:val="0"/>
           <w14:ligatures w14:val="none"/>
         </w:rPr>
@@ -322,7 +387,7 @@
       </w:r>
       <w:r>
         <w:rPr>
-          <w:rFonts w:ascii="Times New Roman" w:eastAsia="Times New Roman" w:hAnsi="Times New Roman" w:cs="Times New Roman"/>
+          <w:rFonts w:eastAsia="Times New Roman" w:cs="Times New Roman" w:ascii="Times New Roman" w:hAnsi="Times New Roman"/>
           <w:i/>
           <w:iCs/>
           <w:kern w:val="0"/>
@@ -332,23 +397,16 @@
       </w:r>
       <w:r>
         <w:rPr>
-          <w:rFonts w:ascii="Times New Roman" w:eastAsia="Times New Roman" w:hAnsi="Times New Roman" w:cs="Times New Roman"/>
+          <w:rFonts w:eastAsia="Times New Roman" w:cs="Times New Roman" w:ascii="Times New Roman" w:hAnsi="Times New Roman"/>
           <w:kern w:val="0"/>
           <w14:ligatures w14:val="none"/>
         </w:rPr>
         <w:t xml:space="preserve"> [Not specified]</w:t>
-      </w:r>
-      <w:r>
-        <w:rPr>
-          <w:rFonts w:ascii="Times New Roman" w:eastAsia="Times New Roman" w:hAnsi="Times New Roman" w:cs="Times New Roman"/>
-          <w:kern w:val="0"/>
-          <w14:ligatures w14:val="none"/>
-        </w:rPr>
         <w:br/>
       </w:r>
       <w:r>
         <w:rPr>
-          <w:rFonts w:ascii="Times New Roman" w:eastAsia="Times New Roman" w:hAnsi="Times New Roman" w:cs="Times New Roman"/>
+          <w:rFonts w:eastAsia="Times New Roman" w:cs="Times New Roman" w:ascii="Times New Roman" w:hAnsi="Times New Roman"/>
           <w:i/>
           <w:iCs/>
           <w:kern w:val="0"/>
@@ -358,7 +416,7 @@
       </w:r>
       <w:r>
         <w:rPr>
-          <w:rFonts w:ascii="Times New Roman" w:eastAsia="Times New Roman" w:hAnsi="Times New Roman" w:cs="Times New Roman"/>
+          <w:rFonts w:eastAsia="Times New Roman" w:cs="Times New Roman" w:ascii="Times New Roman" w:hAnsi="Times New Roman"/>
           <w:kern w:val="0"/>
           <w14:ligatures w14:val="none"/>
         </w:rPr>
@@ -366,7 +424,7 @@
       </w:r>
       <w:r>
         <w:rPr>
-          <w:rFonts w:ascii="Times New Roman" w:eastAsia="Times New Roman" w:hAnsi="Times New Roman" w:cs="Times New Roman"/>
+          <w:rFonts w:eastAsia="Times New Roman" w:cs="Times New Roman" w:ascii="Times New Roman" w:hAnsi="Times New Roman"/>
           <w:i/>
           <w:iCs/>
           <w:kern w:val="0"/>
@@ -376,51 +434,37 @@
       </w:r>
       <w:r>
         <w:rPr>
-          <w:rFonts w:ascii="Times New Roman" w:eastAsia="Times New Roman" w:hAnsi="Times New Roman" w:cs="Times New Roman"/>
+          <w:rFonts w:eastAsia="Times New Roman" w:cs="Times New Roman" w:ascii="Times New Roman" w:hAnsi="Times New Roman"/>
           <w:kern w:val="0"/>
           <w14:ligatures w14:val="none"/>
         </w:rPr>
         <w:t>, vol. 101235, 2024.</w:t>
-      </w:r>
-      <w:r>
-        <w:rPr>
-          <w:rFonts w:ascii="Times New Roman" w:eastAsia="Times New Roman" w:hAnsi="Times New Roman" w:cs="Times New Roman"/>
-          <w:kern w:val="0"/>
-          <w14:ligatures w14:val="none"/>
-        </w:rPr>
         <w:br/>
       </w:r>
       <w:r>
         <w:rPr>
-          <w:rFonts w:ascii="Times New Roman" w:eastAsia="Times New Roman" w:hAnsi="Times New Roman" w:cs="Times New Roman"/>
+          <w:rFonts w:eastAsia="Times New Roman" w:cs="Times New Roman" w:ascii="Times New Roman" w:hAnsi="Times New Roman"/>
           <w:i/>
           <w:iCs/>
           <w:kern w:val="0"/>
           <w14:ligatures w14:val="none"/>
         </w:rPr>
-        <w:lastRenderedPageBreak/>
         <w:t>Abstract:</w:t>
       </w:r>
       <w:r>
         <w:rPr>
-          <w:rFonts w:ascii="Times New Roman" w:eastAsia="Times New Roman" w:hAnsi="Times New Roman" w:cs="Times New Roman"/>
+          <w:rFonts w:eastAsia="Times New Roman" w:cs="Times New Roman" w:ascii="Times New Roman" w:hAnsi="Times New Roman"/>
           <w:kern w:val="0"/>
           <w14:ligatures w14:val="none"/>
         </w:rPr>
         <w:t xml:space="preserve"> This paper explores human and machine performance in survival games by defining two games, the Grid game and the Terrain game, and analyzing strategies for survival.</w:t>
-      </w:r>
-      <w:r>
-        <w:rPr>
-          <w:rFonts w:ascii="Times New Roman" w:eastAsia="Times New Roman" w:hAnsi="Times New Roman" w:cs="Times New Roman"/>
-          <w:kern w:val="0"/>
-          <w14:ligatures w14:val="none"/>
-        </w:rPr>
         <w:br/>
       </w:r>
-      <w:hyperlink r:id="rId5" w:tgtFrame="_new">
+      <w:hyperlink r:id="rId2" w:tgtFrame="_new">
         <w:r>
           <w:rPr>
-            <w:rFonts w:ascii="Times New Roman" w:eastAsia="Times New Roman" w:hAnsi="Times New Roman" w:cs="Times New Roman"/>
+            <w:rStyle w:val="ListLabel19"/>
+            <w:rFonts w:eastAsia="Times New Roman" w:cs="Times New Roman" w:ascii="Times New Roman" w:hAnsi="Times New Roman"/>
             <w:color w:val="0000FF"/>
             <w:kern w:val="0"/>
             <w:u w:val="single"/>
@@ -437,16 +481,13 @@
           <w:ilvl w:val="0"/>
           <w:numId w:val="1"/>
         </w:numPr>
-        <w:spacing w:after="0" w:line="240" w:lineRule="auto"/>
-        <w:rPr>
-          <w:rFonts w:ascii="Times New Roman" w:eastAsia="Times New Roman" w:hAnsi="Times New Roman" w:cs="Times New Roman"/>
-          <w:kern w:val="0"/>
-          <w14:ligatures w14:val="none"/>
-        </w:rPr>
-      </w:pPr>
-      <w:r>
-        <w:rPr>
-          <w:rFonts w:ascii="Times New Roman" w:eastAsia="Times New Roman" w:hAnsi="Times New Roman" w:cs="Times New Roman"/>
+        <w:spacing w:lineRule="auto" w:line="240" w:before="0" w:after="0"/>
+        <w:contextualSpacing/>
+        <w:rPr/>
+      </w:pPr>
+      <w:r>
+        <w:rPr>
+          <w:rFonts w:eastAsia="Times New Roman" w:cs="Times New Roman" w:ascii="Times New Roman" w:hAnsi="Times New Roman"/>
           <w:b/>
           <w:bCs/>
           <w:kern w:val="0"/>
@@ -456,7 +497,7 @@
       </w:r>
       <w:r>
         <w:rPr>
-          <w:rFonts w:ascii="Times New Roman" w:eastAsia="Times New Roman" w:hAnsi="Times New Roman" w:cs="Times New Roman"/>
+          <w:rFonts w:eastAsia="Times New Roman" w:cs="Times New Roman" w:ascii="Times New Roman" w:hAnsi="Times New Roman"/>
           <w:kern w:val="0"/>
           <w14:ligatures w14:val="none"/>
         </w:rPr>
@@ -464,7 +505,7 @@
       </w:r>
       <w:r>
         <w:rPr>
-          <w:rFonts w:ascii="Times New Roman" w:eastAsia="Times New Roman" w:hAnsi="Times New Roman" w:cs="Times New Roman"/>
+          <w:rFonts w:eastAsia="Times New Roman" w:cs="Times New Roman" w:ascii="Times New Roman" w:hAnsi="Times New Roman"/>
           <w:i/>
           <w:iCs/>
           <w:kern w:val="0"/>
@@ -474,23 +515,16 @@
       </w:r>
       <w:r>
         <w:rPr>
-          <w:rFonts w:ascii="Times New Roman" w:eastAsia="Times New Roman" w:hAnsi="Times New Roman" w:cs="Times New Roman"/>
+          <w:rFonts w:eastAsia="Times New Roman" w:cs="Times New Roman" w:ascii="Times New Roman" w:hAnsi="Times New Roman"/>
           <w:kern w:val="0"/>
           <w14:ligatures w14:val="none"/>
         </w:rPr>
         <w:t xml:space="preserve"> [Not specified]</w:t>
-      </w:r>
-      <w:r>
-        <w:rPr>
-          <w:rFonts w:ascii="Times New Roman" w:eastAsia="Times New Roman" w:hAnsi="Times New Roman" w:cs="Times New Roman"/>
-          <w:kern w:val="0"/>
-          <w14:ligatures w14:val="none"/>
-        </w:rPr>
         <w:br/>
       </w:r>
       <w:r>
         <w:rPr>
-          <w:rFonts w:ascii="Times New Roman" w:eastAsia="Times New Roman" w:hAnsi="Times New Roman" w:cs="Times New Roman"/>
+          <w:rFonts w:eastAsia="Times New Roman" w:cs="Times New Roman" w:ascii="Times New Roman" w:hAnsi="Times New Roman"/>
           <w:i/>
           <w:iCs/>
           <w:kern w:val="0"/>
@@ -500,7 +534,7 @@
       </w:r>
       <w:r>
         <w:rPr>
-          <w:rFonts w:ascii="Times New Roman" w:eastAsia="Times New Roman" w:hAnsi="Times New Roman" w:cs="Times New Roman"/>
+          <w:rFonts w:eastAsia="Times New Roman" w:cs="Times New Roman" w:ascii="Times New Roman" w:hAnsi="Times New Roman"/>
           <w:kern w:val="0"/>
           <w14:ligatures w14:val="none"/>
         </w:rPr>
@@ -508,7 +542,7 @@
       </w:r>
       <w:r>
         <w:rPr>
-          <w:rFonts w:ascii="Times New Roman" w:eastAsia="Times New Roman" w:hAnsi="Times New Roman" w:cs="Times New Roman"/>
+          <w:rFonts w:eastAsia="Times New Roman" w:cs="Times New Roman" w:ascii="Times New Roman" w:hAnsi="Times New Roman"/>
           <w:i/>
           <w:iCs/>
           <w:kern w:val="0"/>
@@ -518,23 +552,16 @@
       </w:r>
       <w:r>
         <w:rPr>
-          <w:rFonts w:ascii="Times New Roman" w:eastAsia="Times New Roman" w:hAnsi="Times New Roman" w:cs="Times New Roman"/>
+          <w:rFonts w:eastAsia="Times New Roman" w:cs="Times New Roman" w:ascii="Times New Roman" w:hAnsi="Times New Roman"/>
           <w:kern w:val="0"/>
           <w14:ligatures w14:val="none"/>
         </w:rPr>
         <w:t>, pp. 280–286, 2021.</w:t>
-      </w:r>
-      <w:r>
-        <w:rPr>
-          <w:rFonts w:ascii="Times New Roman" w:eastAsia="Times New Roman" w:hAnsi="Times New Roman" w:cs="Times New Roman"/>
-          <w:kern w:val="0"/>
-          <w14:ligatures w14:val="none"/>
-        </w:rPr>
         <w:br/>
       </w:r>
       <w:r>
         <w:rPr>
-          <w:rFonts w:ascii="Times New Roman" w:eastAsia="Times New Roman" w:hAnsi="Times New Roman" w:cs="Times New Roman"/>
+          <w:rFonts w:eastAsia="Times New Roman" w:cs="Times New Roman" w:ascii="Times New Roman" w:hAnsi="Times New Roman"/>
           <w:i/>
           <w:iCs/>
           <w:kern w:val="0"/>
@@ -544,24 +571,18 @@
       </w:r>
       <w:r>
         <w:rPr>
-          <w:rFonts w:ascii="Times New Roman" w:eastAsia="Times New Roman" w:hAnsi="Times New Roman" w:cs="Times New Roman"/>
+          <w:rFonts w:eastAsia="Times New Roman" w:cs="Times New Roman" w:ascii="Times New Roman" w:hAnsi="Times New Roman"/>
           <w:kern w:val="0"/>
           <w14:ligatures w14:val="none"/>
         </w:rPr>
         <w:t xml:space="preserve"> Proposes the AI Coach algorithm to provide personalized and adaptive coaching suggestions to players of Apex Legends, enhancing gameplay experience through modeling player skills and offering targeted recommendations.</w:t>
-      </w:r>
-      <w:r>
-        <w:rPr>
-          <w:rFonts w:ascii="Times New Roman" w:eastAsia="Times New Roman" w:hAnsi="Times New Roman" w:cs="Times New Roman"/>
-          <w:kern w:val="0"/>
-          <w14:ligatures w14:val="none"/>
-        </w:rPr>
         <w:br/>
       </w:r>
-      <w:hyperlink r:id="rId6" w:tgtFrame="_new">
+      <w:hyperlink r:id="rId3" w:tgtFrame="_new">
         <w:r>
           <w:rPr>
-            <w:rFonts w:ascii="Times New Roman" w:eastAsia="Times New Roman" w:hAnsi="Times New Roman" w:cs="Times New Roman"/>
+            <w:rStyle w:val="ListLabel19"/>
+            <w:rFonts w:eastAsia="Times New Roman" w:cs="Times New Roman" w:ascii="Times New Roman" w:hAnsi="Times New Roman"/>
             <w:color w:val="0000FF"/>
             <w:kern w:val="0"/>
             <w:u w:val="single"/>
@@ -578,16 +599,13 @@
           <w:ilvl w:val="0"/>
           <w:numId w:val="1"/>
         </w:numPr>
-        <w:spacing w:after="0" w:line="240" w:lineRule="auto"/>
-        <w:rPr>
-          <w:rFonts w:ascii="Times New Roman" w:eastAsia="Times New Roman" w:hAnsi="Times New Roman" w:cs="Times New Roman"/>
-          <w:kern w:val="0"/>
-          <w14:ligatures w14:val="none"/>
-        </w:rPr>
-      </w:pPr>
-      <w:r>
-        <w:rPr>
-          <w:rFonts w:ascii="Times New Roman" w:eastAsia="Times New Roman" w:hAnsi="Times New Roman" w:cs="Times New Roman"/>
+        <w:spacing w:lineRule="auto" w:line="240" w:before="0" w:after="0"/>
+        <w:contextualSpacing/>
+        <w:rPr/>
+      </w:pPr>
+      <w:r>
+        <w:rPr>
+          <w:rFonts w:eastAsia="Times New Roman" w:cs="Times New Roman" w:ascii="Times New Roman" w:hAnsi="Times New Roman"/>
           <w:b/>
           <w:bCs/>
           <w:kern w:val="0"/>
@@ -597,7 +615,7 @@
       </w:r>
       <w:r>
         <w:rPr>
-          <w:rFonts w:ascii="Times New Roman" w:eastAsia="Times New Roman" w:hAnsi="Times New Roman" w:cs="Times New Roman"/>
+          <w:rFonts w:eastAsia="Times New Roman" w:cs="Times New Roman" w:ascii="Times New Roman" w:hAnsi="Times New Roman"/>
           <w:kern w:val="0"/>
           <w14:ligatures w14:val="none"/>
         </w:rPr>
@@ -605,7 +623,7 @@
       </w:r>
       <w:r>
         <w:rPr>
-          <w:rFonts w:ascii="Times New Roman" w:eastAsia="Times New Roman" w:hAnsi="Times New Roman" w:cs="Times New Roman"/>
+          <w:rFonts w:eastAsia="Times New Roman" w:cs="Times New Roman" w:ascii="Times New Roman" w:hAnsi="Times New Roman"/>
           <w:i/>
           <w:iCs/>
           <w:kern w:val="0"/>
@@ -615,23 +633,16 @@
       </w:r>
       <w:r>
         <w:rPr>
-          <w:rFonts w:ascii="Times New Roman" w:eastAsia="Times New Roman" w:hAnsi="Times New Roman" w:cs="Times New Roman"/>
+          <w:rFonts w:eastAsia="Times New Roman" w:cs="Times New Roman" w:ascii="Times New Roman" w:hAnsi="Times New Roman"/>
           <w:kern w:val="0"/>
           <w14:ligatures w14:val="none"/>
         </w:rPr>
         <w:t xml:space="preserve"> [Not specified]</w:t>
-      </w:r>
-      <w:r>
-        <w:rPr>
-          <w:rFonts w:ascii="Times New Roman" w:eastAsia="Times New Roman" w:hAnsi="Times New Roman" w:cs="Times New Roman"/>
-          <w:kern w:val="0"/>
-          <w14:ligatures w14:val="none"/>
-        </w:rPr>
         <w:br/>
       </w:r>
       <w:r>
         <w:rPr>
-          <w:rFonts w:ascii="Times New Roman" w:eastAsia="Times New Roman" w:hAnsi="Times New Roman" w:cs="Times New Roman"/>
+          <w:rFonts w:eastAsia="Times New Roman" w:cs="Times New Roman" w:ascii="Times New Roman" w:hAnsi="Times New Roman"/>
           <w:i/>
           <w:iCs/>
           <w:kern w:val="0"/>
@@ -641,7 +652,7 @@
       </w:r>
       <w:r>
         <w:rPr>
-          <w:rFonts w:ascii="Times New Roman" w:eastAsia="Times New Roman" w:hAnsi="Times New Roman" w:cs="Times New Roman"/>
+          <w:rFonts w:eastAsia="Times New Roman" w:cs="Times New Roman" w:ascii="Times New Roman" w:hAnsi="Times New Roman"/>
           <w:kern w:val="0"/>
           <w14:ligatures w14:val="none"/>
         </w:rPr>
@@ -649,7 +660,7 @@
       </w:r>
       <w:r>
         <w:rPr>
-          <w:rFonts w:ascii="Times New Roman" w:eastAsia="Times New Roman" w:hAnsi="Times New Roman" w:cs="Times New Roman"/>
+          <w:rFonts w:eastAsia="Times New Roman" w:cs="Times New Roman" w:ascii="Times New Roman" w:hAnsi="Times New Roman"/>
           <w:i/>
           <w:iCs/>
           <w:kern w:val="0"/>
@@ -659,23 +670,16 @@
       </w:r>
       <w:r>
         <w:rPr>
-          <w:rFonts w:ascii="Times New Roman" w:eastAsia="Times New Roman" w:hAnsi="Times New Roman" w:cs="Times New Roman"/>
+          <w:rFonts w:eastAsia="Times New Roman" w:cs="Times New Roman" w:ascii="Times New Roman" w:hAnsi="Times New Roman"/>
           <w:kern w:val="0"/>
           <w14:ligatures w14:val="none"/>
         </w:rPr>
         <w:t>, vol. 28, no. 6, article 36, 2021.</w:t>
-      </w:r>
-      <w:r>
-        <w:rPr>
-          <w:rFonts w:ascii="Times New Roman" w:eastAsia="Times New Roman" w:hAnsi="Times New Roman" w:cs="Times New Roman"/>
-          <w:kern w:val="0"/>
-          <w14:ligatures w14:val="none"/>
-        </w:rPr>
         <w:br/>
       </w:r>
       <w:r>
         <w:rPr>
-          <w:rFonts w:ascii="Times New Roman" w:eastAsia="Times New Roman" w:hAnsi="Times New Roman" w:cs="Times New Roman"/>
+          <w:rFonts w:eastAsia="Times New Roman" w:cs="Times New Roman" w:ascii="Times New Roman" w:hAnsi="Times New Roman"/>
           <w:i/>
           <w:iCs/>
           <w:kern w:val="0"/>
@@ -685,24 +689,18 @@
       </w:r>
       <w:r>
         <w:rPr>
-          <w:rFonts w:ascii="Times New Roman" w:eastAsia="Times New Roman" w:hAnsi="Times New Roman" w:cs="Times New Roman"/>
+          <w:rFonts w:eastAsia="Times New Roman" w:cs="Times New Roman" w:ascii="Times New Roman" w:hAnsi="Times New Roman"/>
           <w:kern w:val="0"/>
           <w14:ligatures w14:val="none"/>
         </w:rPr>
         <w:t xml:space="preserve"> Presents an automated playtesting approach using AI players to predict human player behavior and experience, focusing on game difficulty and engagement.</w:t>
-      </w:r>
-      <w:r>
-        <w:rPr>
-          <w:rFonts w:ascii="Times New Roman" w:eastAsia="Times New Roman" w:hAnsi="Times New Roman" w:cs="Times New Roman"/>
-          <w:kern w:val="0"/>
-          <w14:ligatures w14:val="none"/>
-        </w:rPr>
         <w:br/>
       </w:r>
-      <w:hyperlink r:id="rId7" w:tgtFrame="_new">
+      <w:hyperlink r:id="rId4" w:tgtFrame="_new">
         <w:r>
           <w:rPr>
-            <w:rFonts w:ascii="Times New Roman" w:eastAsia="Times New Roman" w:hAnsi="Times New Roman" w:cs="Times New Roman"/>
+            <w:rStyle w:val="ListLabel19"/>
+            <w:rFonts w:eastAsia="Times New Roman" w:cs="Times New Roman" w:ascii="Times New Roman" w:hAnsi="Times New Roman"/>
             <w:color w:val="0000FF"/>
             <w:kern w:val="0"/>
             <w:u w:val="single"/>
@@ -719,16 +717,13 @@
           <w:ilvl w:val="0"/>
           <w:numId w:val="1"/>
         </w:numPr>
-        <w:spacing w:after="0" w:line="240" w:lineRule="auto"/>
-        <w:rPr>
-          <w:rFonts w:ascii="Times New Roman" w:eastAsia="Times New Roman" w:hAnsi="Times New Roman" w:cs="Times New Roman"/>
-          <w:kern w:val="0"/>
-          <w14:ligatures w14:val="none"/>
-        </w:rPr>
-      </w:pPr>
-      <w:r>
-        <w:rPr>
-          <w:rFonts w:ascii="Times New Roman" w:eastAsia="Times New Roman" w:hAnsi="Times New Roman" w:cs="Times New Roman"/>
+        <w:spacing w:lineRule="auto" w:line="240" w:before="0" w:after="0"/>
+        <w:contextualSpacing/>
+        <w:rPr/>
+      </w:pPr>
+      <w:r>
+        <w:rPr>
+          <w:rFonts w:eastAsia="Times New Roman" w:cs="Times New Roman" w:ascii="Times New Roman" w:hAnsi="Times New Roman"/>
           <w:b/>
           <w:bCs/>
           <w:kern w:val="0"/>
@@ -738,7 +733,7 @@
       </w:r>
       <w:r>
         <w:rPr>
-          <w:rFonts w:ascii="Times New Roman" w:eastAsia="Times New Roman" w:hAnsi="Times New Roman" w:cs="Times New Roman"/>
+          <w:rFonts w:eastAsia="Times New Roman" w:cs="Times New Roman" w:ascii="Times New Roman" w:hAnsi="Times New Roman"/>
           <w:kern w:val="0"/>
           <w14:ligatures w14:val="none"/>
         </w:rPr>
@@ -746,7 +741,7 @@
       </w:r>
       <w:r>
         <w:rPr>
-          <w:rFonts w:ascii="Times New Roman" w:eastAsia="Times New Roman" w:hAnsi="Times New Roman" w:cs="Times New Roman"/>
+          <w:rFonts w:eastAsia="Times New Roman" w:cs="Times New Roman" w:ascii="Times New Roman" w:hAnsi="Times New Roman"/>
           <w:i/>
           <w:iCs/>
           <w:kern w:val="0"/>
@@ -756,23 +751,16 @@
       </w:r>
       <w:r>
         <w:rPr>
-          <w:rFonts w:ascii="Times New Roman" w:eastAsia="Times New Roman" w:hAnsi="Times New Roman" w:cs="Times New Roman"/>
+          <w:rFonts w:eastAsia="Times New Roman" w:cs="Times New Roman" w:ascii="Times New Roman" w:hAnsi="Times New Roman"/>
           <w:kern w:val="0"/>
           <w14:ligatures w14:val="none"/>
         </w:rPr>
         <w:t xml:space="preserve"> [Not specified]</w:t>
-      </w:r>
-      <w:r>
-        <w:rPr>
-          <w:rFonts w:ascii="Times New Roman" w:eastAsia="Times New Roman" w:hAnsi="Times New Roman" w:cs="Times New Roman"/>
-          <w:kern w:val="0"/>
-          <w14:ligatures w14:val="none"/>
-        </w:rPr>
         <w:br/>
       </w:r>
       <w:r>
         <w:rPr>
-          <w:rFonts w:ascii="Times New Roman" w:eastAsia="Times New Roman" w:hAnsi="Times New Roman" w:cs="Times New Roman"/>
+          <w:rFonts w:eastAsia="Times New Roman" w:cs="Times New Roman" w:ascii="Times New Roman" w:hAnsi="Times New Roman"/>
           <w:i/>
           <w:iCs/>
           <w:kern w:val="0"/>
@@ -782,7 +770,7 @@
       </w:r>
       <w:r>
         <w:rPr>
-          <w:rFonts w:ascii="Times New Roman" w:eastAsia="Times New Roman" w:hAnsi="Times New Roman" w:cs="Times New Roman"/>
+          <w:rFonts w:eastAsia="Times New Roman" w:cs="Times New Roman" w:ascii="Times New Roman" w:hAnsi="Times New Roman"/>
           <w:kern w:val="0"/>
           <w14:ligatures w14:val="none"/>
         </w:rPr>
@@ -790,7 +778,7 @@
       </w:r>
       <w:r>
         <w:rPr>
-          <w:rFonts w:ascii="Times New Roman" w:eastAsia="Times New Roman" w:hAnsi="Times New Roman" w:cs="Times New Roman"/>
+          <w:rFonts w:eastAsia="Times New Roman" w:cs="Times New Roman" w:ascii="Times New Roman" w:hAnsi="Times New Roman"/>
           <w:i/>
           <w:iCs/>
           <w:kern w:val="0"/>
@@ -800,23 +788,16 @@
       </w:r>
       <w:r>
         <w:rPr>
-          <w:rFonts w:ascii="Times New Roman" w:eastAsia="Times New Roman" w:hAnsi="Times New Roman" w:cs="Times New Roman"/>
+          <w:rFonts w:eastAsia="Times New Roman" w:cs="Times New Roman" w:ascii="Times New Roman" w:hAnsi="Times New Roman"/>
           <w:kern w:val="0"/>
           <w14:ligatures w14:val="none"/>
         </w:rPr>
         <w:t>, pp. 510–521, 2021.</w:t>
-      </w:r>
-      <w:r>
-        <w:rPr>
-          <w:rFonts w:ascii="Times New Roman" w:eastAsia="Times New Roman" w:hAnsi="Times New Roman" w:cs="Times New Roman"/>
-          <w:kern w:val="0"/>
-          <w14:ligatures w14:val="none"/>
-        </w:rPr>
         <w:br/>
       </w:r>
       <w:r>
         <w:rPr>
-          <w:rFonts w:ascii="Times New Roman" w:eastAsia="Times New Roman" w:hAnsi="Times New Roman" w:cs="Times New Roman"/>
+          <w:rFonts w:eastAsia="Times New Roman" w:cs="Times New Roman" w:ascii="Times New Roman" w:hAnsi="Times New Roman"/>
           <w:i/>
           <w:iCs/>
           <w:kern w:val="0"/>
@@ -826,24 +807,18 @@
       </w:r>
       <w:r>
         <w:rPr>
-          <w:rFonts w:ascii="Times New Roman" w:eastAsia="Times New Roman" w:hAnsi="Times New Roman" w:cs="Times New Roman"/>
+          <w:rFonts w:eastAsia="Times New Roman" w:cs="Times New Roman" w:ascii="Times New Roman" w:hAnsi="Times New Roman"/>
           <w:kern w:val="0"/>
           <w14:ligatures w14:val="none"/>
         </w:rPr>
         <w:t xml:space="preserve"> Proposes a novel automated playtesting technique that predicts game difficulty experienced by players with varying sensorimotor skills, aiding in game design refinement.</w:t>
-      </w:r>
-      <w:r>
-        <w:rPr>
-          <w:rFonts w:ascii="Times New Roman" w:eastAsia="Times New Roman" w:hAnsi="Times New Roman" w:cs="Times New Roman"/>
-          <w:kern w:val="0"/>
-          <w14:ligatures w14:val="none"/>
-        </w:rPr>
         <w:br/>
       </w:r>
-      <w:hyperlink r:id="rId8" w:tgtFrame="_new">
+      <w:hyperlink r:id="rId5" w:tgtFrame="_new">
         <w:r>
           <w:rPr>
-            <w:rFonts w:ascii="Times New Roman" w:eastAsia="Times New Roman" w:hAnsi="Times New Roman" w:cs="Times New Roman"/>
+            <w:rStyle w:val="ListLabel19"/>
+            <w:rFonts w:eastAsia="Times New Roman" w:cs="Times New Roman" w:ascii="Times New Roman" w:hAnsi="Times New Roman"/>
             <w:color w:val="0000FF"/>
             <w:kern w:val="0"/>
             <w:u w:val="single"/>
@@ -860,16 +835,13 @@
           <w:ilvl w:val="0"/>
           <w:numId w:val="1"/>
         </w:numPr>
-        <w:spacing w:afterAutospacing="1" w:line="240" w:lineRule="auto"/>
-        <w:rPr>
-          <w:rFonts w:ascii="Times New Roman" w:eastAsia="Times New Roman" w:hAnsi="Times New Roman" w:cs="Times New Roman"/>
-          <w:kern w:val="0"/>
-          <w14:ligatures w14:val="none"/>
-        </w:rPr>
-      </w:pPr>
-      <w:r>
-        <w:rPr>
-          <w:rFonts w:ascii="Times New Roman" w:eastAsia="Times New Roman" w:hAnsi="Times New Roman" w:cs="Times New Roman"/>
+        <w:spacing w:lineRule="auto" w:line="240" w:before="0" w:afterAutospacing="1"/>
+        <w:contextualSpacing/>
+        <w:rPr/>
+      </w:pPr>
+      <w:r>
+        <w:rPr>
+          <w:rFonts w:eastAsia="Times New Roman" w:cs="Times New Roman" w:ascii="Times New Roman" w:hAnsi="Times New Roman"/>
           <w:b/>
           <w:bCs/>
           <w:kern w:val="0"/>
@@ -879,7 +851,7 @@
       </w:r>
       <w:r>
         <w:rPr>
-          <w:rFonts w:ascii="Times New Roman" w:eastAsia="Times New Roman" w:hAnsi="Times New Roman" w:cs="Times New Roman"/>
+          <w:rFonts w:eastAsia="Times New Roman" w:cs="Times New Roman" w:ascii="Times New Roman" w:hAnsi="Times New Roman"/>
           <w:kern w:val="0"/>
           <w14:ligatures w14:val="none"/>
         </w:rPr>
@@ -887,7 +859,7 @@
       </w:r>
       <w:r>
         <w:rPr>
-          <w:rFonts w:ascii="Times New Roman" w:eastAsia="Times New Roman" w:hAnsi="Times New Roman" w:cs="Times New Roman"/>
+          <w:rFonts w:eastAsia="Times New Roman" w:cs="Times New Roman" w:ascii="Times New Roman" w:hAnsi="Times New Roman"/>
           <w:i/>
           <w:iCs/>
           <w:kern w:val="0"/>
@@ -897,41 +869,16 @@
       </w:r>
       <w:r>
         <w:rPr>
-          <w:rFonts w:ascii="Times New Roman" w:eastAsia="Times New Roman" w:hAnsi="Times New Roman" w:cs="Times New Roman"/>
-          <w:kern w:val="0"/>
-          <w14:ligatures w14:val="none"/>
-        </w:rPr>
-        <w:t xml:space="preserve"> Ruben </w:t>
-      </w:r>
-      <w:proofErr w:type="spellStart"/>
-      <w:r>
-        <w:rPr>
-          <w:rFonts w:ascii="Times New Roman" w:eastAsia="Times New Roman" w:hAnsi="Times New Roman" w:cs="Times New Roman"/>
-          <w:kern w:val="0"/>
-          <w14:ligatures w14:val="none"/>
-        </w:rPr>
-        <w:t>Schlagwoski</w:t>
-      </w:r>
-      <w:proofErr w:type="spellEnd"/>
-      <w:r>
-        <w:rPr>
-          <w:rFonts w:ascii="Times New Roman" w:eastAsia="Times New Roman" w:hAnsi="Times New Roman" w:cs="Times New Roman"/>
-          <w:kern w:val="0"/>
-          <w14:ligatures w14:val="none"/>
-        </w:rPr>
-        <w:t>, Frederick Herget, Niklas Heimerl, et al.</w:t>
-      </w:r>
-      <w:r>
-        <w:rPr>
-          <w:rFonts w:ascii="Times New Roman" w:eastAsia="Times New Roman" w:hAnsi="Times New Roman" w:cs="Times New Roman"/>
-          <w:kern w:val="0"/>
-          <w14:ligatures w14:val="none"/>
-        </w:rPr>
+          <w:rFonts w:eastAsia="Times New Roman" w:cs="Times New Roman" w:ascii="Times New Roman" w:hAnsi="Times New Roman"/>
+          <w:kern w:val="0"/>
+          <w14:ligatures w14:val="none"/>
+        </w:rPr>
+        <w:t xml:space="preserve"> Ruben Schlagwoski, Frederick Herget, Niklas Heimerl, et al.</w:t>
         <w:br/>
       </w:r>
       <w:r>
         <w:rPr>
-          <w:rFonts w:ascii="Times New Roman" w:eastAsia="Times New Roman" w:hAnsi="Times New Roman" w:cs="Times New Roman"/>
+          <w:rFonts w:eastAsia="Times New Roman" w:cs="Times New Roman" w:ascii="Times New Roman" w:hAnsi="Times New Roman"/>
           <w:i/>
           <w:iCs/>
           <w:kern w:val="0"/>
@@ -941,7 +888,7 @@
       </w:r>
       <w:r>
         <w:rPr>
-          <w:rFonts w:ascii="Times New Roman" w:eastAsia="Times New Roman" w:hAnsi="Times New Roman" w:cs="Times New Roman"/>
+          <w:rFonts w:eastAsia="Times New Roman" w:cs="Times New Roman" w:ascii="Times New Roman" w:hAnsi="Times New Roman"/>
           <w:kern w:val="0"/>
           <w14:ligatures w14:val="none"/>
         </w:rPr>
@@ -949,7 +896,7 @@
       </w:r>
       <w:r>
         <w:rPr>
-          <w:rFonts w:ascii="Times New Roman" w:eastAsia="Times New Roman" w:hAnsi="Times New Roman" w:cs="Times New Roman"/>
+          <w:rFonts w:eastAsia="Times New Roman" w:cs="Times New Roman" w:ascii="Times New Roman" w:hAnsi="Times New Roman"/>
           <w:i/>
           <w:iCs/>
           <w:kern w:val="0"/>
@@ -959,23 +906,16 @@
       </w:r>
       <w:r>
         <w:rPr>
-          <w:rFonts w:ascii="Times New Roman" w:eastAsia="Times New Roman" w:hAnsi="Times New Roman" w:cs="Times New Roman"/>
+          <w:rFonts w:eastAsia="Times New Roman" w:cs="Times New Roman" w:ascii="Times New Roman" w:hAnsi="Times New Roman"/>
           <w:kern w:val="0"/>
           <w14:ligatures w14:val="none"/>
         </w:rPr>
         <w:t>, 2024.</w:t>
-      </w:r>
-      <w:r>
-        <w:rPr>
-          <w:rFonts w:ascii="Times New Roman" w:eastAsia="Times New Roman" w:hAnsi="Times New Roman" w:cs="Times New Roman"/>
-          <w:kern w:val="0"/>
-          <w14:ligatures w14:val="none"/>
-        </w:rPr>
         <w:br/>
       </w:r>
       <w:r>
         <w:rPr>
-          <w:rFonts w:ascii="Times New Roman" w:eastAsia="Times New Roman" w:hAnsi="Times New Roman" w:cs="Times New Roman"/>
+          <w:rFonts w:eastAsia="Times New Roman" w:cs="Times New Roman" w:ascii="Times New Roman" w:hAnsi="Times New Roman"/>
           <w:i/>
           <w:iCs/>
           <w:kern w:val="0"/>
@@ -985,24 +925,18 @@
       </w:r>
       <w:r>
         <w:rPr>
-          <w:rFonts w:ascii="Times New Roman" w:eastAsia="Times New Roman" w:hAnsi="Times New Roman" w:cs="Times New Roman"/>
+          <w:rFonts w:eastAsia="Times New Roman" w:cs="Times New Roman" w:ascii="Times New Roman" w:hAnsi="Times New Roman"/>
           <w:kern w:val="0"/>
           <w14:ligatures w14:val="none"/>
         </w:rPr>
         <w:t xml:space="preserve"> Investigates how different in-game camera perspectives impact player behavior, engagement, and experience in a social simulation game context.</w:t>
-      </w:r>
-      <w:r>
-        <w:rPr>
-          <w:rFonts w:ascii="Times New Roman" w:eastAsia="Times New Roman" w:hAnsi="Times New Roman" w:cs="Times New Roman"/>
-          <w:kern w:val="0"/>
-          <w14:ligatures w14:val="none"/>
-        </w:rPr>
         <w:br/>
       </w:r>
-      <w:hyperlink r:id="rId9" w:tgtFrame="_new">
+      <w:hyperlink r:id="rId6" w:tgtFrame="_new">
         <w:r>
           <w:rPr>
-            <w:rFonts w:ascii="Times New Roman" w:eastAsia="Times New Roman" w:hAnsi="Times New Roman" w:cs="Times New Roman"/>
+            <w:rStyle w:val="ListLabel19"/>
+            <w:rFonts w:eastAsia="Times New Roman" w:cs="Times New Roman" w:ascii="Times New Roman" w:hAnsi="Times New Roman"/>
             <w:color w:val="0000FF"/>
             <w:kern w:val="0"/>
             <w:u w:val="single"/>
@@ -1014,99 +948,142 @@
     </w:p>
     <w:p>
       <w:pPr>
-        <w:spacing w:line="240" w:lineRule="auto"/>
+        <w:pStyle w:val="Normal"/>
+        <w:spacing w:lineRule="auto" w:line="240"/>
         <w:rPr>
           <w:rFonts w:ascii="Times New Roman" w:hAnsi="Times New Roman" w:cs="Times New Roman"/>
         </w:rPr>
       </w:pPr>
+      <w:r>
+        <w:rPr>
+          <w:rFonts w:cs="Times New Roman" w:ascii="Times New Roman" w:hAnsi="Times New Roman"/>
+        </w:rPr>
+      </w:r>
     </w:p>
     <w:p>
       <w:pPr>
-        <w:spacing w:line="240" w:lineRule="auto"/>
+        <w:pStyle w:val="Normal"/>
+        <w:spacing w:lineRule="auto" w:line="240"/>
         <w:rPr>
           <w:rFonts w:ascii="Times New Roman" w:hAnsi="Times New Roman" w:cs="Times New Roman"/>
         </w:rPr>
       </w:pPr>
+      <w:r>
+        <w:rPr>
+          <w:rFonts w:cs="Times New Roman" w:ascii="Times New Roman" w:hAnsi="Times New Roman"/>
+        </w:rPr>
+      </w:r>
     </w:p>
     <w:p>
       <w:pPr>
-        <w:spacing w:line="240" w:lineRule="auto"/>
+        <w:pStyle w:val="Normal"/>
+        <w:spacing w:lineRule="auto" w:line="240"/>
         <w:rPr>
           <w:rFonts w:ascii="Times New Roman" w:hAnsi="Times New Roman" w:cs="Times New Roman"/>
         </w:rPr>
       </w:pPr>
+      <w:r>
+        <w:rPr>
+          <w:rFonts w:cs="Times New Roman" w:ascii="Times New Roman" w:hAnsi="Times New Roman"/>
+        </w:rPr>
+      </w:r>
     </w:p>
     <w:p>
       <w:pPr>
-        <w:spacing w:line="240" w:lineRule="auto"/>
+        <w:pStyle w:val="Normal"/>
+        <w:spacing w:lineRule="auto" w:line="240"/>
         <w:rPr>
           <w:rFonts w:ascii="Times New Roman" w:hAnsi="Times New Roman" w:cs="Times New Roman"/>
         </w:rPr>
       </w:pPr>
+      <w:r>
+        <w:rPr>
+          <w:rFonts w:cs="Times New Roman" w:ascii="Times New Roman" w:hAnsi="Times New Roman"/>
+        </w:rPr>
+      </w:r>
     </w:p>
     <w:p>
       <w:pPr>
-        <w:spacing w:line="240" w:lineRule="auto"/>
+        <w:pStyle w:val="Normal"/>
+        <w:spacing w:lineRule="auto" w:line="240"/>
         <w:rPr>
           <w:rFonts w:ascii="Times New Roman" w:hAnsi="Times New Roman" w:cs="Times New Roman"/>
         </w:rPr>
       </w:pPr>
+      <w:r>
+        <w:rPr>
+          <w:rFonts w:cs="Times New Roman" w:ascii="Times New Roman" w:hAnsi="Times New Roman"/>
+        </w:rPr>
+      </w:r>
     </w:p>
     <w:p>
       <w:pPr>
-        <w:spacing w:line="240" w:lineRule="auto"/>
+        <w:pStyle w:val="Normal"/>
+        <w:spacing w:lineRule="auto" w:line="240"/>
         <w:rPr>
           <w:rFonts w:ascii="Times New Roman" w:hAnsi="Times New Roman" w:cs="Times New Roman"/>
         </w:rPr>
       </w:pPr>
+      <w:r>
+        <w:rPr>
+          <w:rFonts w:cs="Times New Roman" w:ascii="Times New Roman" w:hAnsi="Times New Roman"/>
+        </w:rPr>
+      </w:r>
     </w:p>
     <w:p>
       <w:pPr>
-        <w:spacing w:line="240" w:lineRule="auto"/>
+        <w:pStyle w:val="Normal"/>
+        <w:spacing w:lineRule="auto" w:line="240"/>
         <w:jc w:val="center"/>
         <w:rPr>
+          <w:rFonts w:ascii="Times New Roman" w:hAnsi="Times New Roman"/>
+        </w:rPr>
+      </w:pPr>
+      <w:r>
+        <w:rPr>
+          <w:rFonts w:cs="Times New Roman" w:ascii="Times New Roman" w:hAnsi="Times New Roman"/>
           <w:b/>
           <w:bCs/>
           <w:sz w:val="48"/>
           <w:szCs w:val="48"/>
         </w:rPr>
-      </w:pPr>
-      <w:r>
-        <w:rPr>
-          <w:rFonts w:ascii="Times New Roman" w:hAnsi="Times New Roman" w:cs="Times New Roman"/>
-          <w:b/>
-          <w:bCs/>
-          <w:sz w:val="48"/>
-          <w:szCs w:val="48"/>
-        </w:rPr>
-        <w:lastRenderedPageBreak/>
         <w:t>RUBRIC TABLE</w:t>
       </w:r>
     </w:p>
     <w:tbl>
       <w:tblPr>
         <w:tblW w:w="5000" w:type="pct"/>
+        <w:jc w:val="left"/>
+        <w:tblInd w:w="0" w:type="dxa"/>
         <w:tblLayout w:type="fixed"/>
         <w:tblCellMar>
+          <w:top w:w="0" w:type="dxa"/>
           <w:left w:w="0" w:type="dxa"/>
+          <w:bottom w:w="0" w:type="dxa"/>
           <w:right w:w="0" w:type="dxa"/>
         </w:tblCellMar>
-        <w:tblLook w:val="04A0" w:firstRow="1" w:lastRow="0" w:firstColumn="1" w:lastColumn="0" w:noHBand="0" w:noVBand="1"/>
+        <w:tblLook w:val="04a0" w:noHBand="0" w:noVBand="1" w:firstColumn="1" w:lastRow="0" w:lastColumn="0" w:firstRow="1"/>
       </w:tblPr>
       <w:tblGrid>
-        <w:gridCol w:w="2340"/>
+        <w:gridCol w:w="2339"/>
         <w:gridCol w:w="2340"/>
         <w:gridCol w:w="2340"/>
         <w:gridCol w:w="2340"/>
       </w:tblGrid>
       <w:tr>
+        <w:trPr/>
         <w:tc>
           <w:tcPr>
             <w:tcW w:w="2339" w:type="dxa"/>
-          </w:tcPr>
-          <w:p>
-            <w:pPr>
-              <w:pStyle w:val="TableContents"/>
+            <w:tcBorders/>
+          </w:tcPr>
+          <w:p>
+            <w:pPr>
+              <w:pStyle w:val="TableContents"/>
+              <w:widowControl w:val="false"/>
+              <w:suppressLineNumbers/>
+              <w:spacing w:before="0" w:after="160"/>
+              <w:rPr/>
             </w:pPr>
             <w:r>
               <w:rPr>
@@ -1132,10 +1109,12 @@
         <w:tc>
           <w:tcPr>
             <w:tcW w:w="2340" w:type="dxa"/>
-          </w:tcPr>
-          <w:p>
-            <w:pPr>
-              <w:pStyle w:val="TableContents"/>
+            <w:tcBorders/>
+          </w:tcPr>
+          <w:p>
+            <w:pPr>
+              <w:pStyle w:val="TableContents"/>
+              <w:spacing w:before="0" w:after="160"/>
               <w:rPr>
                 <w:rFonts w:ascii="Times New Roman" w:hAnsi="Times New Roman"/>
               </w:rPr>
@@ -1147,93 +1126,45 @@
               <w:t>Seth</w:t>
             </w:r>
           </w:p>
-          <w:p>
-            <w:pPr>
-              <w:pStyle w:val="TableContents"/>
-              <w:rPr>
-                <w:rFonts w:ascii="Times New Roman" w:hAnsi="Times New Roman"/>
-              </w:rPr>
-            </w:pPr>
-            <w:r>
-              <w:rPr>
-                <w:rFonts w:ascii="Times New Roman" w:hAnsi="Times New Roman"/>
-              </w:rPr>
-              <w:t>Austin</w:t>
-            </w:r>
-          </w:p>
         </w:tc>
         <w:tc>
           <w:tcPr>
             <w:tcW w:w="2340" w:type="dxa"/>
-          </w:tcPr>
-          <w:p>
-            <w:pPr>
-              <w:pStyle w:val="TableContents"/>
-              <w:rPr>
-                <w:rFonts w:ascii="Times New Roman" w:hAnsi="Times New Roman"/>
-              </w:rPr>
-            </w:pPr>
-            <w:r>
-              <w:rPr>
-                <w:rFonts w:ascii="Times New Roman" w:hAnsi="Times New Roman"/>
-              </w:rPr>
-              <w:t>Source/</w:t>
-            </w:r>
-            <w:proofErr w:type="spellStart"/>
-            <w:r>
-              <w:rPr>
-                <w:rFonts w:ascii="Times New Roman" w:hAnsi="Times New Roman"/>
-              </w:rPr>
-              <w:t>LostandAlone</w:t>
-            </w:r>
-            <w:proofErr w:type="spellEnd"/>
-            <w:r>
-              <w:rPr>
-                <w:rFonts w:ascii="Times New Roman" w:hAnsi="Times New Roman"/>
-              </w:rPr>
-              <w:t>/Private/TerrainGeneration.cpp</w:t>
-            </w:r>
-          </w:p>
-          <w:p>
-            <w:pPr>
-              <w:pStyle w:val="TableContents"/>
-              <w:rPr>
-                <w:rFonts w:ascii="Times New Roman" w:hAnsi="Times New Roman"/>
-              </w:rPr>
-            </w:pPr>
-            <w:r>
-              <w:rPr>
-                <w:rFonts w:ascii="Times New Roman" w:hAnsi="Times New Roman"/>
-              </w:rPr>
-              <w:t>Source/</w:t>
-            </w:r>
-            <w:proofErr w:type="spellStart"/>
-            <w:r>
-              <w:rPr>
-                <w:rFonts w:ascii="Times New Roman" w:hAnsi="Times New Roman"/>
-              </w:rPr>
-              <w:t>LostandAlone</w:t>
-            </w:r>
-            <w:proofErr w:type="spellEnd"/>
-            <w:r>
-              <w:rPr>
-                <w:rFonts w:ascii="Times New Roman" w:hAnsi="Times New Roman"/>
-              </w:rPr>
-              <w:t>/Private/ProceduralNightLighting.cpp</w:t>
-            </w:r>
-          </w:p>
-          <w:p>
-            <w:pPr>
-              <w:pStyle w:val="TableContents"/>
-              <w:rPr>
-                <w:rFonts w:ascii="Times New Roman" w:hAnsi="Times New Roman"/>
-              </w:rPr>
-            </w:pPr>
+            <w:tcBorders/>
+          </w:tcPr>
+          <w:p>
+            <w:pPr>
+              <w:pStyle w:val="TableContents"/>
+              <w:rPr>
+                <w:rFonts w:ascii="Times New Roman" w:hAnsi="Times New Roman"/>
+              </w:rPr>
+            </w:pPr>
+            <w:r>
+              <w:rPr>
+                <w:rFonts w:ascii="Times New Roman" w:hAnsi="Times New Roman"/>
+              </w:rPr>
+              <w:t>Source/LostandAlone/Private/TerrainGeneration.cpp</w:t>
+            </w:r>
+          </w:p>
+          <w:p>
+            <w:pPr>
+              <w:pStyle w:val="TableContents"/>
+              <w:spacing w:before="0" w:after="160"/>
+              <w:rPr>
+                <w:rFonts w:ascii="Times New Roman" w:hAnsi="Times New Roman"/>
+              </w:rPr>
+            </w:pPr>
+            <w:r>
+              <w:rPr>
+                <w:rFonts w:ascii="Times New Roman" w:hAnsi="Times New Roman"/>
+              </w:rPr>
+            </w:r>
           </w:p>
         </w:tc>
         <w:tc>
           <w:tcPr>
             <w:tcW w:w="2340" w:type="dxa"/>
+            <w:tcBorders/>
           </w:tcPr>
           <w:p>
             <w:pPr>
@@ -1252,37 +1183,50 @@
           <w:p>
             <w:pPr>
               <w:pStyle w:val="TableContents"/>
-              <w:rPr>
-                <w:rFonts w:ascii="Times New Roman" w:hAnsi="Times New Roman"/>
-              </w:rPr>
-            </w:pPr>
-            <w:r>
-              <w:rPr>
-                <w:rFonts w:ascii="Times New Roman" w:hAnsi="Times New Roman"/>
-              </w:rPr>
-              <w:t>This file creates the world lighting effect</w:t>
+              <w:spacing w:before="0" w:after="160"/>
+              <w:rPr>
+                <w:rFonts w:ascii="Times New Roman" w:hAnsi="Times New Roman"/>
+              </w:rPr>
+            </w:pPr>
+            <w:r>
+              <w:rPr>
+                <w:rFonts w:ascii="Times New Roman" w:hAnsi="Times New Roman"/>
+              </w:rPr>
             </w:r>
           </w:p>
         </w:tc>
       </w:tr>
       <w:tr>
+        <w:trPr/>
         <w:tc>
           <w:tcPr>
             <w:tcW w:w="2339" w:type="dxa"/>
-          </w:tcPr>
-          <w:p>
-            <w:pPr>
-              <w:pStyle w:val="TableContents"/>
-            </w:pPr>
+            <w:tcBorders/>
+          </w:tcPr>
+          <w:p>
+            <w:pPr>
+              <w:pStyle w:val="TableContents"/>
+              <w:spacing w:before="0" w:after="160"/>
+              <w:rPr>
+                <w:rFonts w:ascii="Times New Roman" w:hAnsi="Times New Roman"/>
+              </w:rPr>
+            </w:pPr>
+            <w:r>
+              <w:rPr>
+                <w:rFonts w:ascii="Times New Roman" w:hAnsi="Times New Roman"/>
+              </w:rPr>
+            </w:r>
           </w:p>
         </w:tc>
         <w:tc>
           <w:tcPr>
             <w:tcW w:w="2340" w:type="dxa"/>
-          </w:tcPr>
-          <w:p>
-            <w:pPr>
-              <w:pStyle w:val="TableContents"/>
+            <w:tcBorders/>
+          </w:tcPr>
+          <w:p>
+            <w:pPr>
+              <w:pStyle w:val="TableContents"/>
+              <w:spacing w:before="0" w:after="160"/>
               <w:rPr>
                 <w:rFonts w:ascii="Times New Roman" w:hAnsi="Times New Roman"/>
               </w:rPr>
@@ -1298,38 +1242,57 @@
         <w:tc>
           <w:tcPr>
             <w:tcW w:w="2340" w:type="dxa"/>
-          </w:tcPr>
-          <w:p>
-            <w:pPr>
-              <w:pStyle w:val="TableContents"/>
-              <w:rPr>
-                <w:rFonts w:ascii="Times New Roman" w:hAnsi="Times New Roman"/>
-              </w:rPr>
-            </w:pPr>
+            <w:tcBorders/>
+          </w:tcPr>
+          <w:p>
+            <w:pPr>
+              <w:pStyle w:val="TableContents"/>
+              <w:spacing w:before="0" w:after="160"/>
+              <w:rPr>
+                <w:rFonts w:ascii="Times New Roman" w:hAnsi="Times New Roman"/>
+              </w:rPr>
+            </w:pPr>
+            <w:r>
+              <w:rPr>
+                <w:rFonts w:ascii="Times New Roman" w:hAnsi="Times New Roman"/>
+              </w:rPr>
+              <w:t>Source/LostandAlone/Private/ProceduralNightLighting.cpp</w:t>
+            </w:r>
           </w:p>
         </w:tc>
         <w:tc>
           <w:tcPr>
             <w:tcW w:w="2340" w:type="dxa"/>
-          </w:tcPr>
-          <w:p>
-            <w:pPr>
-              <w:pStyle w:val="TableContents"/>
-              <w:rPr>
-                <w:rFonts w:ascii="Times New Roman" w:hAnsi="Times New Roman"/>
-              </w:rPr>
-            </w:pPr>
+            <w:tcBorders/>
+          </w:tcPr>
+          <w:p>
+            <w:pPr>
+              <w:pStyle w:val="TableContents"/>
+              <w:spacing w:before="0" w:after="160"/>
+              <w:rPr>
+                <w:rFonts w:ascii="Times New Roman" w:hAnsi="Times New Roman"/>
+              </w:rPr>
+            </w:pPr>
+            <w:r>
+              <w:rPr>
+                <w:rFonts w:ascii="Times New Roman" w:hAnsi="Times New Roman"/>
+              </w:rPr>
+              <w:t>This file creates the world lighting effect</w:t>
+            </w:r>
           </w:p>
         </w:tc>
       </w:tr>
       <w:tr>
+        <w:trPr/>
         <w:tc>
           <w:tcPr>
             <w:tcW w:w="2339" w:type="dxa"/>
-          </w:tcPr>
-          <w:p>
-            <w:pPr>
-              <w:pStyle w:val="TableContents"/>
+            <w:tcBorders/>
+          </w:tcPr>
+          <w:p>
+            <w:pPr>
+              <w:pStyle w:val="TableContents"/>
+              <w:spacing w:before="0" w:after="160"/>
               <w:rPr>
                 <w:rFonts w:ascii="Times New Roman" w:hAnsi="Times New Roman"/>
               </w:rPr>
@@ -1345,10 +1308,12 @@
         <w:tc>
           <w:tcPr>
             <w:tcW w:w="2340" w:type="dxa"/>
-          </w:tcPr>
-          <w:p>
-            <w:pPr>
-              <w:pStyle w:val="TableContents"/>
+            <w:tcBorders/>
+          </w:tcPr>
+          <w:p>
+            <w:pPr>
+              <w:pStyle w:val="TableContents"/>
+              <w:spacing w:before="0" w:after="160"/>
               <w:rPr>
                 <w:rFonts w:ascii="Times New Roman" w:hAnsi="Times New Roman"/>
               </w:rPr>
@@ -1364,133 +1329,77 @@
         <w:tc>
           <w:tcPr>
             <w:tcW w:w="2340" w:type="dxa"/>
-          </w:tcPr>
-          <w:p>
-            <w:pPr>
-              <w:pStyle w:val="TableContents"/>
-              <w:rPr>
-                <w:rFonts w:ascii="Times New Roman" w:hAnsi="Times New Roman"/>
-              </w:rPr>
-            </w:pPr>
-            <w:r>
-              <w:rPr>
-                <w:rFonts w:ascii="Times New Roman" w:hAnsi="Times New Roman"/>
-              </w:rPr>
-              <w:t>Source/</w:t>
-            </w:r>
-            <w:proofErr w:type="spellStart"/>
-            <w:r>
-              <w:rPr>
-                <w:rFonts w:ascii="Times New Roman" w:hAnsi="Times New Roman"/>
-              </w:rPr>
-              <w:t>LostandAlone</w:t>
-            </w:r>
-            <w:proofErr w:type="spellEnd"/>
-            <w:r>
-              <w:rPr>
-                <w:rFonts w:ascii="Times New Roman" w:hAnsi="Times New Roman"/>
-              </w:rPr>
-              <w:t>/Private/InventoryComponent.cpp</w:t>
+            <w:tcBorders/>
+          </w:tcPr>
+          <w:p>
+            <w:pPr>
+              <w:pStyle w:val="TableContents"/>
+              <w:spacing w:before="0" w:after="160"/>
+              <w:rPr>
+                <w:rFonts w:ascii="Times New Roman" w:hAnsi="Times New Roman"/>
+              </w:rPr>
+            </w:pPr>
+            <w:r>
+              <w:rPr>
+                <w:rFonts w:ascii="Times New Roman" w:hAnsi="Times New Roman"/>
+              </w:rPr>
+              <w:t>Source/LostandAlone/Private/InventoryComponent.cpp</w:t>
             </w:r>
           </w:p>
         </w:tc>
         <w:tc>
           <w:tcPr>
             <w:tcW w:w="2340" w:type="dxa"/>
-          </w:tcPr>
-          <w:p>
-            <w:pPr>
-              <w:pStyle w:val="TableContents"/>
-              <w:rPr>
-                <w:rFonts w:ascii="Times New Roman" w:hAnsi="Times New Roman"/>
-              </w:rPr>
-            </w:pPr>
-            <w:r>
-              <w:rPr>
-                <w:rFonts w:ascii="Times New Roman" w:hAnsi="Times New Roman"/>
-              </w:rPr>
-              <w:t xml:space="preserve">This file contains a </w:t>
-            </w:r>
-            <w:proofErr w:type="spellStart"/>
-            <w:r>
-              <w:rPr>
-                <w:rFonts w:ascii="Times New Roman" w:hAnsi="Times New Roman"/>
-              </w:rPr>
-              <w:t>Fitem</w:t>
-            </w:r>
-            <w:proofErr w:type="spellEnd"/>
-            <w:r>
-              <w:rPr>
-                <w:rFonts w:ascii="Times New Roman" w:hAnsi="Times New Roman"/>
-              </w:rPr>
-              <w:t xml:space="preserve"> </w:t>
-            </w:r>
-            <w:proofErr w:type="gramStart"/>
-            <w:r>
-              <w:rPr>
-                <w:rFonts w:ascii="Times New Roman" w:hAnsi="Times New Roman"/>
-              </w:rPr>
-              <w:t>struct</w:t>
-            </w:r>
-            <w:proofErr w:type="gramEnd"/>
-            <w:r>
-              <w:rPr>
-                <w:rFonts w:ascii="Times New Roman" w:hAnsi="Times New Roman"/>
-              </w:rPr>
-              <w:t xml:space="preserve"> and a </w:t>
-            </w:r>
-            <w:proofErr w:type="spellStart"/>
-            <w:r>
-              <w:rPr>
-                <w:rFonts w:ascii="Times New Roman" w:hAnsi="Times New Roman"/>
-              </w:rPr>
-              <w:t>TArray</w:t>
-            </w:r>
-            <w:proofErr w:type="spellEnd"/>
-            <w:r>
-              <w:rPr>
-                <w:rFonts w:ascii="Times New Roman" w:hAnsi="Times New Roman"/>
-              </w:rPr>
-              <w:t>&lt;</w:t>
-            </w:r>
-            <w:proofErr w:type="spellStart"/>
-            <w:r>
-              <w:rPr>
-                <w:rFonts w:ascii="Times New Roman" w:hAnsi="Times New Roman"/>
-              </w:rPr>
-              <w:t>FItem</w:t>
-            </w:r>
-            <w:proofErr w:type="spellEnd"/>
-            <w:r>
-              <w:rPr>
-                <w:rFonts w:ascii="Times New Roman" w:hAnsi="Times New Roman"/>
-              </w:rPr>
-              <w:t>&gt;. The array contains all the items in the inventory.</w:t>
+            <w:tcBorders/>
+          </w:tcPr>
+          <w:p>
+            <w:pPr>
+              <w:pStyle w:val="TableContents"/>
+              <w:spacing w:before="0" w:after="160"/>
+              <w:rPr>
+                <w:rFonts w:ascii="Times New Roman" w:hAnsi="Times New Roman"/>
+              </w:rPr>
+            </w:pPr>
+            <w:r>
+              <w:rPr>
+                <w:rFonts w:ascii="Times New Roman" w:hAnsi="Times New Roman"/>
+              </w:rPr>
+              <w:t>This file contains a Fitem struct and a TArray&lt;FItem&gt;. The array contains all the items in the inventory.</w:t>
             </w:r>
           </w:p>
         </w:tc>
       </w:tr>
       <w:tr>
+        <w:trPr/>
         <w:tc>
           <w:tcPr>
             <w:tcW w:w="2339" w:type="dxa"/>
-          </w:tcPr>
-          <w:p>
-            <w:pPr>
-              <w:pStyle w:val="TableContents"/>
-              <w:rPr>
-                <w:rFonts w:ascii="Times New Roman" w:hAnsi="Times New Roman"/>
-              </w:rPr>
-            </w:pPr>
+            <w:tcBorders/>
+          </w:tcPr>
+          <w:p>
+            <w:pPr>
+              <w:pStyle w:val="TableContents"/>
+              <w:spacing w:before="0" w:after="160"/>
+              <w:rPr>
+                <w:rFonts w:ascii="Times New Roman" w:hAnsi="Times New Roman"/>
+              </w:rPr>
+            </w:pPr>
+            <w:r>
+              <w:rPr>
+                <w:rFonts w:ascii="Times New Roman" w:hAnsi="Times New Roman"/>
+              </w:rPr>
+            </w:r>
           </w:p>
         </w:tc>
         <w:tc>
           <w:tcPr>
             <w:tcW w:w="2340" w:type="dxa"/>
-          </w:tcPr>
-          <w:p>
-            <w:pPr>
-              <w:pStyle w:val="TableContents"/>
+            <w:tcBorders/>
+          </w:tcPr>
+          <w:p>
+            <w:pPr>
+              <w:pStyle w:val="TableContents"/>
+              <w:spacing w:before="0" w:after="160"/>
               <w:rPr>
                 <w:rFonts w:ascii="Times New Roman" w:hAnsi="Times New Roman"/>
               </w:rPr>
@@ -1506,38 +1415,55 @@
         <w:tc>
           <w:tcPr>
             <w:tcW w:w="2340" w:type="dxa"/>
-          </w:tcPr>
-          <w:p>
-            <w:pPr>
-              <w:pStyle w:val="TableContents"/>
-              <w:rPr>
-                <w:rFonts w:ascii="Times New Roman" w:hAnsi="Times New Roman"/>
-              </w:rPr>
-            </w:pPr>
+            <w:tcBorders/>
+          </w:tcPr>
+          <w:p>
+            <w:pPr>
+              <w:pStyle w:val="TableContents"/>
+              <w:spacing w:before="0" w:after="160"/>
+              <w:rPr>
+                <w:rFonts w:ascii="Times New Roman" w:hAnsi="Times New Roman"/>
+              </w:rPr>
+            </w:pPr>
+            <w:r>
+              <w:rPr>
+                <w:rFonts w:ascii="Times New Roman" w:hAnsi="Times New Roman"/>
+              </w:rPr>
+            </w:r>
           </w:p>
         </w:tc>
         <w:tc>
           <w:tcPr>
             <w:tcW w:w="2340" w:type="dxa"/>
-          </w:tcPr>
-          <w:p>
-            <w:pPr>
-              <w:pStyle w:val="TableContents"/>
-              <w:rPr>
-                <w:rFonts w:ascii="Times New Roman" w:hAnsi="Times New Roman"/>
-              </w:rPr>
-            </w:pPr>
+            <w:tcBorders/>
+          </w:tcPr>
+          <w:p>
+            <w:pPr>
+              <w:pStyle w:val="TableContents"/>
+              <w:spacing w:before="0" w:after="160"/>
+              <w:rPr>
+                <w:rFonts w:ascii="Times New Roman" w:hAnsi="Times New Roman"/>
+              </w:rPr>
+            </w:pPr>
+            <w:r>
+              <w:rPr>
+                <w:rFonts w:ascii="Times New Roman" w:hAnsi="Times New Roman"/>
+              </w:rPr>
+            </w:r>
           </w:p>
         </w:tc>
       </w:tr>
       <w:tr>
+        <w:trPr/>
         <w:tc>
           <w:tcPr>
             <w:tcW w:w="2339" w:type="dxa"/>
-          </w:tcPr>
-          <w:p>
-            <w:pPr>
-              <w:pStyle w:val="TableContents"/>
+            <w:tcBorders/>
+          </w:tcPr>
+          <w:p>
+            <w:pPr>
+              <w:pStyle w:val="TableContents"/>
+              <w:spacing w:before="0" w:after="160"/>
               <w:rPr>
                 <w:rFonts w:ascii="Times New Roman" w:hAnsi="Times New Roman"/>
               </w:rPr>
@@ -1553,10 +1479,12 @@
         <w:tc>
           <w:tcPr>
             <w:tcW w:w="2340" w:type="dxa"/>
-          </w:tcPr>
-          <w:p>
-            <w:pPr>
-              <w:pStyle w:val="TableContents"/>
+            <w:tcBorders/>
+          </w:tcPr>
+          <w:p>
+            <w:pPr>
+              <w:pStyle w:val="TableContents"/>
+              <w:spacing w:before="0" w:after="160"/>
               <w:rPr>
                 <w:rFonts w:ascii="Times New Roman" w:hAnsi="Times New Roman"/>
               </w:rPr>
@@ -1572,43 +1500,33 @@
         <w:tc>
           <w:tcPr>
             <w:tcW w:w="2340" w:type="dxa"/>
-          </w:tcPr>
-          <w:p>
-            <w:pPr>
-              <w:pStyle w:val="TableContents"/>
-              <w:rPr>
-                <w:rFonts w:ascii="Times New Roman" w:hAnsi="Times New Roman"/>
-              </w:rPr>
-            </w:pPr>
-            <w:r>
-              <w:rPr>
-                <w:rFonts w:ascii="Times New Roman" w:hAnsi="Times New Roman"/>
-              </w:rPr>
-              <w:t>Source/</w:t>
-            </w:r>
-            <w:proofErr w:type="spellStart"/>
-            <w:r>
-              <w:rPr>
-                <w:rFonts w:ascii="Times New Roman" w:hAnsi="Times New Roman"/>
-              </w:rPr>
-              <w:t>LostandAlone</w:t>
-            </w:r>
-            <w:proofErr w:type="spellEnd"/>
-            <w:r>
-              <w:rPr>
-                <w:rFonts w:ascii="Times New Roman" w:hAnsi="Times New Roman"/>
-              </w:rPr>
-              <w:t>/Private/TerrainGeneration.cpp</w:t>
+            <w:tcBorders/>
+          </w:tcPr>
+          <w:p>
+            <w:pPr>
+              <w:pStyle w:val="TableContents"/>
+              <w:spacing w:before="0" w:after="160"/>
+              <w:rPr>
+                <w:rFonts w:ascii="Times New Roman" w:hAnsi="Times New Roman"/>
+              </w:rPr>
+            </w:pPr>
+            <w:r>
+              <w:rPr>
+                <w:rFonts w:ascii="Times New Roman" w:hAnsi="Times New Roman"/>
+              </w:rPr>
+              <w:t>Source/LostandAlone/Private/TerrainGeneration.cpp</w:t>
             </w:r>
           </w:p>
         </w:tc>
         <w:tc>
           <w:tcPr>
             <w:tcW w:w="2340" w:type="dxa"/>
-          </w:tcPr>
-          <w:p>
-            <w:pPr>
-              <w:pStyle w:val="TableContents"/>
+            <w:tcBorders/>
+          </w:tcPr>
+          <w:p>
+            <w:pPr>
+              <w:pStyle w:val="TableContents"/>
+              <w:spacing w:before="0" w:after="160"/>
               <w:rPr>
                 <w:rFonts w:ascii="Times New Roman" w:hAnsi="Times New Roman"/>
               </w:rPr>
@@ -1623,26 +1541,36 @@
         </w:tc>
       </w:tr>
       <w:tr>
+        <w:trPr/>
         <w:tc>
           <w:tcPr>
             <w:tcW w:w="2339" w:type="dxa"/>
-          </w:tcPr>
-          <w:p>
-            <w:pPr>
-              <w:pStyle w:val="TableContents"/>
-              <w:rPr>
-                <w:rFonts w:ascii="Times New Roman" w:hAnsi="Times New Roman"/>
-              </w:rPr>
-            </w:pPr>
+            <w:tcBorders/>
+          </w:tcPr>
+          <w:p>
+            <w:pPr>
+              <w:pStyle w:val="TableContents"/>
+              <w:spacing w:before="0" w:after="160"/>
+              <w:rPr>
+                <w:rFonts w:ascii="Times New Roman" w:hAnsi="Times New Roman"/>
+              </w:rPr>
+            </w:pPr>
+            <w:r>
+              <w:rPr>
+                <w:rFonts w:ascii="Times New Roman" w:hAnsi="Times New Roman"/>
+              </w:rPr>
+            </w:r>
           </w:p>
         </w:tc>
         <w:tc>
           <w:tcPr>
             <w:tcW w:w="2340" w:type="dxa"/>
-          </w:tcPr>
-          <w:p>
-            <w:pPr>
-              <w:pStyle w:val="TableContents"/>
+            <w:tcBorders/>
+          </w:tcPr>
+          <w:p>
+            <w:pPr>
+              <w:pStyle w:val="TableContents"/>
+              <w:spacing w:before="0" w:after="160"/>
               <w:rPr>
                 <w:rFonts w:ascii="Times New Roman" w:hAnsi="Times New Roman"/>
               </w:rPr>
@@ -1658,38 +1586,55 @@
         <w:tc>
           <w:tcPr>
             <w:tcW w:w="2340" w:type="dxa"/>
-          </w:tcPr>
-          <w:p>
-            <w:pPr>
-              <w:pStyle w:val="TableContents"/>
-              <w:rPr>
-                <w:rFonts w:ascii="Times New Roman" w:hAnsi="Times New Roman"/>
-              </w:rPr>
-            </w:pPr>
+            <w:tcBorders/>
+          </w:tcPr>
+          <w:p>
+            <w:pPr>
+              <w:pStyle w:val="TableContents"/>
+              <w:spacing w:before="0" w:after="160"/>
+              <w:rPr>
+                <w:rFonts w:ascii="Times New Roman" w:hAnsi="Times New Roman"/>
+              </w:rPr>
+            </w:pPr>
+            <w:r>
+              <w:rPr>
+                <w:rFonts w:ascii="Times New Roman" w:hAnsi="Times New Roman"/>
+              </w:rPr>
+            </w:r>
           </w:p>
         </w:tc>
         <w:tc>
           <w:tcPr>
             <w:tcW w:w="2340" w:type="dxa"/>
-          </w:tcPr>
-          <w:p>
-            <w:pPr>
-              <w:pStyle w:val="TableContents"/>
-              <w:rPr>
-                <w:rFonts w:ascii="Times New Roman" w:hAnsi="Times New Roman"/>
-              </w:rPr>
-            </w:pPr>
+            <w:tcBorders/>
+          </w:tcPr>
+          <w:p>
+            <w:pPr>
+              <w:pStyle w:val="TableContents"/>
+              <w:spacing w:before="0" w:after="160"/>
+              <w:rPr>
+                <w:rFonts w:ascii="Times New Roman" w:hAnsi="Times New Roman"/>
+              </w:rPr>
+            </w:pPr>
+            <w:r>
+              <w:rPr>
+                <w:rFonts w:ascii="Times New Roman" w:hAnsi="Times New Roman"/>
+              </w:rPr>
+            </w:r>
           </w:p>
         </w:tc>
       </w:tr>
       <w:tr>
+        <w:trPr/>
         <w:tc>
           <w:tcPr>
             <w:tcW w:w="2339" w:type="dxa"/>
-          </w:tcPr>
-          <w:p>
-            <w:pPr>
-              <w:pStyle w:val="TableContents"/>
+            <w:tcBorders/>
+          </w:tcPr>
+          <w:p>
+            <w:pPr>
+              <w:pStyle w:val="TableContents"/>
+              <w:spacing w:before="0" w:after="160"/>
               <w:rPr>
                 <w:rFonts w:ascii="Times New Roman" w:hAnsi="Times New Roman"/>
               </w:rPr>
@@ -1705,10 +1650,12 @@
         <w:tc>
           <w:tcPr>
             <w:tcW w:w="2340" w:type="dxa"/>
-          </w:tcPr>
-          <w:p>
-            <w:pPr>
-              <w:pStyle w:val="TableContents"/>
+            <w:tcBorders/>
+          </w:tcPr>
+          <w:p>
+            <w:pPr>
+              <w:pStyle w:val="TableContents"/>
+              <w:spacing w:before="0" w:after="160"/>
               <w:rPr>
                 <w:rFonts w:ascii="Times New Roman" w:hAnsi="Times New Roman"/>
               </w:rPr>
@@ -1724,80 +1671,30 @@
         <w:tc>
           <w:tcPr>
             <w:tcW w:w="2340" w:type="dxa"/>
-          </w:tcPr>
-          <w:p>
-            <w:pPr>
-              <w:pStyle w:val="TableContents"/>
-              <w:rPr>
-                <w:rFonts w:ascii="Times New Roman" w:hAnsi="Times New Roman"/>
-              </w:rPr>
-            </w:pPr>
-            <w:r>
-              <w:rPr>
-                <w:rFonts w:ascii="Times New Roman" w:hAnsi="Times New Roman"/>
-              </w:rPr>
-              <w:t>Source/</w:t>
-            </w:r>
-            <w:proofErr w:type="spellStart"/>
-            <w:r>
-              <w:rPr>
-                <w:rFonts w:ascii="Times New Roman" w:hAnsi="Times New Roman"/>
-              </w:rPr>
-              <w:t>LostandAlone</w:t>
-            </w:r>
-            <w:proofErr w:type="spellEnd"/>
-            <w:r>
-              <w:rPr>
-                <w:rFonts w:ascii="Times New Roman" w:hAnsi="Times New Roman"/>
-              </w:rPr>
-              <w:t>/Private/PlayerVitalsComponent.cpp</w:t>
-            </w:r>
-            <w:r>
-              <w:rPr>
-                <w:rFonts w:ascii="Times New Roman" w:hAnsi="Times New Roman"/>
-              </w:rPr>
+            <w:tcBorders/>
+          </w:tcPr>
+          <w:p>
+            <w:pPr>
+              <w:pStyle w:val="TableContents"/>
+              <w:spacing w:before="0" w:after="160"/>
+              <w:rPr>
+                <w:rFonts w:ascii="Times New Roman" w:hAnsi="Times New Roman"/>
+              </w:rPr>
+            </w:pPr>
+            <w:r>
+              <w:rPr>
+                <w:rFonts w:ascii="Times New Roman" w:hAnsi="Times New Roman"/>
+              </w:rPr>
+              <w:t>Source/LostandAlone/Private/PlayerVitalsComponent.cpp</w:t>
               <w:br/>
-              <w:t xml:space="preserve">Contains 4 functions for modifying the player </w:t>
-            </w:r>
-            <w:r>
-              <w:rPr>
-                <w:rFonts w:ascii="Times New Roman" w:hAnsi="Times New Roman"/>
-              </w:rPr>
-              <w:t>vitals.</w:t>
-            </w:r>
-          </w:p>
-          <w:p>
-            <w:pPr>
-              <w:pStyle w:val="TableContents"/>
-              <w:rPr>
-                <w:rFonts w:ascii="Times New Roman" w:hAnsi="Times New Roman"/>
-              </w:rPr>
-            </w:pPr>
-            <w:r>
-              <w:rPr>
-                <w:rFonts w:ascii="Times New Roman" w:hAnsi="Times New Roman"/>
-              </w:rPr>
-              <w:t>Source/</w:t>
-            </w:r>
-            <w:proofErr w:type="spellStart"/>
-            <w:r>
-              <w:rPr>
-                <w:rFonts w:ascii="Times New Roman" w:hAnsi="Times New Roman"/>
-              </w:rPr>
-              <w:t>LostandAlone</w:t>
-            </w:r>
-            <w:proofErr w:type="spellEnd"/>
-            <w:r>
-              <w:rPr>
-                <w:rFonts w:ascii="Times New Roman" w:hAnsi="Times New Roman"/>
-              </w:rPr>
-              <w:t>/Private/LAPlayer.cpp</w:t>
+              <w:t>Contains 4 functions for modifying the player vitals.</w:t>
             </w:r>
           </w:p>
         </w:tc>
         <w:tc>
           <w:tcPr>
             <w:tcW w:w="2340" w:type="dxa"/>
+            <w:tcBorders/>
           </w:tcPr>
           <w:p>
             <w:pPr>
@@ -1816,56 +1713,50 @@
           <w:p>
             <w:pPr>
               <w:pStyle w:val="TableContents"/>
-              <w:rPr>
-                <w:rFonts w:ascii="Times New Roman" w:hAnsi="Times New Roman"/>
-              </w:rPr>
-            </w:pPr>
-          </w:p>
-          <w:p>
-            <w:pPr>
-              <w:pStyle w:val="TableContents"/>
-              <w:rPr>
-                <w:rFonts w:ascii="Times New Roman" w:hAnsi="Times New Roman"/>
-              </w:rPr>
-            </w:pPr>
-          </w:p>
-          <w:p>
-            <w:pPr>
-              <w:pStyle w:val="TableContents"/>
-              <w:rPr>
-                <w:rFonts w:ascii="Times New Roman" w:hAnsi="Times New Roman"/>
-              </w:rPr>
-            </w:pPr>
-            <w:r>
-              <w:rPr>
-                <w:rFonts w:ascii="Times New Roman" w:hAnsi="Times New Roman"/>
-              </w:rPr>
-              <w:t>Player Movement and Camera Controls</w:t>
+              <w:spacing w:before="0" w:after="160"/>
+              <w:rPr>
+                <w:rFonts w:ascii="Times New Roman" w:hAnsi="Times New Roman"/>
+              </w:rPr>
+            </w:pPr>
+            <w:r>
+              <w:rPr>
+                <w:rFonts w:ascii="Times New Roman" w:hAnsi="Times New Roman"/>
+              </w:rPr>
             </w:r>
           </w:p>
         </w:tc>
       </w:tr>
       <w:tr>
+        <w:trPr/>
         <w:tc>
           <w:tcPr>
             <w:tcW w:w="2339" w:type="dxa"/>
-          </w:tcPr>
-          <w:p>
-            <w:pPr>
-              <w:pStyle w:val="TableContents"/>
-              <w:rPr>
-                <w:rFonts w:ascii="Times New Roman" w:hAnsi="Times New Roman"/>
-              </w:rPr>
-            </w:pPr>
+            <w:tcBorders/>
+          </w:tcPr>
+          <w:p>
+            <w:pPr>
+              <w:pStyle w:val="TableContents"/>
+              <w:spacing w:before="0" w:after="160"/>
+              <w:rPr>
+                <w:rFonts w:ascii="Times New Roman" w:hAnsi="Times New Roman"/>
+              </w:rPr>
+            </w:pPr>
+            <w:r>
+              <w:rPr>
+                <w:rFonts w:ascii="Times New Roman" w:hAnsi="Times New Roman"/>
+              </w:rPr>
+            </w:r>
           </w:p>
         </w:tc>
         <w:tc>
           <w:tcPr>
             <w:tcW w:w="2340" w:type="dxa"/>
-          </w:tcPr>
-          <w:p>
-            <w:pPr>
-              <w:pStyle w:val="TableContents"/>
+            <w:tcBorders/>
+          </w:tcPr>
+          <w:p>
+            <w:pPr>
+              <w:pStyle w:val="TableContents"/>
+              <w:spacing w:before="0" w:after="160"/>
               <w:rPr>
                 <w:rFonts w:ascii="Times New Roman" w:hAnsi="Times New Roman"/>
               </w:rPr>
@@ -1881,38 +1772,57 @@
         <w:tc>
           <w:tcPr>
             <w:tcW w:w="2340" w:type="dxa"/>
-          </w:tcPr>
-          <w:p>
-            <w:pPr>
-              <w:pStyle w:val="TableContents"/>
-              <w:rPr>
-                <w:rFonts w:ascii="Times New Roman" w:hAnsi="Times New Roman"/>
-              </w:rPr>
-            </w:pPr>
+            <w:tcBorders/>
+          </w:tcPr>
+          <w:p>
+            <w:pPr>
+              <w:pStyle w:val="TableContents"/>
+              <w:spacing w:before="0" w:after="160"/>
+              <w:rPr>
+                <w:rFonts w:ascii="Times New Roman" w:hAnsi="Times New Roman"/>
+              </w:rPr>
+            </w:pPr>
+            <w:r>
+              <w:rPr>
+                <w:rFonts w:ascii="Times New Roman" w:hAnsi="Times New Roman"/>
+              </w:rPr>
+              <w:t>Source/LostandAlone/Private/LAPlayer.cpp</w:t>
+            </w:r>
           </w:p>
         </w:tc>
         <w:tc>
           <w:tcPr>
             <w:tcW w:w="2340" w:type="dxa"/>
-          </w:tcPr>
-          <w:p>
-            <w:pPr>
-              <w:pStyle w:val="TableContents"/>
-              <w:rPr>
-                <w:rFonts w:ascii="Times New Roman" w:hAnsi="Times New Roman"/>
-              </w:rPr>
-            </w:pPr>
+            <w:tcBorders/>
+          </w:tcPr>
+          <w:p>
+            <w:pPr>
+              <w:pStyle w:val="TableContents"/>
+              <w:spacing w:before="0" w:after="160"/>
+              <w:rPr>
+                <w:rFonts w:ascii="Times New Roman" w:hAnsi="Times New Roman"/>
+              </w:rPr>
+            </w:pPr>
+            <w:r>
+              <w:rPr>
+                <w:rFonts w:ascii="Times New Roman" w:hAnsi="Times New Roman"/>
+              </w:rPr>
+              <w:t>Player Movement and Camera Controls</w:t>
+            </w:r>
           </w:p>
         </w:tc>
       </w:tr>
       <w:tr>
+        <w:trPr/>
         <w:tc>
           <w:tcPr>
             <w:tcW w:w="2339" w:type="dxa"/>
-          </w:tcPr>
-          <w:p>
-            <w:pPr>
-              <w:pStyle w:val="TableContents"/>
+            <w:tcBorders/>
+          </w:tcPr>
+          <w:p>
+            <w:pPr>
+              <w:pStyle w:val="TableContents"/>
+              <w:spacing w:before="0" w:after="160"/>
               <w:rPr>
                 <w:rFonts w:ascii="Times New Roman" w:hAnsi="Times New Roman"/>
               </w:rPr>
@@ -1928,10 +1838,12 @@
         <w:tc>
           <w:tcPr>
             <w:tcW w:w="2340" w:type="dxa"/>
-          </w:tcPr>
-          <w:p>
-            <w:pPr>
-              <w:pStyle w:val="TableContents"/>
+            <w:tcBorders/>
+          </w:tcPr>
+          <w:p>
+            <w:pPr>
+              <w:pStyle w:val="TableContents"/>
+              <w:spacing w:before="0" w:after="160"/>
               <w:rPr>
                 <w:rFonts w:ascii="Times New Roman" w:hAnsi="Times New Roman"/>
               </w:rPr>
@@ -1947,188 +1859,117 @@
         <w:tc>
           <w:tcPr>
             <w:tcW w:w="2340" w:type="dxa"/>
-          </w:tcPr>
-          <w:p>
-            <w:pPr>
-              <w:pStyle w:val="TableContents"/>
-              <w:rPr>
-                <w:rFonts w:ascii="Times New Roman" w:hAnsi="Times New Roman"/>
-              </w:rPr>
-            </w:pPr>
-            <w:r>
-              <w:rPr>
-                <w:rFonts w:ascii="Times New Roman" w:hAnsi="Times New Roman"/>
-              </w:rPr>
-              <w:t>Source/</w:t>
-            </w:r>
-            <w:proofErr w:type="spellStart"/>
-            <w:r>
-              <w:rPr>
-                <w:rFonts w:ascii="Times New Roman" w:hAnsi="Times New Roman"/>
-              </w:rPr>
-              <w:t>LostandAlone</w:t>
-            </w:r>
-            <w:proofErr w:type="spellEnd"/>
-            <w:r>
-              <w:rPr>
-                <w:rFonts w:ascii="Times New Roman" w:hAnsi="Times New Roman"/>
-              </w:rPr>
-              <w:t>/P</w:t>
-            </w:r>
-            <w:r>
-              <w:rPr>
-                <w:rFonts w:ascii="Times New Roman" w:hAnsi="Times New Roman"/>
-              </w:rPr>
-              <w:lastRenderedPageBreak/>
-              <w:t>rivate/LAPlayer.cpp</w:t>
-            </w:r>
-          </w:p>
-          <w:p>
-            <w:pPr>
-              <w:pStyle w:val="TableContents"/>
-              <w:rPr>
-                <w:rFonts w:ascii="Times New Roman" w:hAnsi="Times New Roman"/>
-              </w:rPr>
-            </w:pPr>
-            <w:r>
-              <w:rPr>
-                <w:rFonts w:ascii="Times New Roman" w:hAnsi="Times New Roman"/>
-              </w:rPr>
-              <w:t xml:space="preserve">In the </w:t>
-            </w:r>
-            <w:proofErr w:type="spellStart"/>
-            <w:r>
-              <w:rPr>
-                <w:rFonts w:ascii="Times New Roman" w:hAnsi="Times New Roman"/>
-              </w:rPr>
-              <w:t>OnOverlapBegin</w:t>
-            </w:r>
-            <w:proofErr w:type="spellEnd"/>
-            <w:r>
-              <w:rPr>
-                <w:rFonts w:ascii="Times New Roman" w:hAnsi="Times New Roman"/>
-              </w:rPr>
-              <w:t xml:space="preserve"> function at bottom o</w:t>
-            </w:r>
-            <w:r>
-              <w:rPr>
-                <w:rFonts w:ascii="Times New Roman" w:hAnsi="Times New Roman"/>
-              </w:rPr>
-              <w:t>f</w:t>
-            </w:r>
-            <w:r>
-              <w:rPr>
-                <w:rFonts w:ascii="Times New Roman" w:hAnsi="Times New Roman"/>
-              </w:rPr>
-              <w:t xml:space="preserve"> file.</w:t>
-            </w:r>
-          </w:p>
-          <w:p>
-            <w:pPr>
-              <w:pStyle w:val="TableContents"/>
-              <w:rPr>
-                <w:rFonts w:ascii="Times New Roman" w:hAnsi="Times New Roman"/>
-              </w:rPr>
-            </w:pPr>
-            <w:r>
-              <w:rPr>
-                <w:rFonts w:ascii="Times New Roman" w:hAnsi="Times New Roman"/>
-              </w:rPr>
-              <w:t>Source/</w:t>
-            </w:r>
-            <w:proofErr w:type="spellStart"/>
-            <w:r>
-              <w:rPr>
-                <w:rFonts w:ascii="Times New Roman" w:hAnsi="Times New Roman"/>
-              </w:rPr>
-              <w:t>LostandAlone</w:t>
-            </w:r>
-            <w:proofErr w:type="spellEnd"/>
-            <w:r>
-              <w:rPr>
-                <w:rFonts w:ascii="Times New Roman" w:hAnsi="Times New Roman"/>
-              </w:rPr>
-              <w:t>/Private/LAPlayerGameMade.cpp</w:t>
+            <w:tcBorders/>
+          </w:tcPr>
+          <w:p>
+            <w:pPr>
+              <w:pStyle w:val="TableContents"/>
+              <w:rPr>
+                <w:rFonts w:ascii="Times New Roman" w:hAnsi="Times New Roman"/>
+              </w:rPr>
+            </w:pPr>
+            <w:r>
+              <w:rPr>
+                <w:rFonts w:ascii="Times New Roman" w:hAnsi="Times New Roman"/>
+              </w:rPr>
+              <w:t>Source/LostandAlone/Private/LAPlayer.cpp</w:t>
+            </w:r>
+          </w:p>
+          <w:p>
+            <w:pPr>
+              <w:pStyle w:val="TableContents"/>
+              <w:rPr>
+                <w:rFonts w:ascii="Times New Roman" w:hAnsi="Times New Roman"/>
+              </w:rPr>
+            </w:pPr>
+            <w:r>
+              <w:rPr>
+                <w:rFonts w:ascii="Times New Roman" w:hAnsi="Times New Roman"/>
+              </w:rPr>
+              <w:t>In the OnOverlapBegin function at bottom of file.</w:t>
+            </w:r>
+          </w:p>
+          <w:p>
+            <w:pPr>
+              <w:pStyle w:val="TableContents"/>
+              <w:spacing w:before="0" w:after="160"/>
+              <w:rPr>
+                <w:rFonts w:ascii="Times New Roman" w:hAnsi="Times New Roman"/>
+              </w:rPr>
+            </w:pPr>
+            <w:r>
+              <w:rPr>
+                <w:rFonts w:ascii="Times New Roman" w:hAnsi="Times New Roman"/>
+              </w:rPr>
             </w:r>
           </w:p>
         </w:tc>
         <w:tc>
           <w:tcPr>
             <w:tcW w:w="2340" w:type="dxa"/>
-          </w:tcPr>
-          <w:p>
-            <w:pPr>
-              <w:pStyle w:val="TableContents"/>
-              <w:rPr>
-                <w:rFonts w:ascii="Times New Roman" w:hAnsi="Times New Roman"/>
-              </w:rPr>
-            </w:pPr>
-            <w:r>
-              <w:rPr>
-                <w:rFonts w:ascii="Times New Roman" w:hAnsi="Times New Roman"/>
-              </w:rPr>
-              <w:lastRenderedPageBreak/>
-              <w:t xml:space="preserve">This function is when the player hits a care </w:t>
-            </w:r>
-            <w:r>
-              <w:rPr>
-                <w:rFonts w:ascii="Times New Roman" w:hAnsi="Times New Roman"/>
-              </w:rPr>
-              <w:lastRenderedPageBreak/>
-              <w:t xml:space="preserve">package object. Then adds the items inside to the </w:t>
-            </w:r>
-            <w:proofErr w:type="gramStart"/>
-            <w:r>
-              <w:rPr>
-                <w:rFonts w:ascii="Times New Roman" w:hAnsi="Times New Roman"/>
-              </w:rPr>
-              <w:t>players</w:t>
-            </w:r>
-            <w:proofErr w:type="gramEnd"/>
-            <w:r>
-              <w:rPr>
-                <w:rFonts w:ascii="Times New Roman" w:hAnsi="Times New Roman"/>
-              </w:rPr>
-              <w:t xml:space="preserve"> inventory.</w:t>
-            </w:r>
-          </w:p>
-          <w:p>
-            <w:pPr>
-              <w:pStyle w:val="TableContents"/>
-              <w:rPr>
-                <w:rFonts w:ascii="Times New Roman" w:hAnsi="Times New Roman"/>
-              </w:rPr>
-            </w:pPr>
-            <w:r>
-              <w:rPr>
-                <w:rFonts w:ascii="Times New Roman" w:hAnsi="Times New Roman"/>
-              </w:rPr>
-              <w:t>Sets the default pawn as the player in the game world</w:t>
+            <w:tcBorders/>
+          </w:tcPr>
+          <w:p>
+            <w:pPr>
+              <w:pStyle w:val="TableContents"/>
+              <w:rPr>
+                <w:rFonts w:ascii="Times New Roman" w:hAnsi="Times New Roman"/>
+              </w:rPr>
+            </w:pPr>
+            <w:r>
+              <w:rPr>
+                <w:rFonts w:ascii="Times New Roman" w:hAnsi="Times New Roman"/>
+              </w:rPr>
+              <w:t>This function is when the player hits a care package object. Then adds the items inside to the players inventory.</w:t>
+            </w:r>
+          </w:p>
+          <w:p>
+            <w:pPr>
+              <w:pStyle w:val="TableContents"/>
+              <w:spacing w:before="0" w:after="160"/>
+              <w:rPr>
+                <w:rFonts w:ascii="Times New Roman" w:hAnsi="Times New Roman"/>
+              </w:rPr>
+            </w:pPr>
+            <w:r>
+              <w:rPr>
+                <w:rFonts w:ascii="Times New Roman" w:hAnsi="Times New Roman"/>
+              </w:rPr>
             </w:r>
           </w:p>
         </w:tc>
       </w:tr>
       <w:tr>
+        <w:trPr/>
         <w:tc>
           <w:tcPr>
             <w:tcW w:w="2339" w:type="dxa"/>
-          </w:tcPr>
-          <w:p>
-            <w:pPr>
-              <w:pStyle w:val="TableContents"/>
-              <w:rPr>
-                <w:rFonts w:ascii="Times New Roman" w:hAnsi="Times New Roman"/>
-              </w:rPr>
-            </w:pPr>
+            <w:tcBorders/>
+          </w:tcPr>
+          <w:p>
+            <w:pPr>
+              <w:pStyle w:val="TableContents"/>
+              <w:spacing w:before="0" w:after="160"/>
+              <w:rPr>
+                <w:rFonts w:ascii="Times New Roman" w:hAnsi="Times New Roman"/>
+              </w:rPr>
+            </w:pPr>
+            <w:r>
+              <w:rPr>
+                <w:rFonts w:ascii="Times New Roman" w:hAnsi="Times New Roman"/>
+              </w:rPr>
+            </w:r>
           </w:p>
         </w:tc>
         <w:tc>
           <w:tcPr>
             <w:tcW w:w="2340" w:type="dxa"/>
-          </w:tcPr>
-          <w:p>
-            <w:pPr>
-              <w:pStyle w:val="TableContents"/>
+            <w:tcBorders/>
+          </w:tcPr>
+          <w:p>
+            <w:pPr>
+              <w:pStyle w:val="TableContents"/>
+              <w:spacing w:before="0" w:after="160"/>
               <w:rPr>
                 <w:rFonts w:ascii="Times New Roman" w:hAnsi="Times New Roman"/>
               </w:rPr>
@@ -2144,41 +1985,59 @@
         <w:tc>
           <w:tcPr>
             <w:tcW w:w="2340" w:type="dxa"/>
-          </w:tcPr>
-          <w:p>
-            <w:pPr>
-              <w:pStyle w:val="TableContents"/>
-              <w:rPr>
-                <w:rFonts w:ascii="Times New Roman" w:hAnsi="Times New Roman"/>
-              </w:rPr>
-            </w:pPr>
+            <w:tcBorders/>
+          </w:tcPr>
+          <w:p>
+            <w:pPr>
+              <w:pStyle w:val="TableContents"/>
+              <w:spacing w:before="0" w:after="160"/>
+              <w:rPr>
+                <w:rFonts w:ascii="Times New Roman" w:hAnsi="Times New Roman"/>
+              </w:rPr>
+            </w:pPr>
+            <w:r>
+              <w:rPr>
+                <w:rFonts w:ascii="Times New Roman" w:hAnsi="Times New Roman"/>
+              </w:rPr>
+              <w:t>Source/LostandAlone/Private/LAPlayerGameMade.cpp</w:t>
+            </w:r>
           </w:p>
         </w:tc>
         <w:tc>
           <w:tcPr>
             <w:tcW w:w="2340" w:type="dxa"/>
-          </w:tcPr>
-          <w:p>
-            <w:pPr>
-              <w:pStyle w:val="TableContents"/>
-              <w:rPr>
-                <w:rFonts w:ascii="Times New Roman" w:hAnsi="Times New Roman"/>
-              </w:rPr>
-            </w:pPr>
+            <w:tcBorders/>
+          </w:tcPr>
+          <w:p>
+            <w:pPr>
+              <w:pStyle w:val="TableContents"/>
+              <w:spacing w:before="0" w:after="160"/>
+              <w:rPr>
+                <w:rFonts w:ascii="Times New Roman" w:hAnsi="Times New Roman"/>
+              </w:rPr>
+            </w:pPr>
+            <w:r>
+              <w:rPr>
+                <w:rFonts w:ascii="Times New Roman" w:hAnsi="Times New Roman"/>
+              </w:rPr>
+              <w:t>Sets the default pawn as the player in the game world</w:t>
+            </w:r>
           </w:p>
         </w:tc>
       </w:tr>
       <w:tr>
         <w:trPr>
-          <w:trHeight w:val="500"/>
+          <w:trHeight w:val="500" w:hRule="atLeast"/>
         </w:trPr>
         <w:tc>
           <w:tcPr>
             <w:tcW w:w="2339" w:type="dxa"/>
-          </w:tcPr>
-          <w:p>
-            <w:pPr>
-              <w:pStyle w:val="TableContents"/>
+            <w:tcBorders/>
+          </w:tcPr>
+          <w:p>
+            <w:pPr>
+              <w:pStyle w:val="TableContents"/>
+              <w:spacing w:before="0" w:after="160"/>
               <w:rPr>
                 <w:rFonts w:ascii="Times New Roman" w:hAnsi="Times New Roman"/>
               </w:rPr>
@@ -2194,10 +2053,12 @@
         <w:tc>
           <w:tcPr>
             <w:tcW w:w="2340" w:type="dxa"/>
-          </w:tcPr>
-          <w:p>
-            <w:pPr>
-              <w:pStyle w:val="TableContents"/>
+            <w:tcBorders/>
+          </w:tcPr>
+          <w:p>
+            <w:pPr>
+              <w:pStyle w:val="TableContents"/>
+              <w:spacing w:before="0" w:after="160"/>
               <w:rPr>
                 <w:rFonts w:ascii="Times New Roman" w:hAnsi="Times New Roman"/>
               </w:rPr>
@@ -2213,38 +2074,21 @@
         <w:tc>
           <w:tcPr>
             <w:tcW w:w="2340" w:type="dxa"/>
-          </w:tcPr>
-          <w:p>
-            <w:pPr>
-              <w:pStyle w:val="TableContents"/>
-              <w:rPr>
-                <w:rFonts w:ascii="Times New Roman" w:hAnsi="Times New Roman"/>
-              </w:rPr>
-            </w:pPr>
-            <w:r>
-              <w:rPr>
-                <w:rFonts w:ascii="Times New Roman" w:hAnsi="Times New Roman"/>
-              </w:rPr>
-              <w:t>Source/</w:t>
-            </w:r>
-            <w:proofErr w:type="spellStart"/>
-            <w:r>
-              <w:rPr>
-                <w:rFonts w:ascii="Times New Roman" w:hAnsi="Times New Roman"/>
-              </w:rPr>
-              <w:t>LostandAlone</w:t>
-            </w:r>
-            <w:proofErr w:type="spellEnd"/>
-            <w:r>
-              <w:rPr>
-                <w:rFonts w:ascii="Times New Roman" w:hAnsi="Times New Roman"/>
-              </w:rPr>
-              <w:t>/Private/LAPlayer.cpp</w:t>
-            </w:r>
-            <w:r>
-              <w:rPr>
-                <w:rFonts w:ascii="Times New Roman" w:hAnsi="Times New Roman"/>
-              </w:rPr>
+            <w:tcBorders/>
+          </w:tcPr>
+          <w:p>
+            <w:pPr>
+              <w:pStyle w:val="TableContents"/>
+              <w:spacing w:before="0" w:after="160"/>
+              <w:rPr>
+                <w:rFonts w:ascii="Times New Roman" w:hAnsi="Times New Roman"/>
+              </w:rPr>
+            </w:pPr>
+            <w:r>
+              <w:rPr>
+                <w:rFonts w:ascii="Times New Roman" w:hAnsi="Times New Roman"/>
+              </w:rPr>
+              <w:t>Source/LostandAlone/Private/LAPlayer.cpp</w:t>
               <w:br/>
               <w:t>In the Tick function</w:t>
             </w:r>
@@ -2253,53 +2097,58 @@
         <w:tc>
           <w:tcPr>
             <w:tcW w:w="2340" w:type="dxa"/>
-          </w:tcPr>
-          <w:p>
-            <w:pPr>
-              <w:pStyle w:val="TableContents"/>
-              <w:rPr>
-                <w:rFonts w:ascii="Times New Roman" w:hAnsi="Times New Roman"/>
-              </w:rPr>
-            </w:pPr>
-            <w:r>
-              <w:rPr>
-                <w:rFonts w:ascii="Times New Roman" w:hAnsi="Times New Roman"/>
-              </w:rPr>
-              <w:t xml:space="preserve">This function combines strings into a large string which is shown on the screen. It </w:t>
-            </w:r>
-            <w:r>
-              <w:rPr>
-                <w:rFonts w:ascii="Times New Roman" w:hAnsi="Times New Roman"/>
-              </w:rPr>
-              <w:t>consists of the player’s vitals, player’s inventory and player’s location.</w:t>
+            <w:tcBorders/>
+          </w:tcPr>
+          <w:p>
+            <w:pPr>
+              <w:pStyle w:val="TableContents"/>
+              <w:spacing w:before="0" w:after="160"/>
+              <w:rPr>
+                <w:rFonts w:ascii="Times New Roman" w:hAnsi="Times New Roman"/>
+              </w:rPr>
+            </w:pPr>
+            <w:r>
+              <w:rPr>
+                <w:rFonts w:ascii="Times New Roman" w:hAnsi="Times New Roman"/>
+              </w:rPr>
+              <w:t>This function combines strings into a large string which is shown on the screen. It consists of the player’s vitals, player’s inventory and player’s location.</w:t>
             </w:r>
           </w:p>
         </w:tc>
       </w:tr>
       <w:tr>
         <w:trPr>
-          <w:trHeight w:val="615"/>
+          <w:trHeight w:val="615" w:hRule="atLeast"/>
         </w:trPr>
         <w:tc>
           <w:tcPr>
             <w:tcW w:w="2339" w:type="dxa"/>
-          </w:tcPr>
-          <w:p>
-            <w:pPr>
-              <w:pStyle w:val="TableContents"/>
-              <w:rPr>
-                <w:rFonts w:ascii="Times New Roman" w:hAnsi="Times New Roman"/>
-              </w:rPr>
-            </w:pPr>
+            <w:tcBorders/>
+          </w:tcPr>
+          <w:p>
+            <w:pPr>
+              <w:pStyle w:val="TableContents"/>
+              <w:spacing w:before="0" w:after="160"/>
+              <w:rPr>
+                <w:rFonts w:ascii="Times New Roman" w:hAnsi="Times New Roman"/>
+              </w:rPr>
+            </w:pPr>
+            <w:r>
+              <w:rPr>
+                <w:rFonts w:ascii="Times New Roman" w:hAnsi="Times New Roman"/>
+              </w:rPr>
+            </w:r>
           </w:p>
         </w:tc>
         <w:tc>
           <w:tcPr>
             <w:tcW w:w="2340" w:type="dxa"/>
-          </w:tcPr>
-          <w:p>
-            <w:pPr>
-              <w:pStyle w:val="TableContents"/>
+            <w:tcBorders/>
+          </w:tcPr>
+          <w:p>
+            <w:pPr>
+              <w:pStyle w:val="TableContents"/>
+              <w:spacing w:before="0" w:after="160"/>
               <w:rPr>
                 <w:rFonts w:ascii="Times New Roman" w:hAnsi="Times New Roman"/>
               </w:rPr>
@@ -2315,227 +2164,126 @@
         <w:tc>
           <w:tcPr>
             <w:tcW w:w="2340" w:type="dxa"/>
-          </w:tcPr>
-          <w:p>
-            <w:pPr>
-              <w:pStyle w:val="TableContents"/>
-              <w:rPr>
-                <w:rFonts w:ascii="Times New Roman" w:hAnsi="Times New Roman"/>
-              </w:rPr>
-            </w:pPr>
+            <w:tcBorders/>
+          </w:tcPr>
+          <w:p>
+            <w:pPr>
+              <w:pStyle w:val="TableContents"/>
+              <w:spacing w:before="0" w:after="160"/>
+              <w:rPr>
+                <w:rFonts w:ascii="Times New Roman" w:hAnsi="Times New Roman"/>
+              </w:rPr>
+            </w:pPr>
+            <w:r>
+              <w:rPr>
+                <w:rFonts w:ascii="Times New Roman" w:hAnsi="Times New Roman"/>
+              </w:rPr>
+            </w:r>
           </w:p>
         </w:tc>
         <w:tc>
           <w:tcPr>
             <w:tcW w:w="2340" w:type="dxa"/>
-          </w:tcPr>
-          <w:p>
-            <w:pPr>
-              <w:pStyle w:val="TableContents"/>
-              <w:rPr>
-                <w:rFonts w:ascii="Times New Roman" w:hAnsi="Times New Roman"/>
-              </w:rPr>
-            </w:pPr>
+            <w:tcBorders/>
+          </w:tcPr>
+          <w:p>
+            <w:pPr>
+              <w:pStyle w:val="TableContents"/>
+              <w:spacing w:before="0" w:after="160"/>
+              <w:rPr>
+                <w:rFonts w:ascii="Times New Roman" w:hAnsi="Times New Roman"/>
+              </w:rPr>
+            </w:pPr>
+            <w:r>
+              <w:rPr>
+                <w:rFonts w:ascii="Times New Roman" w:hAnsi="Times New Roman"/>
+              </w:rPr>
+            </w:r>
           </w:p>
         </w:tc>
       </w:tr>
     </w:tbl>
     <w:p>
       <w:pPr>
-        <w:spacing w:line="240" w:lineRule="auto"/>
+        <w:pStyle w:val="Normal"/>
+        <w:spacing w:lineRule="auto" w:line="240"/>
         <w:rPr>
           <w:rFonts w:ascii="Times New Roman" w:hAnsi="Times New Roman" w:cs="Times New Roman"/>
         </w:rPr>
       </w:pPr>
+      <w:r>
+        <w:rPr>
+          <w:rFonts w:cs="Times New Roman" w:ascii="Times New Roman" w:hAnsi="Times New Roman"/>
+        </w:rPr>
+      </w:r>
     </w:p>
     <w:p>
       <w:pPr>
-        <w:spacing w:line="240" w:lineRule="auto"/>
+        <w:pStyle w:val="Normal"/>
+        <w:spacing w:lineRule="auto" w:line="240"/>
         <w:rPr>
           <w:rFonts w:ascii="Times New Roman" w:hAnsi="Times New Roman" w:cs="Times New Roman"/>
         </w:rPr>
       </w:pPr>
+      <w:r>
+        <w:rPr>
+          <w:rFonts w:cs="Times New Roman" w:ascii="Times New Roman" w:hAnsi="Times New Roman"/>
+        </w:rPr>
+      </w:r>
     </w:p>
     <w:p>
       <w:pPr>
-        <w:spacing w:line="240" w:lineRule="auto"/>
+        <w:pStyle w:val="Normal"/>
+        <w:spacing w:lineRule="auto" w:line="240"/>
         <w:jc w:val="center"/>
         <w:rPr>
-          <w:rFonts w:ascii="Times New Roman" w:hAnsi="Times New Roman" w:cs="Times New Roman"/>
+          <w:rFonts w:ascii="Times New Roman" w:hAnsi="Times New Roman"/>
+        </w:rPr>
+      </w:pPr>
+      <w:r>
+        <w:rPr>
+          <w:rFonts w:cs="Times New Roman" w:ascii="Times New Roman" w:hAnsi="Times New Roman"/>
           <w:b/>
           <w:bCs/>
           <w:sz w:val="48"/>
           <w:szCs w:val="48"/>
         </w:rPr>
-      </w:pPr>
-      <w:r>
-        <w:rPr>
-          <w:rFonts w:ascii="Times New Roman" w:hAnsi="Times New Roman" w:cs="Times New Roman"/>
-          <w:b/>
-          <w:bCs/>
-          <w:sz w:val="48"/>
-          <w:szCs w:val="48"/>
-        </w:rPr>
         <w:t>GITHUB LINK</w:t>
       </w:r>
     </w:p>
     <w:p>
       <w:pPr>
-        <w:spacing w:line="240" w:lineRule="auto"/>
+        <w:pStyle w:val="Normal"/>
+        <w:spacing w:lineRule="auto" w:line="240" w:before="0" w:after="160"/>
         <w:jc w:val="center"/>
-        <w:rPr>
-          <w:rFonts w:ascii="Times New Roman" w:hAnsi="Times New Roman" w:cs="Times New Roman"/>
-        </w:rPr>
-      </w:pPr>
-      <w:hyperlink r:id="rId10">
+        <w:rPr/>
+      </w:pPr>
+      <w:hyperlink r:id="rId7">
         <w:r>
           <w:rPr>
             <w:rStyle w:val="Hyperlink"/>
-            <w:rFonts w:ascii="Times New Roman" w:hAnsi="Times New Roman" w:cs="Times New Roman"/>
+            <w:rFonts w:cs="Times New Roman" w:ascii="Times New Roman" w:hAnsi="Times New Roman"/>
           </w:rPr>
           <w:t>https://github.com/amchart2/LostandAlone</w:t>
         </w:r>
       </w:hyperlink>
     </w:p>
     <w:sectPr>
+      <w:type w:val="nextPage"/>
       <w:pgSz w:w="12240" w:h="15840"/>
-      <w:pgMar w:top="1440" w:right="1440" w:bottom="1440" w:left="1440" w:header="0" w:footer="0" w:gutter="0"/>
-      <w:cols w:space="720"/>
-      <w:formProt w:val="0"/>
-      <w:docGrid w:linePitch="360"/>
+      <w:pgMar w:left="1440" w:right="1440" w:gutter="0" w:header="0" w:top="1440" w:footer="0" w:bottom="1440"/>
+      <w:pgNumType w:fmt="decimal"/>
+      <w:formProt w:val="false"/>
+      <w:textDirection w:val="lrTb"/>
+      <w:docGrid w:type="default" w:linePitch="360" w:charSpace="0"/>
     </w:sectPr>
   </w:body>
 </w:document>
 </file>
 
 <file path=word/numbering.xml><?xml version="1.0" encoding="utf-8"?>
-<w:numbering xmlns:wpc="http://schemas.microsoft.com/office/word/2010/wordprocessingCanvas" xmlns:cx="http://schemas.microsoft.com/office/drawing/2014/chartex" xmlns:cx1="http://schemas.microsoft.com/office/drawing/2015/9/8/chartex" xmlns:cx2="http://schemas.microsoft.com/office/drawing/2015/10/21/chartex" xmlns:cx3="http://schemas.microsoft.com/office/drawing/2016/5/9/chartex" xmlns:cx4="http://schemas.microsoft.com/office/drawing/2016/5/10/chartex" xmlns:cx5="http://schemas.microsoft.com/office/drawing/2016/5/11/chartex" xmlns:cx6="http://schemas.microsoft.com/office/drawing/2016/5/12/chartex" xmlns:cx7="http://schemas.microsoft.com/office/drawing/2016/5/13/chartex" xmlns:cx8="http://schemas.microsoft.com/office/drawing/2016/5/14/chartex" xmlns:mc="http://schemas.openxmlformats.org/markup-compatibility/2006" xmlns:aink="http://schemas.microsoft.com/office/drawing/2016/ink" xmlns:am3d="http://schemas.microsoft.com/office/drawing/2017/model3d" xmlns:o="urn:schemas-microsoft-com:office:office" xmlns:oel="http://schemas.microsoft.com/office/2019/extlst" xmlns:r="http://schemas.openxmlformats.org/officeDocument/2006/relationships" xmlns:m="http://schemas.openxmlformats.org/officeDocument/2006/math" xmlns:v="urn:schemas-microsoft-com:vml" xmlns:wp14="http://schemas.microsoft.com/office/word/2010/wordprocessingDrawing" xmlns:wp="http://schemas.openxmlformats.org/drawingml/2006/wordprocessingDrawing" xmlns:w10="urn:schemas-microsoft-com:office:word" xmlns:w="http://schemas.openxmlformats.org/wordprocessingml/2006/main" xmlns:w14="http://schemas.microsoft.com/office/word/2010/wordml" xmlns:w15="http://schemas.microsoft.com/office/word/2012/wordml" xmlns:w16cex="http://schemas.microsoft.com/office/word/2018/wordml/cex" xmlns:w16cid="http://schemas.microsoft.com/office/word/2016/wordml/cid" xmlns:w16="http://schemas.microsoft.com/office/word/2018/wordml" xmlns:w16du="http://schemas.microsoft.com/office/word/2023/wordml/word16du" xmlns:w16sdtdh="http://schemas.microsoft.com/office/word/2020/wordml/sdtdatahash" xmlns:w16sdtfl="http://schemas.microsoft.com/office/word/2024/wordml/sdtformatlock" xmlns:w16se="http://schemas.microsoft.com/office/word/2015/wordml/symex" xmlns:wpg="http://schemas.microsoft.com/office/word/2010/wordprocessingGroup" xmlns:wpi="http://schemas.microsoft.com/office/word/2010/wordprocessingInk" xmlns:wne="http://schemas.microsoft.com/office/word/2006/wordml" xmlns:wps="http://schemas.microsoft.com/office/word/2010/wordprocessingShape" mc:Ignorable="w14 w15 w16se w16cid w16 w16cex w16sdtdh w16sdtfl w16du wp14">
-  <w:abstractNum w:abstractNumId="0" w15:restartNumberingAfterBreak="0">
-    <w:nsid w:val="18843F38"/>
-    <w:multiLevelType w:val="multilevel"/>
-    <w:tmpl w:val="0AB07850"/>
-    <w:lvl w:ilvl="0">
-      <w:start w:val="1"/>
-      <w:numFmt w:val="none"/>
-      <w:suff w:val="nothing"/>
-      <w:lvlText w:val=""/>
-      <w:lvlJc w:val="left"/>
-      <w:pPr>
-        <w:tabs>
-          <w:tab w:val="num" w:pos="0"/>
-        </w:tabs>
-        <w:ind w:left="0" w:firstLine="0"/>
-      </w:pPr>
-    </w:lvl>
-    <w:lvl w:ilvl="1">
-      <w:start w:val="1"/>
-      <w:numFmt w:val="none"/>
-      <w:suff w:val="nothing"/>
-      <w:lvlText w:val=""/>
-      <w:lvlJc w:val="left"/>
-      <w:pPr>
-        <w:tabs>
-          <w:tab w:val="num" w:pos="0"/>
-        </w:tabs>
-        <w:ind w:left="0" w:firstLine="0"/>
-      </w:pPr>
-    </w:lvl>
-    <w:lvl w:ilvl="2">
-      <w:start w:val="1"/>
-      <w:numFmt w:val="none"/>
-      <w:suff w:val="nothing"/>
-      <w:lvlText w:val=""/>
-      <w:lvlJc w:val="left"/>
-      <w:pPr>
-        <w:tabs>
-          <w:tab w:val="num" w:pos="0"/>
-        </w:tabs>
-        <w:ind w:left="0" w:firstLine="0"/>
-      </w:pPr>
-    </w:lvl>
-    <w:lvl w:ilvl="3">
-      <w:start w:val="1"/>
-      <w:numFmt w:val="none"/>
-      <w:suff w:val="nothing"/>
-      <w:lvlText w:val=""/>
-      <w:lvlJc w:val="left"/>
-      <w:pPr>
-        <w:tabs>
-          <w:tab w:val="num" w:pos="0"/>
-        </w:tabs>
-        <w:ind w:left="0" w:firstLine="0"/>
-      </w:pPr>
-    </w:lvl>
-    <w:lvl w:ilvl="4">
-      <w:start w:val="1"/>
-      <w:numFmt w:val="none"/>
-      <w:suff w:val="nothing"/>
-      <w:lvlText w:val=""/>
-      <w:lvlJc w:val="left"/>
-      <w:pPr>
-        <w:tabs>
-          <w:tab w:val="num" w:pos="0"/>
-        </w:tabs>
-        <w:ind w:left="0" w:firstLine="0"/>
-      </w:pPr>
-    </w:lvl>
-    <w:lvl w:ilvl="5">
-      <w:start w:val="1"/>
-      <w:numFmt w:val="none"/>
-      <w:suff w:val="nothing"/>
-      <w:lvlText w:val=""/>
-      <w:lvlJc w:val="left"/>
-      <w:pPr>
-        <w:tabs>
-          <w:tab w:val="num" w:pos="0"/>
-        </w:tabs>
-        <w:ind w:left="0" w:firstLine="0"/>
-      </w:pPr>
-    </w:lvl>
-    <w:lvl w:ilvl="6">
-      <w:start w:val="1"/>
-      <w:numFmt w:val="none"/>
-      <w:suff w:val="nothing"/>
-      <w:lvlText w:val=""/>
-      <w:lvlJc w:val="left"/>
-      <w:pPr>
-        <w:tabs>
-          <w:tab w:val="num" w:pos="0"/>
-        </w:tabs>
-        <w:ind w:left="0" w:firstLine="0"/>
-      </w:pPr>
-    </w:lvl>
-    <w:lvl w:ilvl="7">
-      <w:start w:val="1"/>
-      <w:numFmt w:val="none"/>
-      <w:suff w:val="nothing"/>
-      <w:lvlText w:val=""/>
-      <w:lvlJc w:val="left"/>
-      <w:pPr>
-        <w:tabs>
-          <w:tab w:val="num" w:pos="0"/>
-        </w:tabs>
-        <w:ind w:left="0" w:firstLine="0"/>
-      </w:pPr>
-    </w:lvl>
-    <w:lvl w:ilvl="8">
-      <w:start w:val="1"/>
-      <w:numFmt w:val="none"/>
-      <w:suff w:val="nothing"/>
-      <w:lvlText w:val=""/>
-      <w:lvlJc w:val="left"/>
-      <w:pPr>
-        <w:tabs>
-          <w:tab w:val="num" w:pos="0"/>
-        </w:tabs>
-        <w:ind w:left="0" w:firstLine="0"/>
-      </w:pPr>
-    </w:lvl>
-  </w:abstractNum>
-  <w:abstractNum w:abstractNumId="1" w15:restartNumberingAfterBreak="0">
-    <w:nsid w:val="6F167022"/>
-    <w:multiLevelType w:val="multilevel"/>
-    <w:tmpl w:val="553C5BFC"/>
+<w:numbering xmlns:w="http://schemas.openxmlformats.org/wordprocessingml/2006/main" xmlns:o="urn:schemas-microsoft-com:office:office" xmlns:r="http://schemas.openxmlformats.org/officeDocument/2006/relationships" xmlns:v="urn:schemas-microsoft-com:vml" xmlns:mc="http://schemas.openxmlformats.org/markup-compatibility/2006" xmlns:w14="http://schemas.microsoft.com/office/word/2010/wordml" mc:Ignorable="w14">
+  <w:abstractNum w:abstractNumId="1">
     <w:lvl w:ilvl="0">
       <w:start w:val="1"/>
       <w:numFmt w:val="bullet"/>
@@ -2672,21 +2420,140 @@
       </w:rPr>
     </w:lvl>
   </w:abstractNum>
-  <w:num w:numId="1" w16cid:durableId="1357347979">
+  <w:abstractNum w:abstractNumId="2">
+    <w:lvl w:ilvl="0">
+      <w:start w:val="1"/>
+      <w:numFmt w:val="none"/>
+      <w:suff w:val="nothing"/>
+      <w:lvlText w:val=""/>
+      <w:lvlJc w:val="left"/>
+      <w:pPr>
+        <w:tabs>
+          <w:tab w:val="num" w:pos="0"/>
+        </w:tabs>
+        <w:ind w:left="0" w:hanging="0"/>
+      </w:pPr>
+    </w:lvl>
+    <w:lvl w:ilvl="1">
+      <w:start w:val="1"/>
+      <w:numFmt w:val="none"/>
+      <w:suff w:val="nothing"/>
+      <w:lvlText w:val=""/>
+      <w:lvlJc w:val="left"/>
+      <w:pPr>
+        <w:tabs>
+          <w:tab w:val="num" w:pos="0"/>
+        </w:tabs>
+        <w:ind w:left="0" w:hanging="0"/>
+      </w:pPr>
+    </w:lvl>
+    <w:lvl w:ilvl="2">
+      <w:start w:val="1"/>
+      <w:numFmt w:val="none"/>
+      <w:suff w:val="nothing"/>
+      <w:lvlText w:val=""/>
+      <w:lvlJc w:val="left"/>
+      <w:pPr>
+        <w:tabs>
+          <w:tab w:val="num" w:pos="0"/>
+        </w:tabs>
+        <w:ind w:left="0" w:hanging="0"/>
+      </w:pPr>
+    </w:lvl>
+    <w:lvl w:ilvl="3">
+      <w:start w:val="1"/>
+      <w:numFmt w:val="none"/>
+      <w:suff w:val="nothing"/>
+      <w:lvlText w:val=""/>
+      <w:lvlJc w:val="left"/>
+      <w:pPr>
+        <w:tabs>
+          <w:tab w:val="num" w:pos="0"/>
+        </w:tabs>
+        <w:ind w:left="0" w:hanging="0"/>
+      </w:pPr>
+    </w:lvl>
+    <w:lvl w:ilvl="4">
+      <w:start w:val="1"/>
+      <w:numFmt w:val="none"/>
+      <w:suff w:val="nothing"/>
+      <w:lvlText w:val=""/>
+      <w:lvlJc w:val="left"/>
+      <w:pPr>
+        <w:tabs>
+          <w:tab w:val="num" w:pos="0"/>
+        </w:tabs>
+        <w:ind w:left="0" w:hanging="0"/>
+      </w:pPr>
+    </w:lvl>
+    <w:lvl w:ilvl="5">
+      <w:start w:val="1"/>
+      <w:numFmt w:val="none"/>
+      <w:suff w:val="nothing"/>
+      <w:lvlText w:val=""/>
+      <w:lvlJc w:val="left"/>
+      <w:pPr>
+        <w:tabs>
+          <w:tab w:val="num" w:pos="0"/>
+        </w:tabs>
+        <w:ind w:left="0" w:hanging="0"/>
+      </w:pPr>
+    </w:lvl>
+    <w:lvl w:ilvl="6">
+      <w:start w:val="1"/>
+      <w:numFmt w:val="none"/>
+      <w:suff w:val="nothing"/>
+      <w:lvlText w:val=""/>
+      <w:lvlJc w:val="left"/>
+      <w:pPr>
+        <w:tabs>
+          <w:tab w:val="num" w:pos="0"/>
+        </w:tabs>
+        <w:ind w:left="0" w:hanging="0"/>
+      </w:pPr>
+    </w:lvl>
+    <w:lvl w:ilvl="7">
+      <w:start w:val="1"/>
+      <w:numFmt w:val="none"/>
+      <w:suff w:val="nothing"/>
+      <w:lvlText w:val=""/>
+      <w:lvlJc w:val="left"/>
+      <w:pPr>
+        <w:tabs>
+          <w:tab w:val="num" w:pos="0"/>
+        </w:tabs>
+        <w:ind w:left="0" w:hanging="0"/>
+      </w:pPr>
+    </w:lvl>
+    <w:lvl w:ilvl="8">
+      <w:start w:val="1"/>
+      <w:numFmt w:val="none"/>
+      <w:suff w:val="nothing"/>
+      <w:lvlText w:val=""/>
+      <w:lvlJc w:val="left"/>
+      <w:pPr>
+        <w:tabs>
+          <w:tab w:val="num" w:pos="0"/>
+        </w:tabs>
+        <w:ind w:left="0" w:hanging="0"/>
+      </w:pPr>
+    </w:lvl>
+  </w:abstractNum>
+  <w:num w:numId="1">
     <w:abstractNumId w:val="1"/>
   </w:num>
-  <w:num w:numId="2" w16cid:durableId="547186438">
-    <w:abstractNumId w:val="0"/>
+  <w:num w:numId="2">
+    <w:abstractNumId w:val="2"/>
   </w:num>
 </w:numbering>
 </file>
 
 <file path=word/styles.xml><?xml version="1.0" encoding="utf-8"?>
-<w:styles xmlns:mc="http://schemas.openxmlformats.org/markup-compatibility/2006" xmlns:r="http://schemas.openxmlformats.org/officeDocument/2006/relationships" xmlns:w="http://schemas.openxmlformats.org/wordprocessingml/2006/main" xmlns:w14="http://schemas.microsoft.com/office/word/2010/wordml" xmlns:w15="http://schemas.microsoft.com/office/word/2012/wordml" xmlns:w16cex="http://schemas.microsoft.com/office/word/2018/wordml/cex" xmlns:w16cid="http://schemas.microsoft.com/office/word/2016/wordml/cid" xmlns:w16="http://schemas.microsoft.com/office/word/2018/wordml" xmlns:w16du="http://schemas.microsoft.com/office/word/2023/wordml/word16du" xmlns:w16sdtdh="http://schemas.microsoft.com/office/word/2020/wordml/sdtdatahash" xmlns:w16sdtfl="http://schemas.microsoft.com/office/word/2024/wordml/sdtformatlock" xmlns:w16se="http://schemas.microsoft.com/office/word/2015/wordml/symex" mc:Ignorable="w14 w15 w16se w16cid w16 w16cex w16sdtdh w16sdtfl w16du">
+<w:styles xmlns:w="http://schemas.openxmlformats.org/wordprocessingml/2006/main" xmlns:w14="http://schemas.microsoft.com/office/word/2010/wordml" xmlns:mc="http://schemas.openxmlformats.org/markup-compatibility/2006" mc:Ignorable="w14">
   <w:docDefaults>
     <w:rPrDefault>
       <w:rPr>
-        <w:rFonts w:asciiTheme="minorHAnsi" w:eastAsiaTheme="minorHAnsi" w:hAnsiTheme="minorHAnsi" w:cstheme="minorBidi"/>
+        <w:rFonts w:ascii="Aptos" w:hAnsi="Aptos" w:eastAsia="Aptos" w:cs="" w:asciiTheme="minorHAnsi" w:cstheme="minorBidi" w:eastAsiaTheme="minorHAnsi" w:hAnsiTheme="minorHAnsi"/>
         <w:kern w:val="2"/>
         <w:sz w:val="24"/>
         <w:szCs w:val="24"/>
@@ -2696,21 +2563,21 @@
     </w:rPrDefault>
     <w:pPrDefault>
       <w:pPr>
-        <w:suppressAutoHyphens/>
+        <w:suppressAutoHyphens w:val="true"/>
       </w:pPr>
     </w:pPrDefault>
   </w:docDefaults>
   <w:latentStyles w:defLockedState="0" w:defUIPriority="99" w:defSemiHidden="0" w:defUnhideWhenUsed="0" w:defQFormat="0" w:count="376">
     <w:lsdException w:name="Normal" w:uiPriority="0" w:qFormat="1"/>
     <w:lsdException w:name="heading 1" w:uiPriority="9" w:qFormat="1"/>
-    <w:lsdException w:name="heading 2" w:semiHidden="1" w:uiPriority="9" w:unhideWhenUsed="1" w:qFormat="1"/>
-    <w:lsdException w:name="heading 3" w:semiHidden="1" w:uiPriority="9" w:unhideWhenUsed="1" w:qFormat="1"/>
-    <w:lsdException w:name="heading 4" w:semiHidden="1" w:uiPriority="9" w:unhideWhenUsed="1" w:qFormat="1"/>
-    <w:lsdException w:name="heading 5" w:semiHidden="1" w:uiPriority="9" w:unhideWhenUsed="1" w:qFormat="1"/>
-    <w:lsdException w:name="heading 6" w:semiHidden="1" w:uiPriority="9" w:unhideWhenUsed="1" w:qFormat="1"/>
-    <w:lsdException w:name="heading 7" w:semiHidden="1" w:uiPriority="9" w:unhideWhenUsed="1" w:qFormat="1"/>
-    <w:lsdException w:name="heading 8" w:semiHidden="1" w:uiPriority="9" w:unhideWhenUsed="1" w:qFormat="1"/>
-    <w:lsdException w:name="heading 9" w:semiHidden="1" w:uiPriority="9" w:unhideWhenUsed="1" w:qFormat="1"/>
+    <w:lsdException w:name="heading 2" w:uiPriority="9" w:semiHidden="1" w:unhideWhenUsed="1" w:qFormat="1"/>
+    <w:lsdException w:name="heading 3" w:uiPriority="9" w:semiHidden="1" w:unhideWhenUsed="1" w:qFormat="1"/>
+    <w:lsdException w:name="heading 4" w:uiPriority="9" w:semiHidden="1" w:unhideWhenUsed="1" w:qFormat="1"/>
+    <w:lsdException w:name="heading 5" w:uiPriority="9" w:semiHidden="1" w:unhideWhenUsed="1" w:qFormat="1"/>
+    <w:lsdException w:name="heading 6" w:uiPriority="9" w:semiHidden="1" w:unhideWhenUsed="1" w:qFormat="1"/>
+    <w:lsdException w:name="heading 7" w:uiPriority="9" w:semiHidden="1" w:unhideWhenUsed="1" w:qFormat="1"/>
+    <w:lsdException w:name="heading 8" w:uiPriority="9" w:semiHidden="1" w:unhideWhenUsed="1" w:qFormat="1"/>
+    <w:lsdException w:name="heading 9" w:uiPriority="9" w:semiHidden="1" w:unhideWhenUsed="1" w:qFormat="1"/>
     <w:lsdException w:name="index 1" w:semiHidden="1" w:unhideWhenUsed="1"/>
     <w:lsdException w:name="index 2" w:semiHidden="1" w:unhideWhenUsed="1"/>
     <w:lsdException w:name="index 3" w:semiHidden="1" w:unhideWhenUsed="1"/>
@@ -2720,22 +2587,22 @@
     <w:lsdException w:name="index 7" w:semiHidden="1" w:unhideWhenUsed="1"/>
     <w:lsdException w:name="index 8" w:semiHidden="1" w:unhideWhenUsed="1"/>
     <w:lsdException w:name="index 9" w:semiHidden="1" w:unhideWhenUsed="1"/>
-    <w:lsdException w:name="toc 1" w:semiHidden="1" w:uiPriority="39" w:unhideWhenUsed="1"/>
-    <w:lsdException w:name="toc 2" w:semiHidden="1" w:uiPriority="39" w:unhideWhenUsed="1"/>
-    <w:lsdException w:name="toc 3" w:semiHidden="1" w:uiPriority="39" w:unhideWhenUsed="1"/>
-    <w:lsdException w:name="toc 4" w:semiHidden="1" w:uiPriority="39" w:unhideWhenUsed="1"/>
-    <w:lsdException w:name="toc 5" w:semiHidden="1" w:uiPriority="39" w:unhideWhenUsed="1"/>
-    <w:lsdException w:name="toc 6" w:semiHidden="1" w:uiPriority="39" w:unhideWhenUsed="1"/>
-    <w:lsdException w:name="toc 7" w:semiHidden="1" w:uiPriority="39" w:unhideWhenUsed="1"/>
-    <w:lsdException w:name="toc 8" w:semiHidden="1" w:uiPriority="39" w:unhideWhenUsed="1"/>
-    <w:lsdException w:name="toc 9" w:semiHidden="1" w:uiPriority="39" w:unhideWhenUsed="1"/>
+    <w:lsdException w:name="toc 1" w:uiPriority="39" w:semiHidden="1" w:unhideWhenUsed="1"/>
+    <w:lsdException w:name="toc 2" w:uiPriority="39" w:semiHidden="1" w:unhideWhenUsed="1"/>
+    <w:lsdException w:name="toc 3" w:uiPriority="39" w:semiHidden="1" w:unhideWhenUsed="1"/>
+    <w:lsdException w:name="toc 4" w:uiPriority="39" w:semiHidden="1" w:unhideWhenUsed="1"/>
+    <w:lsdException w:name="toc 5" w:uiPriority="39" w:semiHidden="1" w:unhideWhenUsed="1"/>
+    <w:lsdException w:name="toc 6" w:uiPriority="39" w:semiHidden="1" w:unhideWhenUsed="1"/>
+    <w:lsdException w:name="toc 7" w:uiPriority="39" w:semiHidden="1" w:unhideWhenUsed="1"/>
+    <w:lsdException w:name="toc 8" w:uiPriority="39" w:semiHidden="1" w:unhideWhenUsed="1"/>
+    <w:lsdException w:name="toc 9" w:uiPriority="39" w:semiHidden="1" w:unhideWhenUsed="1"/>
     <w:lsdException w:name="Normal Indent" w:semiHidden="1" w:unhideWhenUsed="1"/>
     <w:lsdException w:name="footnote text" w:semiHidden="1" w:unhideWhenUsed="1"/>
     <w:lsdException w:name="annotation text" w:semiHidden="1" w:unhideWhenUsed="1"/>
     <w:lsdException w:name="header" w:semiHidden="1" w:unhideWhenUsed="1"/>
     <w:lsdException w:name="footer" w:semiHidden="1" w:unhideWhenUsed="1"/>
     <w:lsdException w:name="index heading" w:semiHidden="1" w:unhideWhenUsed="1"/>
-    <w:lsdException w:name="caption" w:semiHidden="1" w:uiPriority="35" w:unhideWhenUsed="1" w:qFormat="1"/>
+    <w:lsdException w:name="caption" w:uiPriority="35" w:semiHidden="1" w:unhideWhenUsed="1" w:qFormat="1"/>
     <w:lsdException w:name="table of figures" w:semiHidden="1" w:unhideWhenUsed="1"/>
     <w:lsdException w:name="envelope address" w:semiHidden="1" w:unhideWhenUsed="1"/>
     <w:lsdException w:name="envelope return" w:semiHidden="1" w:unhideWhenUsed="1"/>
@@ -2766,7 +2633,7 @@
     <w:lsdException w:name="Title" w:uiPriority="10" w:qFormat="1"/>
     <w:lsdException w:name="Closing" w:semiHidden="1" w:unhideWhenUsed="1"/>
     <w:lsdException w:name="Signature" w:semiHidden="1" w:unhideWhenUsed="1"/>
-    <w:lsdException w:name="Default Paragraph Font" w:semiHidden="1" w:uiPriority="1" w:unhideWhenUsed="1"/>
+    <w:lsdException w:name="Default Paragraph Font" w:uiPriority="1" w:semiHidden="1" w:unhideWhenUsed="1"/>
     <w:lsdException w:name="Body Text" w:semiHidden="1" w:unhideWhenUsed="1"/>
     <w:lsdException w:name="Body Text Indent" w:semiHidden="1" w:unhideWhenUsed="1"/>
     <w:lsdException w:name="List Continue" w:semiHidden="1" w:unhideWhenUsed="1"/>
@@ -2966,8 +2833,8 @@
     <w:lsdException w:name="Subtle Reference" w:uiPriority="31" w:qFormat="1"/>
     <w:lsdException w:name="Intense Reference" w:uiPriority="32" w:qFormat="1"/>
     <w:lsdException w:name="Book Title" w:uiPriority="33" w:qFormat="1"/>
-    <w:lsdException w:name="Bibliography" w:semiHidden="1" w:uiPriority="37" w:unhideWhenUsed="1"/>
-    <w:lsdException w:name="TOC Heading" w:semiHidden="1" w:uiPriority="39" w:unhideWhenUsed="1" w:qFormat="1"/>
+    <w:lsdException w:name="Bibliography" w:uiPriority="37" w:semiHidden="1" w:unhideWhenUsed="1"/>
+    <w:lsdException w:name="TOC Heading" w:uiPriority="39" w:semiHidden="1" w:unhideWhenUsed="1" w:qFormat="1"/>
     <w:lsdException w:name="Plain Table 1" w:uiPriority="41"/>
     <w:lsdException w:name="Plain Table 2" w:uiPriority="42"/>
     <w:lsdException w:name="Plain Table 3" w:uiPriority="43"/>
@@ -3078,36 +2945,49 @@
     <w:lsdException w:name="Unresolved Mention" w:semiHidden="1" w:unhideWhenUsed="1"/>
     <w:lsdException w:name="Smart Link" w:semiHidden="1" w:unhideWhenUsed="1"/>
   </w:latentStyles>
-  <w:style w:type="paragraph" w:default="1" w:styleId="Normal">
+  <w:style w:type="paragraph" w:styleId="Normal" w:default="1">
     <w:name w:val="Normal"/>
     <w:qFormat/>
     <w:pPr>
-      <w:spacing w:after="160" w:line="276" w:lineRule="auto"/>
+      <w:widowControl/>
+      <w:suppressAutoHyphens w:val="true"/>
+      <w:bidi w:val="0"/>
+      <w:spacing w:lineRule="auto" w:line="276" w:before="0" w:after="160"/>
+      <w:jc w:val="left"/>
     </w:pPr>
+    <w:rPr>
+      <w:rFonts w:ascii="Aptos" w:hAnsi="Aptos" w:eastAsia="Aptos" w:cs="" w:asciiTheme="minorHAnsi" w:cstheme="minorBidi" w:eastAsiaTheme="minorHAnsi" w:hAnsiTheme="minorHAnsi"/>
+      <w:color w:val="auto"/>
+      <w:kern w:val="2"/>
+      <w:sz w:val="24"/>
+      <w:szCs w:val="24"/>
+      <w:lang w:val="en-US" w:eastAsia="en-US" w:bidi="ar-SA"/>
+      <w14:ligatures w14:val="standardContextual"/>
+    </w:rPr>
   </w:style>
   <w:style w:type="paragraph" w:styleId="Heading1">
-    <w:name w:val="heading 1"/>
+    <w:name w:val="Heading 1"/>
     <w:basedOn w:val="Normal"/>
     <w:next w:val="Normal"/>
     <w:link w:val="Heading1Char"/>
     <w:uiPriority w:val="9"/>
     <w:qFormat/>
-    <w:rsid w:val="009B1249"/>
+    <w:rsid w:val="009b1249"/>
     <w:pPr>
-      <w:keepNext/>
+      <w:keepNext w:val="true"/>
       <w:keepLines/>
       <w:spacing w:before="360" w:after="80"/>
       <w:outlineLvl w:val="0"/>
     </w:pPr>
     <w:rPr>
-      <w:rFonts w:asciiTheme="majorHAnsi" w:eastAsiaTheme="majorEastAsia" w:hAnsiTheme="majorHAnsi" w:cstheme="majorBidi"/>
-      <w:color w:val="0F4761" w:themeColor="accent1" w:themeShade="BF"/>
+      <w:rFonts w:ascii="Aptos Display" w:hAnsi="Aptos Display" w:eastAsia="" w:cs="" w:asciiTheme="majorHAnsi" w:cstheme="majorBidi" w:eastAsiaTheme="majorEastAsia" w:hAnsiTheme="majorHAnsi"/>
+      <w:color w:themeColor="accent1" w:themeShade="bf" w:val="0F4761"/>
       <w:sz w:val="40"/>
       <w:szCs w:val="40"/>
     </w:rPr>
   </w:style>
   <w:style w:type="paragraph" w:styleId="Heading2">
-    <w:name w:val="heading 2"/>
+    <w:name w:val="Heading 2"/>
     <w:basedOn w:val="Normal"/>
     <w:next w:val="Normal"/>
     <w:link w:val="Heading2Char"/>
@@ -3115,22 +2995,22 @@
     <w:semiHidden/>
     <w:unhideWhenUsed/>
     <w:qFormat/>
-    <w:rsid w:val="009B1249"/>
+    <w:rsid w:val="009b1249"/>
     <w:pPr>
-      <w:keepNext/>
+      <w:keepNext w:val="true"/>
       <w:keepLines/>
       <w:spacing w:before="160" w:after="80"/>
       <w:outlineLvl w:val="1"/>
     </w:pPr>
     <w:rPr>
-      <w:rFonts w:asciiTheme="majorHAnsi" w:eastAsiaTheme="majorEastAsia" w:hAnsiTheme="majorHAnsi" w:cstheme="majorBidi"/>
-      <w:color w:val="0F4761" w:themeColor="accent1" w:themeShade="BF"/>
+      <w:rFonts w:ascii="Aptos Display" w:hAnsi="Aptos Display" w:eastAsia="" w:cs="" w:asciiTheme="majorHAnsi" w:cstheme="majorBidi" w:eastAsiaTheme="majorEastAsia" w:hAnsiTheme="majorHAnsi"/>
+      <w:color w:themeColor="accent1" w:themeShade="bf" w:val="0F4761"/>
       <w:sz w:val="32"/>
       <w:szCs w:val="32"/>
     </w:rPr>
   </w:style>
   <w:style w:type="paragraph" w:styleId="Heading3">
-    <w:name w:val="heading 3"/>
+    <w:name w:val="Heading 3"/>
     <w:basedOn w:val="Normal"/>
     <w:next w:val="Normal"/>
     <w:link w:val="Heading3Char"/>
@@ -3138,22 +3018,22 @@
     <w:semiHidden/>
     <w:unhideWhenUsed/>
     <w:qFormat/>
-    <w:rsid w:val="009B1249"/>
+    <w:rsid w:val="009b1249"/>
     <w:pPr>
-      <w:keepNext/>
+      <w:keepNext w:val="true"/>
       <w:keepLines/>
       <w:spacing w:before="160" w:after="80"/>
       <w:outlineLvl w:val="2"/>
     </w:pPr>
     <w:rPr>
-      <w:rFonts w:eastAsiaTheme="majorEastAsia" w:cstheme="majorBidi"/>
-      <w:color w:val="0F4761" w:themeColor="accent1" w:themeShade="BF"/>
+      <w:rFonts w:eastAsia="" w:cs="" w:cstheme="majorBidi" w:eastAsiaTheme="majorEastAsia"/>
+      <w:color w:themeColor="accent1" w:themeShade="bf" w:val="0F4761"/>
       <w:sz w:val="28"/>
       <w:szCs w:val="28"/>
     </w:rPr>
   </w:style>
   <w:style w:type="paragraph" w:styleId="Heading4">
-    <w:name w:val="heading 4"/>
+    <w:name w:val="Heading 4"/>
     <w:basedOn w:val="Normal"/>
     <w:next w:val="Normal"/>
     <w:link w:val="Heading4Char"/>
@@ -3161,22 +3041,22 @@
     <w:semiHidden/>
     <w:unhideWhenUsed/>
     <w:qFormat/>
-    <w:rsid w:val="009B1249"/>
+    <w:rsid w:val="009b1249"/>
     <w:pPr>
-      <w:keepNext/>
+      <w:keepNext w:val="true"/>
       <w:keepLines/>
       <w:spacing w:before="80" w:after="40"/>
       <w:outlineLvl w:val="3"/>
     </w:pPr>
     <w:rPr>
-      <w:rFonts w:eastAsiaTheme="majorEastAsia" w:cstheme="majorBidi"/>
+      <w:rFonts w:eastAsia="" w:cs="" w:cstheme="majorBidi" w:eastAsiaTheme="majorEastAsia"/>
       <w:i/>
       <w:iCs/>
-      <w:color w:val="0F4761" w:themeColor="accent1" w:themeShade="BF"/>
+      <w:color w:themeColor="accent1" w:themeShade="bf" w:val="0F4761"/>
     </w:rPr>
   </w:style>
   <w:style w:type="paragraph" w:styleId="Heading5">
-    <w:name w:val="heading 5"/>
+    <w:name w:val="Heading 5"/>
     <w:basedOn w:val="Normal"/>
     <w:next w:val="Normal"/>
     <w:link w:val="Heading5Char"/>
@@ -3184,20 +3064,20 @@
     <w:semiHidden/>
     <w:unhideWhenUsed/>
     <w:qFormat/>
-    <w:rsid w:val="009B1249"/>
+    <w:rsid w:val="009b1249"/>
     <w:pPr>
-      <w:keepNext/>
+      <w:keepNext w:val="true"/>
       <w:keepLines/>
       <w:spacing w:before="80" w:after="40"/>
       <w:outlineLvl w:val="4"/>
     </w:pPr>
     <w:rPr>
-      <w:rFonts w:eastAsiaTheme="majorEastAsia" w:cstheme="majorBidi"/>
-      <w:color w:val="0F4761" w:themeColor="accent1" w:themeShade="BF"/>
+      <w:rFonts w:eastAsia="" w:cs="" w:cstheme="majorBidi" w:eastAsiaTheme="majorEastAsia"/>
+      <w:color w:themeColor="accent1" w:themeShade="bf" w:val="0F4761"/>
     </w:rPr>
   </w:style>
   <w:style w:type="paragraph" w:styleId="Heading6">
-    <w:name w:val="heading 6"/>
+    <w:name w:val="Heading 6"/>
     <w:basedOn w:val="Normal"/>
     <w:next w:val="Normal"/>
     <w:link w:val="Heading6Char"/>
@@ -3205,22 +3085,22 @@
     <w:semiHidden/>
     <w:unhideWhenUsed/>
     <w:qFormat/>
-    <w:rsid w:val="009B1249"/>
+    <w:rsid w:val="009b1249"/>
     <w:pPr>
-      <w:keepNext/>
+      <w:keepNext w:val="true"/>
       <w:keepLines/>
       <w:spacing w:before="40" w:after="0"/>
       <w:outlineLvl w:val="5"/>
     </w:pPr>
     <w:rPr>
-      <w:rFonts w:eastAsiaTheme="majorEastAsia" w:cstheme="majorBidi"/>
+      <w:rFonts w:eastAsia="" w:cs="" w:cstheme="majorBidi" w:eastAsiaTheme="majorEastAsia"/>
       <w:i/>
       <w:iCs/>
-      <w:color w:val="595959" w:themeColor="text1" w:themeTint="A6"/>
+      <w:color w:themeColor="text1" w:themeTint="a6" w:val="595959"/>
     </w:rPr>
   </w:style>
   <w:style w:type="paragraph" w:styleId="Heading7">
-    <w:name w:val="heading 7"/>
+    <w:name w:val="Heading 7"/>
     <w:basedOn w:val="Normal"/>
     <w:next w:val="Normal"/>
     <w:link w:val="Heading7Char"/>
@@ -3228,20 +3108,20 @@
     <w:semiHidden/>
     <w:unhideWhenUsed/>
     <w:qFormat/>
-    <w:rsid w:val="009B1249"/>
+    <w:rsid w:val="009b1249"/>
     <w:pPr>
-      <w:keepNext/>
+      <w:keepNext w:val="true"/>
       <w:keepLines/>
       <w:spacing w:before="40" w:after="0"/>
       <w:outlineLvl w:val="6"/>
     </w:pPr>
     <w:rPr>
-      <w:rFonts w:eastAsiaTheme="majorEastAsia" w:cstheme="majorBidi"/>
-      <w:color w:val="595959" w:themeColor="text1" w:themeTint="A6"/>
+      <w:rFonts w:eastAsia="" w:cs="" w:cstheme="majorBidi" w:eastAsiaTheme="majorEastAsia"/>
+      <w:color w:themeColor="text1" w:themeTint="a6" w:val="595959"/>
     </w:rPr>
   </w:style>
   <w:style w:type="paragraph" w:styleId="Heading8">
-    <w:name w:val="heading 8"/>
+    <w:name w:val="Heading 8"/>
     <w:basedOn w:val="Normal"/>
     <w:next w:val="Normal"/>
     <w:link w:val="Heading8Char"/>
@@ -3249,22 +3129,22 @@
     <w:semiHidden/>
     <w:unhideWhenUsed/>
     <w:qFormat/>
-    <w:rsid w:val="009B1249"/>
+    <w:rsid w:val="009b1249"/>
     <w:pPr>
-      <w:keepNext/>
+      <w:keepNext w:val="true"/>
       <w:keepLines/>
-      <w:spacing w:after="0"/>
+      <w:spacing w:before="0" w:after="0"/>
       <w:outlineLvl w:val="7"/>
     </w:pPr>
     <w:rPr>
-      <w:rFonts w:eastAsiaTheme="majorEastAsia" w:cstheme="majorBidi"/>
+      <w:rFonts w:eastAsia="" w:cs="" w:cstheme="majorBidi" w:eastAsiaTheme="majorEastAsia"/>
       <w:i/>
       <w:iCs/>
-      <w:color w:val="272727" w:themeColor="text1" w:themeTint="D8"/>
+      <w:color w:themeColor="text1" w:themeTint="d8" w:val="272727"/>
     </w:rPr>
   </w:style>
   <w:style w:type="paragraph" w:styleId="Heading9">
-    <w:name w:val="heading 9"/>
+    <w:name w:val="Heading 9"/>
     <w:basedOn w:val="Normal"/>
     <w:next w:val="Normal"/>
     <w:link w:val="Heading9Char"/>
@@ -3272,214 +3152,195 @@
     <w:semiHidden/>
     <w:unhideWhenUsed/>
     <w:qFormat/>
-    <w:rsid w:val="009B1249"/>
+    <w:rsid w:val="009b1249"/>
     <w:pPr>
-      <w:keepNext/>
+      <w:keepNext w:val="true"/>
       <w:keepLines/>
-      <w:spacing w:after="0"/>
+      <w:spacing w:before="0" w:after="0"/>
       <w:outlineLvl w:val="8"/>
     </w:pPr>
     <w:rPr>
-      <w:rFonts w:eastAsiaTheme="majorEastAsia" w:cstheme="majorBidi"/>
-      <w:color w:val="272727" w:themeColor="text1" w:themeTint="D8"/>
+      <w:rFonts w:eastAsia="" w:cs="" w:cstheme="majorBidi" w:eastAsiaTheme="majorEastAsia"/>
+      <w:color w:themeColor="text1" w:themeTint="d8" w:val="272727"/>
     </w:rPr>
   </w:style>
-  <w:style w:type="character" w:default="1" w:styleId="DefaultParagraphFont">
+  <w:style w:type="character" w:styleId="DefaultParagraphFont" w:default="1">
     <w:name w:val="Default Paragraph Font"/>
     <w:uiPriority w:val="1"/>
     <w:semiHidden/>
     <w:unhideWhenUsed/>
-  </w:style>
-  <w:style w:type="table" w:default="1" w:styleId="TableNormal">
-    <w:name w:val="Normal Table"/>
-    <w:uiPriority w:val="99"/>
-    <w:semiHidden/>
-    <w:unhideWhenUsed/>
-    <w:tblPr>
-      <w:tblInd w:w="0" w:type="dxa"/>
-      <w:tblCellMar>
-        <w:top w:w="0" w:type="dxa"/>
-        <w:left w:w="108" w:type="dxa"/>
-        <w:bottom w:w="0" w:type="dxa"/>
-        <w:right w:w="108" w:type="dxa"/>
-      </w:tblCellMar>
-    </w:tblPr>
-  </w:style>
-  <w:style w:type="numbering" w:default="1" w:styleId="NoList">
-    <w:name w:val="No List"/>
-    <w:uiPriority w:val="99"/>
-    <w:semiHidden/>
-    <w:unhideWhenUsed/>
-  </w:style>
-  <w:style w:type="character" w:customStyle="1" w:styleId="Heading1Char">
+    <w:qFormat/>
+    <w:rPr/>
+  </w:style>
+  <w:style w:type="character" w:styleId="Heading1Char" w:customStyle="1">
     <w:name w:val="Heading 1 Char"/>
     <w:basedOn w:val="DefaultParagraphFont"/>
     <w:link w:val="Heading1"/>
     <w:uiPriority w:val="9"/>
     <w:qFormat/>
-    <w:rsid w:val="009B1249"/>
+    <w:rsid w:val="009b1249"/>
     <w:rPr>
-      <w:rFonts w:asciiTheme="majorHAnsi" w:eastAsiaTheme="majorEastAsia" w:hAnsiTheme="majorHAnsi" w:cstheme="majorBidi"/>
-      <w:color w:val="0F4761" w:themeColor="accent1" w:themeShade="BF"/>
+      <w:rFonts w:ascii="Aptos Display" w:hAnsi="Aptos Display" w:eastAsia="" w:cs="" w:asciiTheme="majorHAnsi" w:cstheme="majorBidi" w:eastAsiaTheme="majorEastAsia" w:hAnsiTheme="majorHAnsi"/>
+      <w:color w:themeColor="accent1" w:themeShade="bf" w:val="0F4761"/>
       <w:sz w:val="40"/>
       <w:szCs w:val="40"/>
     </w:rPr>
   </w:style>
-  <w:style w:type="character" w:customStyle="1" w:styleId="Heading2Char">
+  <w:style w:type="character" w:styleId="Heading2Char" w:customStyle="1">
     <w:name w:val="Heading 2 Char"/>
     <w:basedOn w:val="DefaultParagraphFont"/>
     <w:link w:val="Heading2"/>
     <w:uiPriority w:val="9"/>
     <w:semiHidden/>
     <w:qFormat/>
-    <w:rsid w:val="009B1249"/>
+    <w:rsid w:val="009b1249"/>
     <w:rPr>
-      <w:rFonts w:asciiTheme="majorHAnsi" w:eastAsiaTheme="majorEastAsia" w:hAnsiTheme="majorHAnsi" w:cstheme="majorBidi"/>
-      <w:color w:val="0F4761" w:themeColor="accent1" w:themeShade="BF"/>
+      <w:rFonts w:ascii="Aptos Display" w:hAnsi="Aptos Display" w:eastAsia="" w:cs="" w:asciiTheme="majorHAnsi" w:cstheme="majorBidi" w:eastAsiaTheme="majorEastAsia" w:hAnsiTheme="majorHAnsi"/>
+      <w:color w:themeColor="accent1" w:themeShade="bf" w:val="0F4761"/>
       <w:sz w:val="32"/>
       <w:szCs w:val="32"/>
     </w:rPr>
   </w:style>
-  <w:style w:type="character" w:customStyle="1" w:styleId="Heading3Char">
+  <w:style w:type="character" w:styleId="Heading3Char" w:customStyle="1">
     <w:name w:val="Heading 3 Char"/>
     <w:basedOn w:val="DefaultParagraphFont"/>
     <w:link w:val="Heading3"/>
     <w:uiPriority w:val="9"/>
     <w:semiHidden/>
     <w:qFormat/>
-    <w:rsid w:val="009B1249"/>
+    <w:rsid w:val="009b1249"/>
     <w:rPr>
-      <w:rFonts w:eastAsiaTheme="majorEastAsia" w:cstheme="majorBidi"/>
-      <w:color w:val="0F4761" w:themeColor="accent1" w:themeShade="BF"/>
+      <w:rFonts w:eastAsia="" w:cs="" w:cstheme="majorBidi" w:eastAsiaTheme="majorEastAsia"/>
+      <w:color w:themeColor="accent1" w:themeShade="bf" w:val="0F4761"/>
       <w:sz w:val="28"/>
       <w:szCs w:val="28"/>
     </w:rPr>
   </w:style>
-  <w:style w:type="character" w:customStyle="1" w:styleId="Heading4Char">
+  <w:style w:type="character" w:styleId="Heading4Char" w:customStyle="1">
     <w:name w:val="Heading 4 Char"/>
     <w:basedOn w:val="DefaultParagraphFont"/>
     <w:link w:val="Heading4"/>
     <w:uiPriority w:val="9"/>
     <w:semiHidden/>
     <w:qFormat/>
-    <w:rsid w:val="009B1249"/>
+    <w:rsid w:val="009b1249"/>
     <w:rPr>
-      <w:rFonts w:eastAsiaTheme="majorEastAsia" w:cstheme="majorBidi"/>
+      <w:rFonts w:eastAsia="" w:cs="" w:cstheme="majorBidi" w:eastAsiaTheme="majorEastAsia"/>
       <w:i/>
       <w:iCs/>
-      <w:color w:val="0F4761" w:themeColor="accent1" w:themeShade="BF"/>
+      <w:color w:themeColor="accent1" w:themeShade="bf" w:val="0F4761"/>
     </w:rPr>
   </w:style>
-  <w:style w:type="character" w:customStyle="1" w:styleId="Heading5Char">
+  <w:style w:type="character" w:styleId="Heading5Char" w:customStyle="1">
     <w:name w:val="Heading 5 Char"/>
     <w:basedOn w:val="DefaultParagraphFont"/>
     <w:link w:val="Heading5"/>
     <w:uiPriority w:val="9"/>
     <w:semiHidden/>
     <w:qFormat/>
-    <w:rsid w:val="009B1249"/>
+    <w:rsid w:val="009b1249"/>
     <w:rPr>
-      <w:rFonts w:eastAsiaTheme="majorEastAsia" w:cstheme="majorBidi"/>
-      <w:color w:val="0F4761" w:themeColor="accent1" w:themeShade="BF"/>
+      <w:rFonts w:eastAsia="" w:cs="" w:cstheme="majorBidi" w:eastAsiaTheme="majorEastAsia"/>
+      <w:color w:themeColor="accent1" w:themeShade="bf" w:val="0F4761"/>
     </w:rPr>
   </w:style>
-  <w:style w:type="character" w:customStyle="1" w:styleId="Heading6Char">
+  <w:style w:type="character" w:styleId="Heading6Char" w:customStyle="1">
     <w:name w:val="Heading 6 Char"/>
     <w:basedOn w:val="DefaultParagraphFont"/>
     <w:link w:val="Heading6"/>
     <w:uiPriority w:val="9"/>
     <w:semiHidden/>
     <w:qFormat/>
-    <w:rsid w:val="009B1249"/>
+    <w:rsid w:val="009b1249"/>
     <w:rPr>
-      <w:rFonts w:eastAsiaTheme="majorEastAsia" w:cstheme="majorBidi"/>
+      <w:rFonts w:eastAsia="" w:cs="" w:cstheme="majorBidi" w:eastAsiaTheme="majorEastAsia"/>
       <w:i/>
       <w:iCs/>
-      <w:color w:val="595959" w:themeColor="text1" w:themeTint="A6"/>
+      <w:color w:themeColor="text1" w:themeTint="a6" w:val="595959"/>
     </w:rPr>
   </w:style>
-  <w:style w:type="character" w:customStyle="1" w:styleId="Heading7Char">
+  <w:style w:type="character" w:styleId="Heading7Char" w:customStyle="1">
     <w:name w:val="Heading 7 Char"/>
     <w:basedOn w:val="DefaultParagraphFont"/>
     <w:link w:val="Heading7"/>
     <w:uiPriority w:val="9"/>
     <w:semiHidden/>
     <w:qFormat/>
-    <w:rsid w:val="009B1249"/>
+    <w:rsid w:val="009b1249"/>
     <w:rPr>
-      <w:rFonts w:eastAsiaTheme="majorEastAsia" w:cstheme="majorBidi"/>
-      <w:color w:val="595959" w:themeColor="text1" w:themeTint="A6"/>
+      <w:rFonts w:eastAsia="" w:cs="" w:cstheme="majorBidi" w:eastAsiaTheme="majorEastAsia"/>
+      <w:color w:themeColor="text1" w:themeTint="a6" w:val="595959"/>
     </w:rPr>
   </w:style>
-  <w:style w:type="character" w:customStyle="1" w:styleId="Heading8Char">
+  <w:style w:type="character" w:styleId="Heading8Char" w:customStyle="1">
     <w:name w:val="Heading 8 Char"/>
     <w:basedOn w:val="DefaultParagraphFont"/>
     <w:link w:val="Heading8"/>
     <w:uiPriority w:val="9"/>
     <w:semiHidden/>
     <w:qFormat/>
-    <w:rsid w:val="009B1249"/>
+    <w:rsid w:val="009b1249"/>
     <w:rPr>
-      <w:rFonts w:eastAsiaTheme="majorEastAsia" w:cstheme="majorBidi"/>
+      <w:rFonts w:eastAsia="" w:cs="" w:cstheme="majorBidi" w:eastAsiaTheme="majorEastAsia"/>
       <w:i/>
       <w:iCs/>
-      <w:color w:val="272727" w:themeColor="text1" w:themeTint="D8"/>
+      <w:color w:themeColor="text1" w:themeTint="d8" w:val="272727"/>
     </w:rPr>
   </w:style>
-  <w:style w:type="character" w:customStyle="1" w:styleId="Heading9Char">
+  <w:style w:type="character" w:styleId="Heading9Char" w:customStyle="1">
     <w:name w:val="Heading 9 Char"/>
     <w:basedOn w:val="DefaultParagraphFont"/>
     <w:link w:val="Heading9"/>
     <w:uiPriority w:val="9"/>
     <w:semiHidden/>
     <w:qFormat/>
-    <w:rsid w:val="009B1249"/>
+    <w:rsid w:val="009b1249"/>
     <w:rPr>
-      <w:rFonts w:eastAsiaTheme="majorEastAsia" w:cstheme="majorBidi"/>
-      <w:color w:val="272727" w:themeColor="text1" w:themeTint="D8"/>
+      <w:rFonts w:eastAsia="" w:cs="" w:cstheme="majorBidi" w:eastAsiaTheme="majorEastAsia"/>
+      <w:color w:themeColor="text1" w:themeTint="d8" w:val="272727"/>
     </w:rPr>
   </w:style>
-  <w:style w:type="character" w:customStyle="1" w:styleId="TitleChar">
+  <w:style w:type="character" w:styleId="TitleChar" w:customStyle="1">
     <w:name w:val="Title Char"/>
     <w:basedOn w:val="DefaultParagraphFont"/>
     <w:link w:val="Title"/>
     <w:uiPriority w:val="10"/>
     <w:qFormat/>
-    <w:rsid w:val="009B1249"/>
+    <w:rsid w:val="009b1249"/>
     <w:rPr>
-      <w:rFonts w:asciiTheme="majorHAnsi" w:eastAsiaTheme="majorEastAsia" w:hAnsiTheme="majorHAnsi" w:cstheme="majorBidi"/>
+      <w:rFonts w:ascii="Aptos Display" w:hAnsi="Aptos Display" w:eastAsia="" w:cs="" w:asciiTheme="majorHAnsi" w:cstheme="majorBidi" w:eastAsiaTheme="majorEastAsia" w:hAnsiTheme="majorHAnsi"/>
       <w:spacing w:val="-10"/>
       <w:kern w:val="2"/>
       <w:sz w:val="56"/>
       <w:szCs w:val="56"/>
     </w:rPr>
   </w:style>
-  <w:style w:type="character" w:customStyle="1" w:styleId="SubtitleChar">
+  <w:style w:type="character" w:styleId="SubtitleChar" w:customStyle="1">
     <w:name w:val="Subtitle Char"/>
     <w:basedOn w:val="DefaultParagraphFont"/>
     <w:link w:val="Subtitle"/>
     <w:uiPriority w:val="11"/>
     <w:qFormat/>
-    <w:rsid w:val="009B1249"/>
+    <w:rsid w:val="009b1249"/>
     <w:rPr>
-      <w:rFonts w:eastAsiaTheme="majorEastAsia" w:cstheme="majorBidi"/>
-      <w:color w:val="595959" w:themeColor="text1" w:themeTint="A6"/>
+      <w:rFonts w:eastAsia="" w:cs="" w:cstheme="majorBidi" w:eastAsiaTheme="majorEastAsia"/>
+      <w:color w:themeColor="text1" w:themeTint="a6" w:val="595959"/>
       <w:spacing w:val="15"/>
       <w:sz w:val="28"/>
       <w:szCs w:val="28"/>
     </w:rPr>
   </w:style>
-  <w:style w:type="character" w:customStyle="1" w:styleId="QuoteChar">
+  <w:style w:type="character" w:styleId="QuoteChar" w:customStyle="1">
     <w:name w:val="Quote Char"/>
     <w:basedOn w:val="DefaultParagraphFont"/>
     <w:link w:val="Quote"/>
     <w:uiPriority w:val="29"/>
     <w:qFormat/>
-    <w:rsid w:val="009B1249"/>
+    <w:rsid w:val="009b1249"/>
     <w:rPr>
       <w:i/>
       <w:iCs/>
-      <w:color w:val="404040" w:themeColor="text1" w:themeTint="BF"/>
+      <w:color w:themeColor="text1" w:themeTint="bf" w:val="404040"/>
     </w:rPr>
   </w:style>
   <w:style w:type="character" w:styleId="IntenseEmphasis">
@@ -3487,24 +3348,24 @@
     <w:basedOn w:val="DefaultParagraphFont"/>
     <w:uiPriority w:val="21"/>
     <w:qFormat/>
-    <w:rsid w:val="009B1249"/>
+    <w:rsid w:val="009b1249"/>
     <w:rPr>
       <w:i/>
       <w:iCs/>
-      <w:color w:val="0F4761" w:themeColor="accent1" w:themeShade="BF"/>
+      <w:color w:themeColor="accent1" w:themeShade="bf" w:val="0F4761"/>
     </w:rPr>
   </w:style>
-  <w:style w:type="character" w:customStyle="1" w:styleId="IntenseQuoteChar">
+  <w:style w:type="character" w:styleId="IntenseQuoteChar" w:customStyle="1">
     <w:name w:val="Intense Quote Char"/>
     <w:basedOn w:val="DefaultParagraphFont"/>
     <w:link w:val="IntenseQuote"/>
     <w:uiPriority w:val="30"/>
     <w:qFormat/>
-    <w:rsid w:val="009B1249"/>
+    <w:rsid w:val="009b1249"/>
     <w:rPr>
       <w:i/>
       <w:iCs/>
-      <w:color w:val="0F4761" w:themeColor="accent1" w:themeShade="BF"/>
+      <w:color w:themeColor="accent1" w:themeShade="bf" w:val="0F4761"/>
     </w:rPr>
   </w:style>
   <w:style w:type="character" w:styleId="IntenseReference">
@@ -3512,12 +3373,12 @@
     <w:basedOn w:val="DefaultParagraphFont"/>
     <w:uiPriority w:val="32"/>
     <w:qFormat/>
-    <w:rsid w:val="009B1249"/>
+    <w:rsid w:val="009b1249"/>
     <w:rPr>
       <w:b/>
       <w:bCs/>
       <w:smallCaps/>
-      <w:color w:val="0F4761" w:themeColor="accent1" w:themeShade="BF"/>
+      <w:color w:themeColor="accent1" w:themeShade="bf" w:val="0F4761"/>
       <w:spacing w:val="5"/>
     </w:rPr>
   </w:style>
@@ -3526,9 +3387,9 @@
     <w:basedOn w:val="DefaultParagraphFont"/>
     <w:uiPriority w:val="99"/>
     <w:unhideWhenUsed/>
-    <w:rsid w:val="009C223A"/>
+    <w:rsid w:val="009c223a"/>
     <w:rPr>
-      <w:color w:val="467886" w:themeColor="hyperlink"/>
+      <w:color w:themeColor="hyperlink" w:val="467886"/>
       <w:u w:val="single"/>
     </w:rPr>
   </w:style>
@@ -3539,10 +3400,10 @@
     <w:semiHidden/>
     <w:unhideWhenUsed/>
     <w:qFormat/>
-    <w:rsid w:val="009C223A"/>
+    <w:rsid w:val="009c223a"/>
     <w:rPr>
       <w:color w:val="605E5C"/>
-      <w:shd w:val="clear" w:color="auto" w:fill="E1DFDD"/>
+      <w:shd w:fill="E1DFDD" w:val="clear"/>
     </w:rPr>
   </w:style>
   <w:style w:type="character" w:styleId="Emphasis">
@@ -3553,17 +3414,17 @@
       <w:iCs/>
     </w:rPr>
   </w:style>
-  <w:style w:type="paragraph" w:customStyle="1" w:styleId="Heading">
+  <w:style w:type="paragraph" w:styleId="Heading" w:customStyle="1">
     <w:name w:val="Heading"/>
     <w:basedOn w:val="Normal"/>
     <w:next w:val="BodyText"/>
     <w:qFormat/>
     <w:pPr>
-      <w:keepNext/>
+      <w:keepNext w:val="true"/>
       <w:spacing w:before="240" w:after="120"/>
     </w:pPr>
     <w:rPr>
-      <w:rFonts w:ascii="Liberation Sans" w:eastAsia="Noto Sans CJK SC" w:hAnsi="Liberation Sans" w:cs="Lohit Devanagari"/>
+      <w:rFonts w:ascii="Liberation Sans" w:hAnsi="Liberation Sans" w:eastAsia="Noto Sans CJK SC" w:cs="Lohit Devanagari"/>
       <w:sz w:val="28"/>
       <w:szCs w:val="28"/>
     </w:rPr>
@@ -3572,18 +3433,20 @@
     <w:name w:val="Body Text"/>
     <w:basedOn w:val="Normal"/>
     <w:pPr>
-      <w:spacing w:after="140"/>
+      <w:spacing w:before="0" w:after="140"/>
     </w:pPr>
+    <w:rPr/>
   </w:style>
   <w:style w:type="paragraph" w:styleId="List">
     <w:name w:val="List"/>
     <w:basedOn w:val="BodyText"/>
+    <w:pPr/>
     <w:rPr>
       <w:rFonts w:cs="Lohit Devanagari"/>
     </w:rPr>
   </w:style>
   <w:style w:type="paragraph" w:styleId="Caption">
-    <w:name w:val="caption"/>
+    <w:name w:val="Caption"/>
     <w:basedOn w:val="Normal"/>
     <w:qFormat/>
     <w:pPr>
@@ -3596,7 +3459,7 @@
       <w:iCs/>
     </w:rPr>
   </w:style>
-  <w:style w:type="paragraph" w:customStyle="1" w:styleId="Index">
+  <w:style w:type="paragraph" w:styleId="Index" w:customStyle="1">
     <w:name w:val="Index"/>
     <w:basedOn w:val="Normal"/>
     <w:qFormat/>
@@ -3614,13 +3477,13 @@
     <w:link w:val="TitleChar"/>
     <w:uiPriority w:val="10"/>
     <w:qFormat/>
-    <w:rsid w:val="009B1249"/>
+    <w:rsid w:val="009b1249"/>
     <w:pPr>
-      <w:spacing w:after="80" w:line="240" w:lineRule="auto"/>
+      <w:spacing w:lineRule="auto" w:line="240" w:before="0" w:after="80"/>
       <w:contextualSpacing/>
     </w:pPr>
     <w:rPr>
-      <w:rFonts w:asciiTheme="majorHAnsi" w:eastAsiaTheme="majorEastAsia" w:hAnsiTheme="majorHAnsi" w:cstheme="majorBidi"/>
+      <w:rFonts w:ascii="Aptos Display" w:hAnsi="Aptos Display" w:eastAsia="" w:cs="" w:asciiTheme="majorHAnsi" w:cstheme="majorBidi" w:eastAsiaTheme="majorEastAsia" w:hAnsiTheme="majorHAnsi"/>
       <w:spacing w:val="-10"/>
       <w:sz w:val="56"/>
       <w:szCs w:val="56"/>
@@ -3633,10 +3496,11 @@
     <w:link w:val="SubtitleChar"/>
     <w:uiPriority w:val="11"/>
     <w:qFormat/>
-    <w:rsid w:val="009B1249"/>
+    <w:rsid w:val="009b1249"/>
+    <w:pPr/>
     <w:rPr>
-      <w:rFonts w:eastAsiaTheme="majorEastAsia" w:cstheme="majorBidi"/>
-      <w:color w:val="595959" w:themeColor="text1" w:themeTint="A6"/>
+      <w:rFonts w:eastAsia="" w:cs="" w:cstheme="majorBidi" w:eastAsiaTheme="majorEastAsia"/>
+      <w:color w:themeColor="text1" w:themeTint="a6" w:val="595959"/>
       <w:spacing w:val="15"/>
       <w:sz w:val="28"/>
       <w:szCs w:val="28"/>
@@ -3649,15 +3513,15 @@
     <w:link w:val="QuoteChar"/>
     <w:uiPriority w:val="29"/>
     <w:qFormat/>
-    <w:rsid w:val="009B1249"/>
+    <w:rsid w:val="009b1249"/>
     <w:pPr>
-      <w:spacing w:before="160"/>
+      <w:spacing w:before="160" w:after="160"/>
       <w:jc w:val="center"/>
     </w:pPr>
     <w:rPr>
       <w:i/>
       <w:iCs/>
-      <w:color w:val="404040" w:themeColor="text1" w:themeTint="BF"/>
+      <w:color w:themeColor="text1" w:themeTint="bf" w:val="404040"/>
     </w:rPr>
   </w:style>
   <w:style w:type="paragraph" w:styleId="ListParagraph">
@@ -3665,11 +3529,13 @@
     <w:basedOn w:val="Normal"/>
     <w:uiPriority w:val="34"/>
     <w:qFormat/>
-    <w:rsid w:val="009B1249"/>
+    <w:rsid w:val="009b1249"/>
     <w:pPr>
+      <w:spacing w:before="0" w:after="160"/>
       <w:ind w:left="720"/>
       <w:contextualSpacing/>
     </w:pPr>
+    <w:rPr/>
   </w:style>
   <w:style w:type="paragraph" w:styleId="IntenseQuote">
     <w:name w:val="Intense Quote"/>
@@ -3678,7 +3544,7 @@
     <w:link w:val="IntenseQuoteChar"/>
     <w:uiPriority w:val="30"/>
     <w:qFormat/>
-    <w:rsid w:val="009B1249"/>
+    <w:rsid w:val="009b1249"/>
     <w:pPr>
       <w:pBdr>
         <w:top w:val="single" w:sz="4" w:space="10" w:color="0F4761"/>
@@ -3691,19 +3557,20 @@
     <w:rPr>
       <w:i/>
       <w:iCs/>
-      <w:color w:val="0F4761" w:themeColor="accent1" w:themeShade="BF"/>
+      <w:color w:themeColor="accent1" w:themeShade="bf" w:val="0F4761"/>
     </w:rPr>
   </w:style>
-  <w:style w:type="paragraph" w:customStyle="1" w:styleId="TableContents">
+  <w:style w:type="paragraph" w:styleId="TableContents" w:customStyle="1">
     <w:name w:val="Table Contents"/>
     <w:basedOn w:val="Normal"/>
     <w:qFormat/>
     <w:pPr>
-      <w:widowControl w:val="0"/>
+      <w:widowControl w:val="false"/>
       <w:suppressLineNumbers/>
     </w:pPr>
-  </w:style>
-  <w:style w:type="paragraph" w:customStyle="1" w:styleId="TableHeading">
+    <w:rPr/>
+  </w:style>
+  <w:style w:type="paragraph" w:styleId="TableHeading" w:customStyle="1">
     <w:name w:val="Table Heading"/>
     <w:basedOn w:val="TableContents"/>
     <w:qFormat/>
@@ -3715,58 +3582,79 @@
       <w:bCs/>
     </w:rPr>
   </w:style>
+  <w:style w:type="numbering" w:styleId="NoList" w:default="1">
+    <w:name w:val="No List"/>
+    <w:uiPriority w:val="99"/>
+    <w:semiHidden/>
+    <w:unhideWhenUsed/>
+    <w:qFormat/>
+  </w:style>
+  <w:style w:type="table" w:default="1" w:styleId="TableNormal">
+    <w:name w:val="Normal Table"/>
+    <w:uiPriority w:val="99"/>
+    <w:semiHidden/>
+    <w:unhideWhenUsed/>
+    <w:tblPr>
+      <w:tblCellMar>
+        <w:top w:w="0" w:type="dxa"/>
+        <w:left w:w="108" w:type="dxa"/>
+        <w:bottom w:w="0" w:type="dxa"/>
+        <w:right w:w="108" w:type="dxa"/>
+      </w:tblCellMar>
+    </w:tblPr>
+  </w:style>
 </w:styles>
 </file>
 
 <file path=word/theme/theme1.xml><?xml version="1.0" encoding="utf-8"?>
-<a:theme xmlns:a="http://schemas.openxmlformats.org/drawingml/2006/main" name="Office Theme">
+<a:theme xmlns:a="http://schemas.openxmlformats.org/drawingml/2006/main" xmlns:r="http://schemas.openxmlformats.org/officeDocument/2006/relationships" name="Office Theme">
   <a:themeElements>
     <a:clrScheme name="Office">
       <a:dk1>
         <a:srgbClr val="000000"/>
       </a:dk1>
       <a:lt1>
-        <a:srgbClr val="FFFFFF"/>
+        <a:srgbClr val="ffffff"/>
       </a:lt1>
       <a:dk2>
-        <a:srgbClr val="0E2841"/>
+        <a:srgbClr val="0e2841"/>
       </a:dk2>
       <a:lt2>
-        <a:srgbClr val="E8E8E8"/>
+        <a:srgbClr val="e8e8e8"/>
       </a:lt2>
       <a:accent1>
         <a:srgbClr val="156082"/>
       </a:accent1>
       <a:accent2>
-        <a:srgbClr val="E97132"/>
+        <a:srgbClr val="e97132"/>
       </a:accent2>
       <a:accent3>
-        <a:srgbClr val="196B24"/>
+        <a:srgbClr val="196b24"/>
       </a:accent3>
       <a:accent4>
-        <a:srgbClr val="0F9ED5"/>
+        <a:srgbClr val="0f9ed5"/>
       </a:accent4>
       <a:accent5>
-        <a:srgbClr val="A02B93"/>
+        <a:srgbClr val="a02b93"/>
       </a:accent5>
       <a:accent6>
-        <a:srgbClr val="4EA72E"/>
+        <a:srgbClr val="4ea72e"/>
       </a:accent6>
       <a:hlink>
         <a:srgbClr val="467886"/>
       </a:hlink>
       <a:folHlink>
-        <a:srgbClr val="96607D"/>
+        <a:srgbClr val="96607d"/>
       </a:folHlink>
     </a:clrScheme>
     <a:fontScheme name="Office">
       <a:majorFont>
-        <a:latin typeface="Aptos Display" panose="02110004020202020204"/>
+        <a:latin typeface="Aptos Display" panose="02110004020202020204" pitchFamily="0" charset="1"/>
         <a:ea typeface=""/>
         <a:cs typeface=""/>
       </a:majorFont>
       <a:minorFont>
-        <a:latin typeface="Aptos" panose="02110004020202020204"/>
+        <a:latin typeface="Aptos" panose="02110004020202020204" pitchFamily="0" charset="1"/>
         <a:ea typeface=""/>
         <a:cs typeface=""/>
       </a:minorFont>
@@ -3798,7 +3686,7 @@
             </a:gs>
           </a:gsLst>
           <a:lin ang="5400000" scaled="0"/>
-          <a:tileRect/>
+          <a:tileRect l="0" t="0" r="0" b="0"/>
         </a:gradFill>
         <a:gradFill>
           <a:gsLst>
@@ -3822,7 +3710,7 @@
             </a:gs>
           </a:gsLst>
           <a:lin ang="5400000" scaled="0"/>
-          <a:tileRect/>
+          <a:tileRect l="0" t="0" r="0" b="0"/>
         </a:gradFill>
       </a:fillStyleLst>
       <a:lnStyleLst>
@@ -3882,12 +3770,10 @@
             </a:gs>
           </a:gsLst>
           <a:lin ang="5400000" scaled="0"/>
-          <a:tileRect/>
+          <a:tileRect l="0" t="0" r="0" b="0"/>
         </a:gradFill>
       </a:bgFillStyleLst>
     </a:fmtScheme>
   </a:themeElements>
-  <a:objectDefaults/>
-  <a:extraClrSchemeLst/>
 </a:theme>
 </file>
</xml_diff>